<commit_message>
Doc: Adicionando referências na documentação do projeto
</commit_message>
<xml_diff>
--- a/documentacao/Documentação do projeto.docx
+++ b/documentacao/Documentação do projeto.docx
@@ -617,15 +617,7 @@
           <w:sz w:val="24"/>
           <w:szCs w:val="24"/>
         </w:rPr>
-        <w:t xml:space="preserve">Orientadores: Prof. </w:t>
-      </w:r>
-      <w:r>
-        <w:rPr>
-          <w:rFonts w:ascii="Arial" w:hAnsi="Arial" w:cs="Arial"/>
-          <w:sz w:val="24"/>
-          <w:szCs w:val="24"/>
-        </w:rPr>
-        <w:t>Ricardo Fonseca da Cruz</w:t>
+        <w:t>Orientadores: Prof. Ricardo Fonseca da Cruz</w:t>
       </w:r>
     </w:p>
     <w:p>
@@ -1753,15 +1745,7 @@
                 <w:rFonts w:ascii="Times New Roman" w:hAnsi="Times New Roman" w:cs="Times New Roman"/>
                 <w:b/>
               </w:rPr>
-              <w:t xml:space="preserve">2.2 Objetivos </w:t>
-            </w:r>
-            <w:r>
-              <w:rPr>
-                <w:rStyle w:val="Hyperlink"/>
-                <w:rFonts w:ascii="Times New Roman" w:hAnsi="Times New Roman" w:cs="Times New Roman"/>
-                <w:b/>
-              </w:rPr>
-              <w:t>específicos</w:t>
+              <w:t>2.2 Objetivos específicos</w:t>
             </w:r>
             <w:r>
               <w:tab/>
@@ -2287,87 +2271,47 @@
           <w:sz w:val="24"/>
           <w:szCs w:val="24"/>
         </w:rPr>
-        <w:t xml:space="preserve">A tecnologia vem transformando todas as áreas da sociedade, avanços tecnológicos </w:t>
-      </w:r>
-      <w:r>
-        <w:rPr>
-          <w:rFonts w:ascii="Times New Roman" w:hAnsi="Times New Roman" w:cs="Times New Roman"/>
-          <w:sz w:val="24"/>
-          <w:szCs w:val="24"/>
-        </w:rPr>
-        <w:t>transformam profundamente nosso cotidiano, seja na comunicação, entretenimento e até mesmo compras online, porém nem todas as áreas da internet são seguras e confiáveis, existem diversas formas de golpes sendo aplicados principalmente no campo de compras n</w:t>
-      </w:r>
-      <w:r>
-        <w:rPr>
-          <w:rFonts w:ascii="Times New Roman" w:hAnsi="Times New Roman" w:cs="Times New Roman"/>
-          <w:sz w:val="24"/>
-          <w:szCs w:val="24"/>
-        </w:rPr>
-        <w:t>a web. De acordo com Einstein, 2025, grande cientista e físico alemão já reconhecia o quão influente a tecnologia é na sociedade, por isso segundo ele se tornou aparentemente óbvio que a nossa tecnologia excedeu a nossa humanidade.</w:t>
-      </w:r>
-    </w:p>
-    <w:p>
-      <w:pPr>
-        <w:spacing w:after="0" w:line="360" w:lineRule="auto"/>
-        <w:ind w:firstLine="709"/>
-        <w:jc w:val="both"/>
-        <w:rPr>
-          <w:rFonts w:ascii="Times New Roman" w:hAnsi="Times New Roman" w:cs="Times New Roman"/>
-          <w:sz w:val="24"/>
-          <w:szCs w:val="24"/>
-        </w:rPr>
-      </w:pPr>
-      <w:r>
-        <w:rPr>
-          <w:rFonts w:ascii="Times New Roman" w:hAnsi="Times New Roman" w:cs="Times New Roman"/>
-          <w:sz w:val="24"/>
-          <w:szCs w:val="24"/>
-        </w:rPr>
-        <w:t>Diante dessa situação, o</w:t>
-      </w:r>
-      <w:r>
-        <w:rPr>
-          <w:rFonts w:ascii="Times New Roman" w:hAnsi="Times New Roman" w:cs="Times New Roman"/>
-          <w:sz w:val="24"/>
-          <w:szCs w:val="24"/>
-        </w:rPr>
-        <w:t xml:space="preserve"> intuito desse projeto é criar um site confiável, de fácil acesso, interface interativa que não propõe riscos nem golpes para seus clientes, mas garante compras de produtos de pet- shop de qualidade, entregas rápidas e confiáveis, garantindo bons retornos </w:t>
-      </w:r>
-      <w:r>
-        <w:rPr>
-          <w:rFonts w:ascii="Times New Roman" w:hAnsi="Times New Roman" w:cs="Times New Roman"/>
-          <w:sz w:val="24"/>
-          <w:szCs w:val="24"/>
-        </w:rPr>
-        <w:t xml:space="preserve">aos consumidores de seu produto. </w:t>
-      </w:r>
-    </w:p>
-    <w:p>
-      <w:pPr>
-        <w:spacing w:after="0" w:line="360" w:lineRule="auto"/>
-        <w:ind w:firstLine="709"/>
-        <w:jc w:val="both"/>
-        <w:rPr>
-          <w:rFonts w:ascii="Times New Roman" w:hAnsi="Times New Roman" w:cs="Times New Roman"/>
-          <w:sz w:val="24"/>
-          <w:szCs w:val="24"/>
-        </w:rPr>
-      </w:pPr>
-      <w:r>
-        <w:rPr>
-          <w:rFonts w:ascii="Times New Roman" w:hAnsi="Times New Roman" w:cs="Times New Roman"/>
-          <w:sz w:val="24"/>
-          <w:szCs w:val="24"/>
-        </w:rPr>
-        <w:t>O site possui como público-alvo, pessoas que possuem animais domésticos e buscam sempre a melhor qualidade para o seu pet, parceiros comerciais e visitantes interessados nos produtos oferecidos. Transmitindo e sempre ressa</w:t>
-      </w:r>
-      <w:r>
-        <w:rPr>
-          <w:rFonts w:ascii="Times New Roman" w:hAnsi="Times New Roman" w:cs="Times New Roman"/>
-          <w:sz w:val="24"/>
-          <w:szCs w:val="24"/>
-        </w:rPr>
-        <w:t>ltando o profissionalismo e a confiança.</w:t>
+        <w:t>A tecnologia vem transformando todas as áreas da sociedade, avanços tecnológicos transformam profundamente nosso cotidiano, seja na comunicação, entretenimento e até mesmo compras online, porém nem todas as áreas da internet são seguras e confiáveis, existem diversas formas de golpes sendo aplicados principalmente no campo de compras na web. De acordo com Einstein, 2025, grande cientista e físico alemão já reconhecia o quão influente a tecnologia é na sociedade, por isso segundo ele se tornou aparentemente óbvio que a nossa tecnologia excedeu a nossa humanidade.</w:t>
+      </w:r>
+    </w:p>
+    <w:p>
+      <w:pPr>
+        <w:spacing w:after="0" w:line="360" w:lineRule="auto"/>
+        <w:ind w:firstLine="709"/>
+        <w:jc w:val="both"/>
+        <w:rPr>
+          <w:rFonts w:ascii="Times New Roman" w:hAnsi="Times New Roman" w:cs="Times New Roman"/>
+          <w:sz w:val="24"/>
+          <w:szCs w:val="24"/>
+        </w:rPr>
+      </w:pPr>
+      <w:r>
+        <w:rPr>
+          <w:rFonts w:ascii="Times New Roman" w:hAnsi="Times New Roman" w:cs="Times New Roman"/>
+          <w:sz w:val="24"/>
+          <w:szCs w:val="24"/>
+        </w:rPr>
+        <w:t xml:space="preserve">Diante dessa situação, o intuito desse projeto é criar um site confiável, de fácil acesso, interface interativa que não propõe riscos nem golpes para seus clientes, mas garante compras de produtos de pet- shop de qualidade, entregas rápidas e confiáveis, garantindo bons retornos aos consumidores de seu produto. </w:t>
+      </w:r>
+    </w:p>
+    <w:p>
+      <w:pPr>
+        <w:spacing w:after="0" w:line="360" w:lineRule="auto"/>
+        <w:ind w:firstLine="709"/>
+        <w:jc w:val="both"/>
+        <w:rPr>
+          <w:rFonts w:ascii="Times New Roman" w:hAnsi="Times New Roman" w:cs="Times New Roman"/>
+          <w:sz w:val="24"/>
+          <w:szCs w:val="24"/>
+        </w:rPr>
+      </w:pPr>
+      <w:r>
+        <w:rPr>
+          <w:rFonts w:ascii="Times New Roman" w:hAnsi="Times New Roman" w:cs="Times New Roman"/>
+          <w:sz w:val="24"/>
+          <w:szCs w:val="24"/>
+        </w:rPr>
+        <w:t>O site possui como público-alvo, pessoas que possuem animais domésticos e buscam sempre a melhor qualidade para o seu pet, parceiros comerciais e visitantes interessados nos produtos oferecidos. Transmitindo e sempre ressaltando o profissionalismo e a confiança.</w:t>
       </w:r>
     </w:p>
     <w:p>
@@ -2405,15 +2349,7 @@
           <w:sz w:val="24"/>
           <w:szCs w:val="24"/>
         </w:rPr>
-        <w:t>, para garantir entregas no prazo garantindo maior</w:t>
-      </w:r>
-      <w:r>
-        <w:rPr>
-          <w:rFonts w:ascii="Times New Roman" w:hAnsi="Times New Roman" w:cs="Times New Roman"/>
-          <w:sz w:val="24"/>
-          <w:szCs w:val="24"/>
-        </w:rPr>
-        <w:t xml:space="preserve"> organização do projeto.</w:t>
+        <w:t>, para garantir entregas no prazo garantindo maior organização do projeto.</w:t>
       </w:r>
     </w:p>
     <w:p>
@@ -2621,51 +2557,27 @@
           <w:sz w:val="24"/>
           <w:szCs w:val="24"/>
         </w:rPr>
-        <w:t xml:space="preserve">O site promove praticidade e autonomia nas </w:t>
-      </w:r>
-      <w:r>
-        <w:rPr>
-          <w:rFonts w:ascii="Times New Roman" w:hAnsi="Times New Roman" w:cs="Times New Roman"/>
-          <w:sz w:val="24"/>
-          <w:szCs w:val="24"/>
-        </w:rPr>
-        <w:t>compras e atendimentos online, através da criação de website que visa alcançar um bom atendimento que auxilia a vida de quem se preocupa com o bem-estar do seu pet. Oferecendo informações claras sobre local, formas de entrega, atendimento ao cliente, conta</w:t>
-      </w:r>
-      <w:r>
-        <w:rPr>
-          <w:rFonts w:ascii="Times New Roman" w:hAnsi="Times New Roman" w:cs="Times New Roman"/>
-          <w:sz w:val="24"/>
-          <w:szCs w:val="24"/>
-        </w:rPr>
-        <w:t>tos e garantia.</w:t>
-      </w:r>
-    </w:p>
-    <w:p>
-      <w:pPr>
-        <w:spacing w:after="0" w:line="360" w:lineRule="auto"/>
-        <w:ind w:firstLine="709"/>
-        <w:jc w:val="both"/>
-        <w:rPr>
-          <w:rFonts w:ascii="Times New Roman" w:hAnsi="Times New Roman" w:cs="Times New Roman"/>
-          <w:sz w:val="24"/>
-          <w:szCs w:val="24"/>
-        </w:rPr>
-      </w:pPr>
-      <w:r>
-        <w:rPr>
-          <w:rFonts w:ascii="Times New Roman" w:hAnsi="Times New Roman" w:cs="Times New Roman"/>
-          <w:sz w:val="24"/>
-          <w:szCs w:val="24"/>
-        </w:rPr>
-        <w:t>Para o desenvolvimento e organização do projeto foi utilizado a metodologia ágil (SCRUM), permitindo a flexibilidade e a adaptação contínua ao longo do processo. A construção do site foi realizada através da utilização das linguagens HTML e</w:t>
-      </w:r>
-      <w:r>
-        <w:rPr>
-          <w:rFonts w:ascii="Times New Roman" w:hAnsi="Times New Roman" w:cs="Times New Roman"/>
-          <w:sz w:val="24"/>
-          <w:szCs w:val="24"/>
-        </w:rPr>
-        <w:t xml:space="preserve"> CSS, para dar estrutura ao conteúdo, organizar as páginas e estilizar. Para o </w:t>
+        <w:t>O site promove praticidade e autonomia nas compras e atendimentos online, através da criação de website que visa alcançar um bom atendimento que auxilia a vida de quem se preocupa com o bem-estar do seu pet. Oferecendo informações claras sobre local, formas de entrega, atendimento ao cliente, contatos e garantia.</w:t>
+      </w:r>
+    </w:p>
+    <w:p>
+      <w:pPr>
+        <w:spacing w:after="0" w:line="360" w:lineRule="auto"/>
+        <w:ind w:firstLine="709"/>
+        <w:jc w:val="both"/>
+        <w:rPr>
+          <w:rFonts w:ascii="Times New Roman" w:hAnsi="Times New Roman" w:cs="Times New Roman"/>
+          <w:sz w:val="24"/>
+          <w:szCs w:val="24"/>
+        </w:rPr>
+      </w:pPr>
+      <w:r>
+        <w:rPr>
+          <w:rFonts w:ascii="Times New Roman" w:hAnsi="Times New Roman" w:cs="Times New Roman"/>
+          <w:sz w:val="24"/>
+          <w:szCs w:val="24"/>
+        </w:rPr>
+        <w:t xml:space="preserve">Para o desenvolvimento e organização do projeto foi utilizado a metodologia ágil (SCRUM), permitindo a flexibilidade e a adaptação contínua ao longo do processo. A construção do site foi realizada através da utilização das linguagens HTML e CSS, para dar estrutura ao conteúdo, organizar as páginas e estilizar. Para o </w:t>
       </w:r>
       <w:proofErr w:type="spellStart"/>
       <w:r>
@@ -2762,23 +2674,7 @@
           <w:sz w:val="24"/>
           <w:szCs w:val="24"/>
         </w:rPr>
-        <w:t>O objetivo p</w:t>
-      </w:r>
-      <w:r>
-        <w:rPr>
-          <w:rFonts w:ascii="Times New Roman" w:hAnsi="Times New Roman" w:cs="Times New Roman"/>
-          <w:sz w:val="24"/>
-          <w:szCs w:val="24"/>
-        </w:rPr>
-        <w:t>rincipal do site é alcançar pessoas que buscam qualidade, confiança e cuidado ao seu animal, oferecer bons atendimentos e produtos, garantindo a saúde dos pets. O objetivo é englobar todos esses princípios em um site de fácil acessibilidade e disponibilida</w:t>
-      </w:r>
-      <w:r>
-        <w:rPr>
-          <w:rFonts w:ascii="Times New Roman" w:hAnsi="Times New Roman" w:cs="Times New Roman"/>
-          <w:sz w:val="24"/>
-          <w:szCs w:val="24"/>
-        </w:rPr>
-        <w:t xml:space="preserve">de aos seus clientes. </w:t>
+        <w:t xml:space="preserve">O objetivo principal do site é alcançar pessoas que buscam qualidade, confiança e cuidado ao seu animal, oferecer bons atendimentos e produtos, garantindo a saúde dos pets. O objetivo é englobar todos esses princípios em um site de fácil acessibilidade e disponibilidade aos seus clientes. </w:t>
       </w:r>
     </w:p>
     <w:p>
@@ -2824,15 +2720,7 @@
           <w:sz w:val="24"/>
           <w:szCs w:val="24"/>
         </w:rPr>
-        <w:t>Desenvolver um site que contém páginas principais que são home, galeria, serviços e contatos, o objetivo é vender produtos e serviços online, de alta confiança e precisão, oferecer suporte aos clientes e oti</w:t>
-      </w:r>
-      <w:r>
-        <w:rPr>
-          <w:rFonts w:ascii="Times New Roman" w:hAnsi="Times New Roman" w:cs="Times New Roman"/>
-          <w:sz w:val="24"/>
-          <w:szCs w:val="24"/>
-        </w:rPr>
-        <w:t>mizar.</w:t>
+        <w:t>Desenvolver um site que contém páginas principais que são home, galeria, serviços e contatos, o objetivo é vender produtos e serviços online, de alta confiança e precisão, oferecer suporte aos clientes e otimizar.</w:t>
       </w:r>
     </w:p>
     <w:p>
@@ -3044,15 +2932,7 @@
           <w:sz w:val="24"/>
           <w:szCs w:val="24"/>
         </w:rPr>
-        <w:t xml:space="preserve">Para o desenvolvimento dos métodos do projeto, foi realizado análises em diferentes bases cientificas e sites autênticos das documentações e tecnologias aplicadas, detalhando as suas </w:t>
-      </w:r>
-      <w:r>
-        <w:rPr>
-          <w:rFonts w:ascii="Times New Roman" w:hAnsi="Times New Roman" w:cs="Times New Roman"/>
-          <w:sz w:val="24"/>
-          <w:szCs w:val="24"/>
-        </w:rPr>
-        <w:t>principais funcionalidades e usabilidades. Utilizou-se de artigos científicos, pesquisas, para realizar análises e estudos sobre as tecnologias referentes com o projeto.</w:t>
+        <w:t>Para o desenvolvimento dos métodos do projeto, foi realizado análises em diferentes bases cientificas e sites autênticos das documentações e tecnologias aplicadas, detalhando as suas principais funcionalidades e usabilidades. Utilizou-se de artigos científicos, pesquisas, para realizar análises e estudos sobre as tecnologias referentes com o projeto.</w:t>
       </w:r>
     </w:p>
     <w:p>
@@ -3139,15 +3019,7 @@
           <w:sz w:val="24"/>
           <w:szCs w:val="24"/>
         </w:rPr>
-        <w:t xml:space="preserve">O HTML é uma linguagem de marcação padrão utilizada para definir </w:t>
-      </w:r>
-      <w:r>
-        <w:rPr>
-          <w:rFonts w:ascii="Times New Roman" w:hAnsi="Times New Roman" w:cs="Times New Roman"/>
-          <w:sz w:val="24"/>
-          <w:szCs w:val="24"/>
-        </w:rPr>
-        <w:t>e estruturar conteúdos de páginas web através de etiquetas (</w:t>
+        <w:t>O HTML é uma linguagem de marcação padrão utilizada para definir e estruturar conteúdos de páginas web através de etiquetas (</w:t>
       </w:r>
       <w:proofErr w:type="spellStart"/>
       <w:r>
@@ -3165,46 +3037,30 @@
           <w:sz w:val="24"/>
           <w:szCs w:val="24"/>
         </w:rPr>
-        <w:t>) que diferenciam partes do conteúdo como, imagens, listas, parágrafos, títulos, etc. Foi criada em 1991 no CERN (Organização Europeia para Pesquisa Nuclear) pelo cientista da computação britâ</w:t>
-      </w:r>
-      <w:r>
-        <w:rPr>
-          <w:rFonts w:ascii="Times New Roman" w:hAnsi="Times New Roman" w:cs="Times New Roman"/>
-          <w:sz w:val="24"/>
-          <w:szCs w:val="24"/>
-        </w:rPr>
-        <w:t xml:space="preserve">nico Tim Berners-Lee. </w:t>
-      </w:r>
-    </w:p>
-    <w:p>
-      <w:pPr>
-        <w:tabs>
-          <w:tab w:val="left" w:pos="2400"/>
-        </w:tabs>
-        <w:spacing w:after="0" w:line="360" w:lineRule="auto"/>
-        <w:ind w:firstLine="709"/>
-        <w:jc w:val="both"/>
-        <w:rPr>
-          <w:rFonts w:ascii="Times New Roman" w:hAnsi="Times New Roman" w:cs="Times New Roman"/>
-          <w:sz w:val="24"/>
-          <w:szCs w:val="24"/>
-        </w:rPr>
-      </w:pPr>
-      <w:r>
-        <w:rPr>
-          <w:rFonts w:ascii="Times New Roman" w:hAnsi="Times New Roman" w:cs="Times New Roman"/>
-          <w:sz w:val="24"/>
-          <w:szCs w:val="24"/>
-        </w:rPr>
-        <w:t>Utilizamos a linguagem HTML em nosso projeto devido a sua fácil usabilidade e compreendimento, acessibilidade e a estruturação do projeto, além de, sua alta compatibilidade com diversos navegadores webs, possibilitando acessos rápido</w:t>
-      </w:r>
-      <w:r>
-        <w:rPr>
-          <w:rFonts w:ascii="Times New Roman" w:hAnsi="Times New Roman" w:cs="Times New Roman"/>
-          <w:sz w:val="24"/>
-          <w:szCs w:val="24"/>
-        </w:rPr>
-        <w:t>s e suporte. A linguagem permitiu a organização de elementos no site de maneira coerente, tornando a navegação do usuário agradável e intuitiva.</w:t>
+        <w:t xml:space="preserve">) que diferenciam partes do conteúdo como, imagens, listas, parágrafos, títulos, etc. Foi criada em 1991 no CERN (Organização Europeia para Pesquisa Nuclear) pelo cientista da computação britânico Tim Berners-Lee. </w:t>
+      </w:r>
+    </w:p>
+    <w:p>
+      <w:pPr>
+        <w:tabs>
+          <w:tab w:val="left" w:pos="2400"/>
+        </w:tabs>
+        <w:spacing w:after="0" w:line="360" w:lineRule="auto"/>
+        <w:ind w:firstLine="709"/>
+        <w:jc w:val="both"/>
+        <w:rPr>
+          <w:rFonts w:ascii="Times New Roman" w:hAnsi="Times New Roman" w:cs="Times New Roman"/>
+          <w:sz w:val="24"/>
+          <w:szCs w:val="24"/>
+        </w:rPr>
+      </w:pPr>
+      <w:r>
+        <w:rPr>
+          <w:rFonts w:ascii="Times New Roman" w:hAnsi="Times New Roman" w:cs="Times New Roman"/>
+          <w:sz w:val="24"/>
+          <w:szCs w:val="24"/>
+        </w:rPr>
+        <w:t>Utilizamos a linguagem HTML em nosso projeto devido a sua fácil usabilidade e compreendimento, acessibilidade e a estruturação do projeto, além de, sua alta compatibilidade com diversos navegadores webs, possibilitando acessos rápidos e suporte. A linguagem permitiu a organização de elementos no site de maneira coerente, tornando a navegação do usuário agradável e intuitiva.</w:t>
       </w:r>
     </w:p>
     <w:p>
@@ -3398,23 +3254,7 @@
           <w:sz w:val="24"/>
           <w:szCs w:val="24"/>
         </w:rPr>
-        <w:t xml:space="preserve"> e lançada pelo W3C, o objetivo da criaç</w:t>
-      </w:r>
-      <w:r>
-        <w:rPr>
-          <w:rFonts w:ascii="Times New Roman" w:hAnsi="Times New Roman" w:cs="Times New Roman"/>
-          <w:sz w:val="24"/>
-          <w:szCs w:val="24"/>
-        </w:rPr>
-        <w:t>ão do CSS foi separar o conteúdo da apresentação visual de um site, o CSS é uma linguagem utilizada no mundo todo por sua utilizada de controlar as opções de cores, linhas, margem, alturas, larguras, imagens e posicionamento. Essa linguagem foi desenvolvid</w:t>
-      </w:r>
-      <w:r>
-        <w:rPr>
-          <w:rFonts w:ascii="Times New Roman" w:hAnsi="Times New Roman" w:cs="Times New Roman"/>
-          <w:sz w:val="24"/>
-          <w:szCs w:val="24"/>
-        </w:rPr>
-        <w:t>a para facilitar as programações a partir do momento em que o HTML não sustentava realizar todas essas as funções.</w:t>
+        <w:t xml:space="preserve"> e lançada pelo W3C, o objetivo da criação do CSS foi separar o conteúdo da apresentação visual de um site, o CSS é uma linguagem utilizada no mundo todo por sua utilizada de controlar as opções de cores, linhas, margem, alturas, larguras, imagens e posicionamento. Essa linguagem foi desenvolvida para facilitar as programações a partir do momento em que o HTML não sustentava realizar todas essas as funções.</w:t>
       </w:r>
     </w:p>
     <w:p>
@@ -3437,15 +3277,7 @@
           <w:sz w:val="24"/>
           <w:szCs w:val="24"/>
         </w:rPr>
-        <w:t>Utilizamos na programação do nosso site a linguagem CSS para estilizar e tornar o visual das páginas agradável, deixando a experiencia e o tr</w:t>
-      </w:r>
-      <w:r>
-        <w:rPr>
-          <w:rFonts w:ascii="Times New Roman" w:eastAsia="Malgun Gothic" w:hAnsi="Times New Roman" w:cs="Malgun Gothic"/>
-          <w:sz w:val="24"/>
-          <w:szCs w:val="24"/>
-        </w:rPr>
-        <w:t>abalho mais confortável para o usuário.</w:t>
+        <w:t>Utilizamos na programação do nosso site a linguagem CSS para estilizar e tornar o visual das páginas agradável, deixando a experiencia e o trabalho mais confortável para o usuário.</w:t>
       </w:r>
     </w:p>
     <w:p>
@@ -3592,15 +3424,7 @@
           <w:sz w:val="24"/>
           <w:szCs w:val="24"/>
         </w:rPr>
-        <w:t>A utilização de um IDE (Ambiente de Desenvolvimento Integrado) foi essencial para reunir todas as ferramentas para a escrita de código em um só lugar, tornando o processo de desenvolvimento mais eficiente, um IDE aumenta a produtividade dos desenvolvedores</w:t>
-      </w:r>
-      <w:r>
-        <w:rPr>
-          <w:rFonts w:ascii="Times New Roman" w:hAnsi="Times New Roman" w:cs="Times New Roman"/>
-          <w:sz w:val="24"/>
-          <w:szCs w:val="24"/>
-        </w:rPr>
-        <w:t xml:space="preserve"> pois disponibiliza automação da edição do código, realce de sintaxe, complementação de código inteligente, suporte para </w:t>
+        <w:t xml:space="preserve">A utilização de um IDE (Ambiente de Desenvolvimento Integrado) foi essencial para reunir todas as ferramentas para a escrita de código em um só lugar, tornando o processo de desenvolvimento mais eficiente, um IDE aumenta a produtividade dos desenvolvedores pois disponibiliza automação da edição do código, realce de sintaxe, complementação de código inteligente, suporte para </w:t>
       </w:r>
       <w:proofErr w:type="spellStart"/>
       <w:r>
@@ -3618,15 +3442,7 @@
           <w:sz w:val="24"/>
           <w:szCs w:val="24"/>
         </w:rPr>
-        <w:t xml:space="preserve">, automação da criação local, compilação, testes e depuração. Não existe uma data específica da criação desse conceito, mas </w:t>
-      </w:r>
-      <w:r>
-        <w:rPr>
-          <w:rFonts w:ascii="Times New Roman" w:hAnsi="Times New Roman" w:cs="Times New Roman"/>
-          <w:sz w:val="24"/>
-          <w:szCs w:val="24"/>
-        </w:rPr>
-        <w:t xml:space="preserve">os primeiros protótipos surgiram por volta de 1980. </w:t>
+        <w:t xml:space="preserve">, automação da criação local, compilação, testes e depuração. Não existe uma data específica da criação desse conceito, mas os primeiros protótipos surgiram por volta de 1980. </w:t>
       </w:r>
     </w:p>
     <w:p>
@@ -3785,15 +3601,7 @@
           <w:sz w:val="24"/>
           <w:szCs w:val="24"/>
         </w:rPr>
-        <w:t xml:space="preserve"> é armazenar dados sobre um mesmo</w:t>
-      </w:r>
-      <w:r>
-        <w:rPr>
-          <w:rFonts w:ascii="Times New Roman" w:hAnsi="Times New Roman" w:cs="Times New Roman"/>
-          <w:sz w:val="24"/>
-          <w:szCs w:val="24"/>
-        </w:rPr>
-        <w:t xml:space="preserve"> assunto em um local central, seguro e de fácil manipulação. É um agrupamento de informações organizadas de maneira estruturada, organizada e otimizada, é de extrema relevância a sua utilização para a organização de um site.</w:t>
+        <w:t xml:space="preserve"> é armazenar dados sobre um mesmo assunto em um local central, seguro e de fácil manipulação. É um agrupamento de informações organizadas de maneira estruturada, organizada e otimizada, é de extrema relevância a sua utilização para a organização de um site.</w:t>
       </w:r>
     </w:p>
     <w:p>
@@ -3817,15 +3625,7 @@
           <w:sz w:val="24"/>
           <w:szCs w:val="24"/>
         </w:rPr>
-        <w:t>Utilizamos um banco de dados em</w:t>
-      </w:r>
-      <w:r>
-        <w:rPr>
-          <w:rFonts w:ascii="Times New Roman" w:hAnsi="Times New Roman" w:cs="Times New Roman"/>
-          <w:sz w:val="24"/>
-          <w:szCs w:val="24"/>
-        </w:rPr>
-        <w:t xml:space="preserve"> nosso projeto para que fosse possível realizar o armazenamento de dados dos clientes que fizessem login em nossa página, manipular, organizar e otimizar os processos empresariais. </w:t>
+        <w:t xml:space="preserve">Utilizamos um banco de dados em nosso projeto para que fosse possível realizar o armazenamento de dados dos clientes que fizessem login em nossa página, manipular, organizar e otimizar os processos empresariais. </w:t>
       </w:r>
     </w:p>
     <w:p>
@@ -3966,15 +3766,7 @@
           <w:sz w:val="24"/>
           <w:szCs w:val="24"/>
         </w:rPr>
-        <w:t>A ferramenta online de gerenciamento de projetos e tarefas</w:t>
-      </w:r>
-      <w:r>
-        <w:rPr>
-          <w:rFonts w:ascii="Times New Roman" w:hAnsi="Times New Roman" w:cs="Times New Roman"/>
-          <w:sz w:val="24"/>
-          <w:szCs w:val="24"/>
-        </w:rPr>
-        <w:t xml:space="preserve"> </w:t>
+        <w:t xml:space="preserve">A ferramenta online de gerenciamento de projetos e tarefas </w:t>
       </w:r>
       <w:proofErr w:type="spellStart"/>
       <w:r>
@@ -4010,15 +3802,7 @@
           <w:sz w:val="24"/>
           <w:szCs w:val="24"/>
         </w:rPr>
-        <w:t xml:space="preserve"> e Michael Pryor, é utilizado para organizar o trabalho de forma visual, utilizando metodologias ágeis. É utilizado dentro da plataforma três componentes principais para sua estrutura, quadros, listas e cartões, a ve</w:t>
-      </w:r>
-      <w:r>
-        <w:rPr>
-          <w:rFonts w:ascii="Times New Roman" w:hAnsi="Times New Roman" w:cs="Times New Roman"/>
-          <w:sz w:val="24"/>
-          <w:szCs w:val="24"/>
-        </w:rPr>
-        <w:t xml:space="preserve">rsatilidade do </w:t>
+        <w:t xml:space="preserve"> e Michael Pryor, é utilizado para organizar o trabalho de forma visual, utilizando metodologias ágeis. É utilizado dentro da plataforma três componentes principais para sua estrutura, quadros, listas e cartões, a versatilidade do </w:t>
       </w:r>
       <w:proofErr w:type="spellStart"/>
       <w:r>
@@ -4077,15 +3861,7 @@
           <w:sz w:val="24"/>
           <w:szCs w:val="24"/>
         </w:rPr>
-        <w:t xml:space="preserve"> com o objetivo de organizar cada entrega das sprints, definidas por cartões e incluindo em cada um as atividades e </w:t>
-      </w:r>
-      <w:r>
-        <w:rPr>
-          <w:rFonts w:ascii="Times New Roman" w:hAnsi="Times New Roman" w:cs="Times New Roman"/>
-          <w:sz w:val="24"/>
-          <w:szCs w:val="24"/>
-        </w:rPr>
-        <w:t>projetos a serem entregues a certo prazo, melhorando a comunicação e a garantia de qualidade da produção do site.</w:t>
+        <w:t xml:space="preserve"> com o objetivo de organizar cada entrega das sprints, definidas por cartões e incluindo em cada um as atividades e projetos a serem entregues a certo prazo, melhorando a comunicação e a garantia de qualidade da produção do site.</w:t>
       </w:r>
     </w:p>
     <w:p>
@@ -4270,15 +4046,7 @@
           <w:sz w:val="24"/>
           <w:szCs w:val="24"/>
         </w:rPr>
-        <w:t xml:space="preserve"> é um sistema de controle de versão, foi criado por Linus Torvalds em 2005, já o GitHub foi lançado em 2008 por Tom Pres</w:t>
-      </w:r>
-      <w:r>
-        <w:rPr>
-          <w:rFonts w:ascii="Times New Roman" w:hAnsi="Times New Roman" w:cs="Times New Roman"/>
-          <w:sz w:val="24"/>
-          <w:szCs w:val="24"/>
-        </w:rPr>
-        <w:t xml:space="preserve">ton-Werner, Chris </w:t>
+        <w:t xml:space="preserve"> é um sistema de controle de versão, foi criado por Linus Torvalds em 2005, já o GitHub foi lançado em 2008 por Tom Preston-Werner, Chris </w:t>
       </w:r>
       <w:proofErr w:type="spellStart"/>
       <w:r>
@@ -4332,15 +4100,7 @@
           <w:sz w:val="24"/>
           <w:szCs w:val="24"/>
         </w:rPr>
-        <w:t>. A plataforma é baseada em nuvem da qual é possível armazenar, compartilhar e trabalhar com outras pessoas para compartilhar e escrever códigos, o sistema acompanha as alterações nos arquivos de forma in</w:t>
-      </w:r>
-      <w:r>
-        <w:rPr>
-          <w:rFonts w:ascii="Times New Roman" w:hAnsi="Times New Roman" w:cs="Times New Roman"/>
-          <w:sz w:val="24"/>
-          <w:szCs w:val="24"/>
-        </w:rPr>
-        <w:t>teligente.</w:t>
+        <w:t>. A plataforma é baseada em nuvem da qual é possível armazenar, compartilhar e trabalhar com outras pessoas para compartilhar e escrever códigos, o sistema acompanha as alterações nos arquivos de forma inteligente.</w:t>
       </w:r>
     </w:p>
     <w:p>
@@ -4623,45 +4383,29 @@
           <w:sz w:val="24"/>
           <w:szCs w:val="24"/>
         </w:rPr>
-        <w:t xml:space="preserve"> é uma ferramenta multifuncional usada princi</w:t>
-      </w:r>
-      <w:r>
-        <w:rPr>
-          <w:rFonts w:ascii="Times New Roman" w:hAnsi="Times New Roman" w:cs="Times New Roman"/>
-          <w:sz w:val="24"/>
-          <w:szCs w:val="24"/>
-        </w:rPr>
-        <w:t>palmente por designers,</w:t>
-      </w:r>
-    </w:p>
-    <w:p>
-      <w:pPr>
-        <w:tabs>
-          <w:tab w:val="left" w:pos="2400"/>
-        </w:tabs>
-        <w:spacing w:after="0" w:line="360" w:lineRule="auto"/>
-        <w:jc w:val="both"/>
-        <w:rPr>
-          <w:rFonts w:ascii="Times New Roman" w:hAnsi="Times New Roman" w:cs="Times New Roman"/>
-          <w:sz w:val="24"/>
-          <w:szCs w:val="24"/>
-        </w:rPr>
-      </w:pPr>
-      <w:r>
-        <w:rPr>
-          <w:rFonts w:ascii="Times New Roman" w:hAnsi="Times New Roman" w:cs="Times New Roman"/>
-          <w:sz w:val="24"/>
-          <w:szCs w:val="24"/>
-        </w:rPr>
-        <w:t>desenvolvedores para criar interfaces digitais e designs gráficos, foi criado por Dylan Field e Evan Wallace lançado em 2016. Utilizamos essa ferramenta para criar o protótipo da interface de cada página do site, uma forma de visual</w:t>
-      </w:r>
-      <w:r>
-        <w:rPr>
-          <w:rFonts w:ascii="Times New Roman" w:hAnsi="Times New Roman" w:cs="Times New Roman"/>
-          <w:sz w:val="24"/>
-          <w:szCs w:val="24"/>
-        </w:rPr>
-        <w:t xml:space="preserve">izar com clareza o projeto antes de colocá-lo em prática, utilizamos as ferramentas disponíveis no site para elaborar e a partir desse protótipo, criar o seu design na programação. </w:t>
+        <w:t xml:space="preserve"> é uma ferramenta multifuncional usada principalmente por designers,</w:t>
+      </w:r>
+    </w:p>
+    <w:p>
+      <w:pPr>
+        <w:tabs>
+          <w:tab w:val="left" w:pos="2400"/>
+        </w:tabs>
+        <w:spacing w:after="0" w:line="360" w:lineRule="auto"/>
+        <w:jc w:val="both"/>
+        <w:rPr>
+          <w:rFonts w:ascii="Times New Roman" w:hAnsi="Times New Roman" w:cs="Times New Roman"/>
+          <w:sz w:val="24"/>
+          <w:szCs w:val="24"/>
+        </w:rPr>
+      </w:pPr>
+      <w:r>
+        <w:rPr>
+          <w:rFonts w:ascii="Times New Roman" w:hAnsi="Times New Roman" w:cs="Times New Roman"/>
+          <w:sz w:val="24"/>
+          <w:szCs w:val="24"/>
+        </w:rPr>
+        <w:t xml:space="preserve">desenvolvedores para criar interfaces digitais e designs gráficos, foi criado por Dylan Field e Evan Wallace lançado em 2016. Utilizamos essa ferramenta para criar o protótipo da interface de cada página do site, uma forma de visualizar com clareza o projeto antes de colocá-lo em prática, utilizamos as ferramentas disponíveis no site para elaborar e a partir desse protótipo, criar o seu design na programação. </w:t>
       </w:r>
     </w:p>
     <w:p>
@@ -4826,15 +4570,7 @@
           <w:sz w:val="24"/>
           <w:szCs w:val="24"/>
         </w:rPr>
-        <w:t xml:space="preserve"> é uma plataforma online gratuita desenvo</w:t>
-      </w:r>
-      <w:r>
-        <w:rPr>
-          <w:rFonts w:ascii="Times New Roman" w:hAnsi="Times New Roman" w:cs="Times New Roman"/>
-          <w:sz w:val="24"/>
-          <w:szCs w:val="24"/>
-        </w:rPr>
-        <w:t xml:space="preserve">lvida para simplificar e organizar o aprendizado, tanto em ambientes virtuais quanto presenciais, foi criado pelo Google em 2014 e faz parte do conjunto de ferramentas do Google for </w:t>
+        <w:t xml:space="preserve"> é uma plataforma online gratuita desenvolvida para simplificar e organizar o aprendizado, tanto em ambientes virtuais quanto presenciais, foi criado pelo Google em 2014 e faz parte do conjunto de ferramentas do Google for </w:t>
       </w:r>
       <w:proofErr w:type="spellStart"/>
       <w:r>
@@ -4943,15 +4679,7 @@
           <w:sz w:val="24"/>
           <w:szCs w:val="24"/>
         </w:rPr>
-        <w:t>Foi através dessa plataforma que os planos de aula, atividades</w:t>
-      </w:r>
-      <w:r>
-        <w:rPr>
-          <w:rFonts w:ascii="Times New Roman" w:hAnsi="Times New Roman" w:cs="Times New Roman"/>
-          <w:sz w:val="24"/>
-          <w:szCs w:val="24"/>
-        </w:rPr>
-        <w:t xml:space="preserve">, avaliações e entregas das atividades foram realizados, a plataforma </w:t>
+        <w:t xml:space="preserve">Foi através dessa plataforma que os planos de aula, atividades, avaliações e entregas das atividades foram realizados, a plataforma </w:t>
       </w:r>
       <w:proofErr w:type="spellStart"/>
       <w:r>
@@ -5101,15 +4829,7 @@
           <w:sz w:val="24"/>
           <w:szCs w:val="24"/>
         </w:rPr>
-        <w:t xml:space="preserve"> de materiais visuais, como posts para redes sociais, apresentações, cartões de visita, convites, flyers e até vídeos, oferece milhare</w:t>
-      </w:r>
-      <w:r>
-        <w:rPr>
-          <w:rFonts w:ascii="Times New Roman" w:hAnsi="Times New Roman" w:cs="Times New Roman"/>
-          <w:sz w:val="24"/>
-          <w:szCs w:val="24"/>
-        </w:rPr>
-        <w:t xml:space="preserve">s de modelos pré-prontos para agilizar o processo de criação. </w:t>
+        <w:t xml:space="preserve"> de materiais visuais, como posts para redes sociais, apresentações, cartões de visita, convites, flyers e até vídeos, oferece milhares de modelos pré-prontos para agilizar o processo de criação. </w:t>
       </w:r>
     </w:p>
     <w:p>
@@ -5702,16 +5422,7 @@
           <w:sz w:val="24"/>
           <w:szCs w:val="24"/>
         </w:rPr>
-        <w:t xml:space="preserve">algumas pesquisas este capítulo pode </w:t>
-      </w:r>
-      <w:r>
-        <w:rPr>
-          <w:rFonts w:ascii="Times New Roman" w:hAnsi="Times New Roman" w:cs="Times New Roman"/>
-          <w:b/>
-          <w:sz w:val="24"/>
-          <w:szCs w:val="24"/>
-        </w:rPr>
-        <w:t>resultar em um capítulo posterior de Análise</w:t>
+        <w:t>algumas pesquisas este capítulo pode resultar em um capítulo posterior de Análise</w:t>
       </w:r>
     </w:p>
     <w:p>
@@ -5811,16 +5522,7 @@
           <w:sz w:val="24"/>
           <w:szCs w:val="24"/>
         </w:rPr>
-        <w:t xml:space="preserve">verificando se os mesmos comprovam </w:t>
-      </w:r>
-      <w:r>
-        <w:rPr>
-          <w:rFonts w:ascii="Times New Roman" w:hAnsi="Times New Roman" w:cs="Times New Roman"/>
-          <w:b/>
-          <w:sz w:val="24"/>
-          <w:szCs w:val="24"/>
-        </w:rPr>
-        <w:t>ou refutam as hipóteses.</w:t>
+        <w:t>verificando se os mesmos comprovam ou refutam as hipóteses.</w:t>
       </w:r>
     </w:p>
     <w:p>
@@ -6170,14 +5872,7 @@
           <w:rFonts w:ascii="Times New Roman" w:hAnsi="Times New Roman" w:cs="Times New Roman"/>
           <w:b/>
         </w:rPr>
-        <w:t xml:space="preserve">finalizar o assunto. </w:t>
-      </w:r>
-      <w:r>
-        <w:rPr>
-          <w:rFonts w:ascii="Times New Roman" w:hAnsi="Times New Roman" w:cs="Times New Roman"/>
-          <w:b/>
-        </w:rPr>
-        <w:t>Durante a conclusão do trabalho, a discussão deve ser uma</w:t>
+        <w:t>finalizar o assunto. Durante a conclusão do trabalho, a discussão deve ser uma</w:t>
       </w:r>
     </w:p>
     <w:p>
@@ -6240,14 +5935,7 @@
           <w:rFonts w:ascii="Times New Roman" w:hAnsi="Times New Roman" w:cs="Times New Roman"/>
           <w:b/>
         </w:rPr>
-        <w:t>Deve-se fazer referência a qualquer esclarecimento adicional sobre</w:t>
-      </w:r>
-      <w:r>
-        <w:rPr>
-          <w:rFonts w:ascii="Times New Roman" w:hAnsi="Times New Roman" w:cs="Times New Roman"/>
-          <w:b/>
-        </w:rPr>
-        <w:t xml:space="preserve"> os</w:t>
+        <w:t>Deve-se fazer referência a qualquer esclarecimento adicional sobre os</w:t>
       </w:r>
     </w:p>
     <w:p>
@@ -6331,14 +6019,7 @@
           <w:rFonts w:ascii="Times New Roman" w:hAnsi="Times New Roman" w:cs="Times New Roman"/>
           <w:b/>
         </w:rPr>
-        <w:t>sublinhar que se está comentando o trabalho relatado. P</w:t>
-      </w:r>
-      <w:r>
-        <w:rPr>
-          <w:rFonts w:ascii="Times New Roman" w:hAnsi="Times New Roman" w:cs="Times New Roman"/>
-          <w:b/>
-        </w:rPr>
-        <w:t>orém, quando se referir a</w:t>
+        <w:t>sublinhar que se está comentando o trabalho relatado. Porém, quando se referir a</w:t>
       </w:r>
     </w:p>
     <w:p>
@@ -6422,14 +6103,7 @@
           <w:rFonts w:ascii="Times New Roman" w:hAnsi="Times New Roman" w:cs="Times New Roman"/>
           <w:b/>
         </w:rPr>
-        <w:t xml:space="preserve">de maneira racional e </w:t>
-      </w:r>
-      <w:r>
-        <w:rPr>
-          <w:rFonts w:ascii="Times New Roman" w:hAnsi="Times New Roman" w:cs="Times New Roman"/>
-          <w:b/>
-        </w:rPr>
-        <w:t>assim tenha condições de demonstrar a tese que está</w:t>
+        <w:t>de maneira racional e assim tenha condições de demonstrar a tese que está</w:t>
       </w:r>
     </w:p>
     <w:p>
@@ -6513,14 +6187,7 @@
           <w:rFonts w:ascii="Times New Roman" w:hAnsi="Times New Roman" w:cs="Times New Roman"/>
           <w:b/>
         </w:rPr>
-        <w:t>trabalho (introdução e desenvolvimento). A c</w:t>
-      </w:r>
-      <w:r>
-        <w:rPr>
-          <w:rFonts w:ascii="Times New Roman" w:hAnsi="Times New Roman" w:cs="Times New Roman"/>
-          <w:b/>
-        </w:rPr>
-        <w:t>onclusão deve relacionar, em primeiro</w:t>
+        <w:t>trabalho (introdução e desenvolvimento). A conclusão deve relacionar, em primeiro</w:t>
       </w:r>
     </w:p>
     <w:p>
@@ -6583,14 +6250,7 @@
           <w:rFonts w:ascii="Times New Roman" w:hAnsi="Times New Roman" w:cs="Times New Roman"/>
           <w:b/>
         </w:rPr>
-        <w:t>A informação que se inclui nessa seção depende em grande parte</w:t>
-      </w:r>
-      <w:r>
-        <w:rPr>
-          <w:rFonts w:ascii="Times New Roman" w:hAnsi="Times New Roman" w:cs="Times New Roman"/>
-          <w:b/>
-        </w:rPr>
-        <w:t xml:space="preserve"> dos</w:t>
+        <w:t>A informação que se inclui nessa seção depende em grande parte dos</w:t>
       </w:r>
     </w:p>
     <w:p>
@@ -6674,14 +6334,7 @@
           <w:rFonts w:ascii="Times New Roman" w:hAnsi="Times New Roman" w:cs="Times New Roman"/>
           <w:b/>
         </w:rPr>
-        <w:t>são tipi</w:t>
-      </w:r>
-      <w:r>
-        <w:rPr>
-          <w:rFonts w:ascii="Times New Roman" w:hAnsi="Times New Roman" w:cs="Times New Roman"/>
-          <w:b/>
-        </w:rPr>
-        <w:t>camente aqueles que se referem mais diretamente ao estudo e aos</w:t>
+        <w:t>são tipicamente aqueles que se referem mais diretamente ao estudo e aos</w:t>
       </w:r>
     </w:p>
     <w:p>
@@ -6855,8 +6508,643 @@
           <w:szCs w:val="24"/>
         </w:rPr>
       </w:pPr>
+      <w:r>
+        <w:rPr>
+          <w:rFonts w:ascii="Times New Roman" w:hAnsi="Times New Roman" w:cs="Times New Roman"/>
+          <w:b/>
+          <w:sz w:val="24"/>
+          <w:szCs w:val="24"/>
+        </w:rPr>
+        <w:t>https://developer.mozilla.org/pt-BR/docs/Web/HTML#:~:text=HTML%20(Linguagem%20de%20Marca%C3%A7%C3%A3o%20de%20HiperTexto)%20%C3%A9,funcionalidade/comportamento%20(JavaScript)%20de%20uma%20p%C3%A1gina%20da%20web.</w:t>
+      </w:r>
+    </w:p>
+    <w:p>
+      <w:pPr>
+        <w:tabs>
+          <w:tab w:val="left" w:pos="2400"/>
+        </w:tabs>
+        <w:spacing w:after="0" w:line="360" w:lineRule="auto"/>
+        <w:ind w:firstLine="709"/>
+        <w:jc w:val="both"/>
+        <w:rPr>
+          <w:rFonts w:ascii="Times New Roman" w:hAnsi="Times New Roman" w:cs="Times New Roman"/>
+          <w:b/>
+          <w:sz w:val="24"/>
+          <w:szCs w:val="24"/>
+        </w:rPr>
+      </w:pPr>
+      <w:r>
+        <w:rPr>
+          <w:rFonts w:ascii="Times New Roman" w:hAnsi="Times New Roman" w:cs="Times New Roman"/>
+          <w:b/>
+          <w:sz w:val="24"/>
+          <w:szCs w:val="24"/>
+        </w:rPr>
+        <w:t>https://www.hostinger.com/br/tutoriais/o-que-e-html-conceitos-basicos</w:t>
+      </w:r>
+    </w:p>
+    <w:p>
+      <w:pPr>
+        <w:tabs>
+          <w:tab w:val="left" w:pos="2400"/>
+        </w:tabs>
+        <w:spacing w:after="0" w:line="360" w:lineRule="auto"/>
+        <w:ind w:firstLine="709"/>
+        <w:jc w:val="both"/>
+        <w:rPr>
+          <w:rFonts w:ascii="Times New Roman" w:hAnsi="Times New Roman" w:cs="Times New Roman"/>
+          <w:b/>
+          <w:sz w:val="24"/>
+          <w:szCs w:val="24"/>
+        </w:rPr>
+      </w:pPr>
+      <w:r>
+        <w:rPr>
+          <w:rFonts w:ascii="Times New Roman" w:hAnsi="Times New Roman" w:cs="Times New Roman"/>
+          <w:b/>
+          <w:sz w:val="24"/>
+          <w:szCs w:val="24"/>
+        </w:rPr>
+        <w:t>https://www.rocketseat.com.br/blog/artigos/post/como-comecar-com-html-e-css</w:t>
+      </w:r>
+    </w:p>
+    <w:p>
+      <w:pPr>
+        <w:tabs>
+          <w:tab w:val="left" w:pos="2400"/>
+        </w:tabs>
+        <w:spacing w:after="0" w:line="360" w:lineRule="auto"/>
+        <w:ind w:firstLine="709"/>
+        <w:jc w:val="both"/>
+        <w:rPr>
+          <w:rFonts w:ascii="Times New Roman" w:hAnsi="Times New Roman" w:cs="Times New Roman"/>
+          <w:b/>
+          <w:sz w:val="24"/>
+          <w:szCs w:val="24"/>
+        </w:rPr>
+      </w:pPr>
+      <w:r>
+        <w:rPr>
+          <w:rFonts w:ascii="Times New Roman" w:hAnsi="Times New Roman" w:cs="Times New Roman"/>
+          <w:b/>
+          <w:sz w:val="24"/>
+          <w:szCs w:val="24"/>
+        </w:rPr>
+        <w:t>https://www.godaddy.com/resources/br/artigos/o-que-e-html</w:t>
+      </w:r>
+    </w:p>
+    <w:p>
+      <w:pPr>
+        <w:tabs>
+          <w:tab w:val="left" w:pos="2400"/>
+        </w:tabs>
+        <w:spacing w:after="0" w:line="360" w:lineRule="auto"/>
+        <w:ind w:firstLine="709"/>
+        <w:jc w:val="both"/>
+        <w:rPr>
+          <w:rFonts w:ascii="Times New Roman" w:hAnsi="Times New Roman" w:cs="Times New Roman"/>
+          <w:b/>
+          <w:sz w:val="24"/>
+          <w:szCs w:val="24"/>
+        </w:rPr>
+      </w:pPr>
+      <w:r>
+        <w:rPr>
+          <w:rFonts w:ascii="Times New Roman" w:hAnsi="Times New Roman" w:cs="Times New Roman"/>
+          <w:b/>
+          <w:sz w:val="24"/>
+          <w:szCs w:val="24"/>
+        </w:rPr>
+        <w:t>https://www.rocketseat.com.br/blog/artigos/post/como-comecar-com-html-e-css</w:t>
+      </w:r>
+    </w:p>
+    <w:p>
+      <w:pPr>
+        <w:tabs>
+          <w:tab w:val="left" w:pos="2400"/>
+        </w:tabs>
+        <w:spacing w:after="0" w:line="360" w:lineRule="auto"/>
+        <w:ind w:firstLine="709"/>
+        <w:jc w:val="both"/>
+        <w:rPr>
+          <w:rFonts w:ascii="Times New Roman" w:hAnsi="Times New Roman" w:cs="Times New Roman"/>
+          <w:b/>
+          <w:sz w:val="24"/>
+          <w:szCs w:val="24"/>
+        </w:rPr>
+      </w:pPr>
+      <w:r>
+        <w:rPr>
+          <w:rFonts w:ascii="Times New Roman" w:hAnsi="Times New Roman" w:cs="Times New Roman"/>
+          <w:b/>
+          <w:sz w:val="24"/>
+          <w:szCs w:val="24"/>
+        </w:rPr>
+        <w:t>https://developer.mozilla.org/pt-BR/docs/Web/CSS#:~:text=CSS%20(Cascading%20Style%20Sheets%20ou%20Folhas%20de,papel%2C%20na%20fala%20ou%20em%20outras%20m%C3%ADdias.</w:t>
+      </w:r>
+    </w:p>
+    <w:p>
+      <w:pPr>
+        <w:tabs>
+          <w:tab w:val="left" w:pos="2400"/>
+        </w:tabs>
+        <w:spacing w:after="0" w:line="360" w:lineRule="auto"/>
+        <w:ind w:firstLine="709"/>
+        <w:jc w:val="both"/>
+        <w:rPr>
+          <w:rFonts w:ascii="Times New Roman" w:hAnsi="Times New Roman" w:cs="Times New Roman"/>
+          <w:b/>
+          <w:sz w:val="24"/>
+          <w:szCs w:val="24"/>
+        </w:rPr>
+      </w:pPr>
+      <w:r>
+        <w:rPr>
+          <w:rFonts w:ascii="Times New Roman" w:hAnsi="Times New Roman" w:cs="Times New Roman"/>
+          <w:b/>
+          <w:sz w:val="24"/>
+          <w:szCs w:val="24"/>
+        </w:rPr>
+        <w:t>https://www.hostgator.com.br/blog/o-que-e-css/</w:t>
+      </w:r>
+    </w:p>
+    <w:p>
+      <w:pPr>
+        <w:tabs>
+          <w:tab w:val="left" w:pos="2400"/>
+        </w:tabs>
+        <w:spacing w:after="0" w:line="360" w:lineRule="auto"/>
+        <w:ind w:firstLine="709"/>
+        <w:jc w:val="both"/>
+        <w:rPr>
+          <w:rFonts w:ascii="Times New Roman" w:hAnsi="Times New Roman" w:cs="Times New Roman"/>
+          <w:b/>
+          <w:sz w:val="24"/>
+          <w:szCs w:val="24"/>
+        </w:rPr>
+      </w:pPr>
+      <w:r>
+        <w:rPr>
+          <w:rFonts w:ascii="Times New Roman" w:hAnsi="Times New Roman" w:cs="Times New Roman"/>
+          <w:b/>
+          <w:sz w:val="24"/>
+          <w:szCs w:val="24"/>
+        </w:rPr>
+        <w:t>https://learn.microsoft.com/pt-br/shows/visual-studio-code/</w:t>
+      </w:r>
+    </w:p>
+    <w:p>
+      <w:pPr>
+        <w:tabs>
+          <w:tab w:val="left" w:pos="2400"/>
+        </w:tabs>
+        <w:spacing w:after="0" w:line="360" w:lineRule="auto"/>
+        <w:ind w:firstLine="709"/>
+        <w:jc w:val="both"/>
+        <w:rPr>
+          <w:rFonts w:ascii="Times New Roman" w:hAnsi="Times New Roman" w:cs="Times New Roman"/>
+          <w:b/>
+          <w:sz w:val="24"/>
+          <w:szCs w:val="24"/>
+        </w:rPr>
+      </w:pPr>
+      <w:r>
+        <w:rPr>
+          <w:rFonts w:ascii="Times New Roman" w:hAnsi="Times New Roman" w:cs="Times New Roman"/>
+          <w:b/>
+          <w:sz w:val="24"/>
+          <w:szCs w:val="24"/>
+        </w:rPr>
+        <w:t>https://www.dio.me/articles/visual-studio-code-a-importancia-de-uma-poderosa-ferramenta-de-desenvolvimento</w:t>
+      </w:r>
+    </w:p>
+    <w:p>
+      <w:pPr>
+        <w:tabs>
+          <w:tab w:val="left" w:pos="2400"/>
+        </w:tabs>
+        <w:spacing w:after="0" w:line="360" w:lineRule="auto"/>
+        <w:ind w:firstLine="709"/>
+        <w:jc w:val="both"/>
+        <w:rPr>
+          <w:rFonts w:ascii="Times New Roman" w:hAnsi="Times New Roman" w:cs="Times New Roman"/>
+          <w:b/>
+          <w:sz w:val="24"/>
+          <w:szCs w:val="24"/>
+        </w:rPr>
+      </w:pPr>
+      <w:r>
+        <w:rPr>
+          <w:rFonts w:ascii="Times New Roman" w:hAnsi="Times New Roman" w:cs="Times New Roman"/>
+          <w:b/>
+          <w:sz w:val="24"/>
+          <w:szCs w:val="24"/>
+        </w:rPr>
+        <w:t>https://cloud.google.com/mysql?hl=pt-BR</w:t>
+      </w:r>
+    </w:p>
+    <w:p>
+      <w:pPr>
+        <w:tabs>
+          <w:tab w:val="left" w:pos="2400"/>
+        </w:tabs>
+        <w:spacing w:after="0" w:line="360" w:lineRule="auto"/>
+        <w:ind w:firstLine="709"/>
+        <w:jc w:val="both"/>
+        <w:rPr>
+          <w:rFonts w:ascii="Times New Roman" w:hAnsi="Times New Roman" w:cs="Times New Roman"/>
+          <w:b/>
+          <w:sz w:val="24"/>
+          <w:szCs w:val="24"/>
+        </w:rPr>
+      </w:pPr>
+      <w:r>
+        <w:rPr>
+          <w:rFonts w:ascii="Times New Roman" w:hAnsi="Times New Roman" w:cs="Times New Roman"/>
+          <w:b/>
+          <w:sz w:val="24"/>
+          <w:szCs w:val="24"/>
+        </w:rPr>
+        <w:t>https://www.purestorage.com/br/knowledge/what-is-mysql.html</w:t>
+      </w:r>
+    </w:p>
+    <w:p>
+      <w:pPr>
+        <w:tabs>
+          <w:tab w:val="left" w:pos="2400"/>
+        </w:tabs>
+        <w:spacing w:after="0" w:line="360" w:lineRule="auto"/>
+        <w:ind w:firstLine="709"/>
+        <w:jc w:val="both"/>
+        <w:rPr>
+          <w:rFonts w:ascii="Times New Roman" w:hAnsi="Times New Roman" w:cs="Times New Roman"/>
+          <w:b/>
+          <w:sz w:val="24"/>
+          <w:szCs w:val="24"/>
+        </w:rPr>
+      </w:pPr>
+      <w:r>
+        <w:rPr>
+          <w:rFonts w:ascii="Times New Roman" w:hAnsi="Times New Roman" w:cs="Times New Roman"/>
+          <w:b/>
+          <w:sz w:val="24"/>
+          <w:szCs w:val="24"/>
+        </w:rPr>
+        <w:t>https://aws.amazon.com/pt/compare/the-difference-between-sql-and-mysql/#:~:text=A%20SQL%20%C3%A9%20uma%20linguagem,a%20duas%20tecnologias%20muito%20diferentes</w:t>
+      </w:r>
+      <w:r>
+        <w:rPr>
+          <w:rFonts w:ascii="Times New Roman" w:hAnsi="Times New Roman" w:cs="Times New Roman"/>
+          <w:b/>
+          <w:sz w:val="24"/>
+          <w:szCs w:val="24"/>
+        </w:rPr>
+        <w:t>.</w:t>
+      </w:r>
+    </w:p>
+    <w:p>
+      <w:pPr>
+        <w:tabs>
+          <w:tab w:val="left" w:pos="2400"/>
+        </w:tabs>
+        <w:spacing w:after="0" w:line="360" w:lineRule="auto"/>
+        <w:ind w:firstLine="709"/>
+        <w:jc w:val="both"/>
+        <w:rPr>
+          <w:rFonts w:ascii="Times New Roman" w:hAnsi="Times New Roman" w:cs="Times New Roman"/>
+          <w:b/>
+          <w:sz w:val="24"/>
+          <w:szCs w:val="24"/>
+        </w:rPr>
+      </w:pPr>
+      <w:r>
+        <w:rPr>
+          <w:rFonts w:ascii="Times New Roman" w:hAnsi="Times New Roman" w:cs="Times New Roman"/>
+          <w:b/>
+          <w:sz w:val="24"/>
+          <w:szCs w:val="24"/>
+        </w:rPr>
+        <w:t>https://trello.com/pt-BR/tour</w:t>
+      </w:r>
+    </w:p>
+    <w:p>
+      <w:pPr>
+        <w:tabs>
+          <w:tab w:val="left" w:pos="2400"/>
+        </w:tabs>
+        <w:spacing w:after="0" w:line="360" w:lineRule="auto"/>
+        <w:ind w:firstLine="709"/>
+        <w:jc w:val="both"/>
+        <w:rPr>
+          <w:rFonts w:ascii="Times New Roman" w:hAnsi="Times New Roman" w:cs="Times New Roman"/>
+          <w:b/>
+          <w:sz w:val="24"/>
+          <w:szCs w:val="24"/>
+        </w:rPr>
+      </w:pPr>
+      <w:r>
+        <w:rPr>
+          <w:rFonts w:ascii="Times New Roman" w:hAnsi="Times New Roman" w:cs="Times New Roman"/>
+          <w:b/>
+          <w:sz w:val="24"/>
+          <w:szCs w:val="24"/>
+        </w:rPr>
+        <w:t>https://www.educamaisbrasil.com.br/educacao/dicas/o-que-e-e-como-usar-o-trello</w:t>
+      </w:r>
+    </w:p>
+    <w:p>
+      <w:pPr>
+        <w:tabs>
+          <w:tab w:val="left" w:pos="2400"/>
+        </w:tabs>
+        <w:spacing w:after="0" w:line="360" w:lineRule="auto"/>
+        <w:ind w:firstLine="709"/>
+        <w:jc w:val="both"/>
+        <w:rPr>
+          <w:rFonts w:ascii="Times New Roman" w:hAnsi="Times New Roman" w:cs="Times New Roman"/>
+          <w:b/>
+          <w:sz w:val="24"/>
+          <w:szCs w:val="24"/>
+        </w:rPr>
+      </w:pPr>
+      <w:r>
+        <w:rPr>
+          <w:rFonts w:ascii="Times New Roman" w:hAnsi="Times New Roman" w:cs="Times New Roman"/>
+          <w:b/>
+          <w:sz w:val="24"/>
+          <w:szCs w:val="24"/>
+        </w:rPr>
+        <w:t>https://git-scm.com/</w:t>
+      </w:r>
+    </w:p>
+    <w:p>
+      <w:pPr>
+        <w:tabs>
+          <w:tab w:val="left" w:pos="2400"/>
+        </w:tabs>
+        <w:spacing w:after="0" w:line="360" w:lineRule="auto"/>
+        <w:ind w:firstLine="709"/>
+        <w:jc w:val="both"/>
+        <w:rPr>
+          <w:rFonts w:ascii="Times New Roman" w:hAnsi="Times New Roman" w:cs="Times New Roman"/>
+          <w:b/>
+          <w:sz w:val="24"/>
+          <w:szCs w:val="24"/>
+        </w:rPr>
+      </w:pPr>
+      <w:r>
+        <w:rPr>
+          <w:rFonts w:ascii="Times New Roman" w:hAnsi="Times New Roman" w:cs="Times New Roman"/>
+          <w:b/>
+          <w:sz w:val="24"/>
+          <w:szCs w:val="24"/>
+        </w:rPr>
+        <w:t>https://zup.com.br/blog/git-github-e-gitlab/</w:t>
+      </w:r>
+    </w:p>
+    <w:p>
+      <w:pPr>
+        <w:tabs>
+          <w:tab w:val="left" w:pos="2400"/>
+        </w:tabs>
+        <w:spacing w:after="0" w:line="360" w:lineRule="auto"/>
+        <w:ind w:firstLine="709"/>
+        <w:jc w:val="both"/>
+        <w:rPr>
+          <w:rFonts w:ascii="Times New Roman" w:hAnsi="Times New Roman" w:cs="Times New Roman"/>
+          <w:b/>
+          <w:sz w:val="24"/>
+          <w:szCs w:val="24"/>
+        </w:rPr>
+      </w:pPr>
+      <w:r>
+        <w:rPr>
+          <w:rFonts w:ascii="Times New Roman" w:hAnsi="Times New Roman" w:cs="Times New Roman"/>
+          <w:b/>
+          <w:sz w:val="24"/>
+          <w:szCs w:val="24"/>
+        </w:rPr>
+        <w:t>https://docs.github.com/pt/get-started/start-your-journey/about-github-and-git</w:t>
+      </w:r>
+    </w:p>
+    <w:p>
+      <w:pPr>
+        <w:tabs>
+          <w:tab w:val="left" w:pos="2400"/>
+        </w:tabs>
+        <w:spacing w:after="0" w:line="360" w:lineRule="auto"/>
+        <w:ind w:firstLine="709"/>
+        <w:jc w:val="both"/>
+        <w:rPr>
+          <w:rFonts w:ascii="Times New Roman" w:hAnsi="Times New Roman" w:cs="Times New Roman"/>
+          <w:b/>
+          <w:sz w:val="24"/>
+          <w:szCs w:val="24"/>
+        </w:rPr>
+      </w:pPr>
+      <w:r>
+        <w:rPr>
+          <w:rFonts w:ascii="Times New Roman" w:hAnsi="Times New Roman" w:cs="Times New Roman"/>
+          <w:b/>
+          <w:sz w:val="24"/>
+          <w:szCs w:val="24"/>
+        </w:rPr>
+        <w:t>https://www.figma.com/pt-br/design/</w:t>
+      </w:r>
+    </w:p>
+    <w:p>
+      <w:pPr>
+        <w:tabs>
+          <w:tab w:val="left" w:pos="2400"/>
+        </w:tabs>
+        <w:spacing w:after="0" w:line="360" w:lineRule="auto"/>
+        <w:ind w:firstLine="709"/>
+        <w:jc w:val="both"/>
+        <w:rPr>
+          <w:rFonts w:ascii="Times New Roman" w:hAnsi="Times New Roman" w:cs="Times New Roman"/>
+          <w:b/>
+          <w:sz w:val="24"/>
+          <w:szCs w:val="24"/>
+        </w:rPr>
+      </w:pPr>
+      <w:r>
+        <w:rPr>
+          <w:rFonts w:ascii="Times New Roman" w:hAnsi="Times New Roman" w:cs="Times New Roman"/>
+          <w:b/>
+          <w:sz w:val="24"/>
+          <w:szCs w:val="24"/>
+        </w:rPr>
+        <w:lastRenderedPageBreak/>
+        <w:t>https://help.figma.com/hc/pt-br/articles/14563969806359-O-que-%C3%A9-o-Figma</w:t>
+      </w:r>
+    </w:p>
+    <w:p>
+      <w:pPr>
+        <w:tabs>
+          <w:tab w:val="left" w:pos="2400"/>
+        </w:tabs>
+        <w:spacing w:after="0" w:line="360" w:lineRule="auto"/>
+        <w:ind w:firstLine="709"/>
+        <w:jc w:val="both"/>
+        <w:rPr>
+          <w:rFonts w:ascii="Times New Roman" w:hAnsi="Times New Roman" w:cs="Times New Roman"/>
+          <w:b/>
+          <w:sz w:val="24"/>
+          <w:szCs w:val="24"/>
+        </w:rPr>
+      </w:pPr>
+      <w:r>
+        <w:rPr>
+          <w:rFonts w:ascii="Times New Roman" w:hAnsi="Times New Roman" w:cs="Times New Roman"/>
+          <w:b/>
+          <w:sz w:val="24"/>
+          <w:szCs w:val="24"/>
+        </w:rPr>
+        <w:t>https://edu.gcfglobal.org/pt/google-sala-de-aula-para-alunos/o-que-e-e-para-que-serve-o-google-sala-de-aula/1/</w:t>
+      </w:r>
+    </w:p>
+    <w:p>
+      <w:pPr>
+        <w:tabs>
+          <w:tab w:val="left" w:pos="2400"/>
+        </w:tabs>
+        <w:spacing w:after="0" w:line="360" w:lineRule="auto"/>
+        <w:ind w:firstLine="709"/>
+        <w:jc w:val="both"/>
+        <w:rPr>
+          <w:rFonts w:ascii="Times New Roman" w:hAnsi="Times New Roman" w:cs="Times New Roman"/>
+          <w:b/>
+          <w:sz w:val="24"/>
+          <w:szCs w:val="24"/>
+        </w:rPr>
+      </w:pPr>
+      <w:r>
+        <w:rPr>
+          <w:rFonts w:ascii="Times New Roman" w:hAnsi="Times New Roman" w:cs="Times New Roman"/>
+          <w:b/>
+          <w:sz w:val="24"/>
+          <w:szCs w:val="24"/>
+        </w:rPr>
+        <w:t>http://educador.brasilescola.uol.com.br/estrategias-ensino/como-usar-o-google-classroom.htm#:~:text=O%20Google%20Classroom%20ou%20a%20Sala%20de,manter%20as%20aulas%20a%20dist%C3%A2ncia%20mais%20organizadas</w:t>
+      </w:r>
+      <w:r>
+        <w:rPr>
+          <w:rFonts w:ascii="Times New Roman" w:hAnsi="Times New Roman" w:cs="Times New Roman"/>
+          <w:b/>
+          <w:sz w:val="24"/>
+          <w:szCs w:val="24"/>
+        </w:rPr>
+        <w:t>.</w:t>
+      </w:r>
+    </w:p>
+    <w:p>
+      <w:pPr>
+        <w:tabs>
+          <w:tab w:val="left" w:pos="2400"/>
+        </w:tabs>
+        <w:spacing w:after="0" w:line="360" w:lineRule="auto"/>
+        <w:ind w:firstLine="709"/>
+        <w:jc w:val="both"/>
+        <w:rPr>
+          <w:rFonts w:ascii="Times New Roman" w:hAnsi="Times New Roman" w:cs="Times New Roman"/>
+          <w:b/>
+          <w:sz w:val="24"/>
+          <w:szCs w:val="24"/>
+        </w:rPr>
+      </w:pPr>
+      <w:r>
+        <w:rPr>
+          <w:rFonts w:ascii="Times New Roman" w:hAnsi="Times New Roman" w:cs="Times New Roman"/>
+          <w:b/>
+          <w:sz w:val="24"/>
+          <w:szCs w:val="24"/>
+        </w:rPr>
+        <w:t>https://ebaconline.com.br/blog/como-usar-o-canva#:~:text=Primeiramente%2C%20o%20que%20%C3%A9%20o%20Canva?%20O,designs%20profissionais%2C%20mesmo%20sem%20experi%C3%AAncia%20na%20%C3%A1rea.</w:t>
+      </w:r>
+    </w:p>
+    <w:p>
+      <w:pPr>
+        <w:tabs>
+          <w:tab w:val="left" w:pos="2400"/>
+        </w:tabs>
+        <w:spacing w:after="0" w:line="360" w:lineRule="auto"/>
+        <w:ind w:firstLine="709"/>
+        <w:jc w:val="both"/>
+        <w:rPr>
+          <w:rFonts w:ascii="Times New Roman" w:hAnsi="Times New Roman" w:cs="Times New Roman"/>
+          <w:b/>
+          <w:sz w:val="24"/>
+          <w:szCs w:val="24"/>
+        </w:rPr>
+      </w:pPr>
+      <w:r>
+        <w:rPr>
+          <w:rFonts w:ascii="Times New Roman" w:hAnsi="Times New Roman" w:cs="Times New Roman"/>
+          <w:b/>
+          <w:sz w:val="24"/>
+          <w:szCs w:val="24"/>
+        </w:rPr>
+        <w:t>https://www.canva.com/pt_b</w:t>
+      </w:r>
       <w:bookmarkStart w:id="9" w:name="_GoBack"/>
       <w:bookmarkEnd w:id="9"/>
+      <w:r>
+        <w:rPr>
+          <w:rFonts w:ascii="Times New Roman" w:hAnsi="Times New Roman" w:cs="Times New Roman"/>
+          <w:b/>
+          <w:sz w:val="24"/>
+          <w:szCs w:val="24"/>
+        </w:rPr>
+        <w:t>r/about/</w:t>
+      </w:r>
+    </w:p>
+    <w:p>
+      <w:pPr>
+        <w:tabs>
+          <w:tab w:val="left" w:pos="2400"/>
+        </w:tabs>
+        <w:spacing w:after="0" w:line="360" w:lineRule="auto"/>
+        <w:ind w:firstLine="709"/>
+        <w:jc w:val="both"/>
+        <w:rPr>
+          <w:rFonts w:ascii="Times New Roman" w:hAnsi="Times New Roman" w:cs="Times New Roman"/>
+          <w:b/>
+          <w:sz w:val="24"/>
+          <w:szCs w:val="24"/>
+        </w:rPr>
+      </w:pPr>
+    </w:p>
+    <w:p>
+      <w:pPr>
+        <w:tabs>
+          <w:tab w:val="left" w:pos="2400"/>
+        </w:tabs>
+        <w:spacing w:after="0" w:line="360" w:lineRule="auto"/>
+        <w:ind w:firstLine="709"/>
+        <w:jc w:val="both"/>
+        <w:rPr>
+          <w:rFonts w:ascii="Times New Roman" w:hAnsi="Times New Roman" w:cs="Times New Roman"/>
+          <w:b/>
+          <w:sz w:val="24"/>
+          <w:szCs w:val="24"/>
+        </w:rPr>
+      </w:pPr>
+    </w:p>
+    <w:p>
+      <w:pPr>
+        <w:tabs>
+          <w:tab w:val="left" w:pos="2400"/>
+        </w:tabs>
+        <w:spacing w:after="0" w:line="360" w:lineRule="auto"/>
+        <w:ind w:firstLine="709"/>
+        <w:jc w:val="both"/>
+        <w:rPr>
+          <w:rFonts w:ascii="Times New Roman" w:hAnsi="Times New Roman" w:cs="Times New Roman"/>
+          <w:b/>
+          <w:sz w:val="24"/>
+          <w:szCs w:val="24"/>
+        </w:rPr>
+      </w:pPr>
     </w:p>
     <w:sectPr>
       <w:headerReference w:type="default" r:id="rId18"/>
@@ -7596,6 +7884,18 @@
       <w:szCs w:val="18"/>
     </w:rPr>
   </w:style>
+  <w:style w:type="character" w:styleId="MenoPendente">
+    <w:name w:val="Unresolved Mention"/>
+    <w:basedOn w:val="Fontepargpadro"/>
+    <w:uiPriority w:val="99"/>
+    <w:semiHidden/>
+    <w:unhideWhenUsed/>
+    <w:rsid w:val="00C714AA"/>
+    <w:rPr>
+      <w:color w:val="605E5C"/>
+      <w:shd w:val="clear" w:color="auto" w:fill="E1DFDD"/>
+    </w:rPr>
+  </w:style>
 </w:styles>
 </file>
 
@@ -7860,7 +8160,7 @@
 </file>
 
 <file path=customXml/itemProps1.xml><?xml version="1.0" encoding="utf-8"?>
-<ds:datastoreItem xmlns:ds="http://schemas.openxmlformats.org/officeDocument/2006/customXml" ds:itemID="{64856A65-86BE-4E6F-9A68-C33DED6798A0}">
+<ds:datastoreItem xmlns:ds="http://schemas.openxmlformats.org/officeDocument/2006/customXml" ds:itemID="{2146CFFC-A51F-4C87-9A65-35843330BBF2}">
   <ds:schemaRefs>
     <ds:schemaRef ds:uri="http://schemas.openxmlformats.org/officeDocument/2006/bibliography"/>
   </ds:schemaRefs>

</xml_diff>

<commit_message>
Feat: adicionando imagens na página Home do site
</commit_message>
<xml_diff>
--- a/documentacao/Documentação do projeto.docx
+++ b/documentacao/Documentação do projeto.docx
@@ -1,6 +1,6 @@
 
 <file path=word/document.xml><?xml version="1.0" encoding="utf-8"?>
-<w:document xmlns:wpc="http://schemas.microsoft.com/office/word/2010/wordprocessingCanvas" xmlns:mc="http://schemas.openxmlformats.org/markup-compatibility/2006" xmlns:o="urn:schemas-microsoft-com:office:office" xmlns:r="http://schemas.openxmlformats.org/officeDocument/2006/relationships" xmlns:m="http://schemas.openxmlformats.org/officeDocument/2006/math" xmlns:v="urn:schemas-microsoft-com:vml" xmlns:wp14="http://schemas.microsoft.com/office/word/2010/wordprocessingDrawing" xmlns:wp="http://schemas.openxmlformats.org/drawingml/2006/wordprocessingDrawing" xmlns:w="http://schemas.openxmlformats.org/wordprocessingml/2006/main" xmlns:w14="http://schemas.microsoft.com/office/word/2010/wordml" xmlns:w10="urn:schemas-microsoft-com:office:word" xmlns:w15="http://schemas.microsoft.com/office/word/2012/wordml" xmlns:wpg="http://schemas.microsoft.com/office/word/2010/wordprocessingGroup" xmlns:wpi="http://schemas.microsoft.com/office/word/2010/wordprocessingInk" xmlns:wne="http://schemas.microsoft.com/office/word/2006/wordml" xmlns:wps="http://schemas.microsoft.com/office/word/2010/wordprocessingShape" xmlns:wpsCustomData="http://www.wps.cn/officeDocument/2013/wpsCustomData" mc:Ignorable="w14 w15 wp14">
+<w:document xmlns:wpc="http://schemas.microsoft.com/office/word/2010/wordprocessingCanvas" xmlns:cx="http://schemas.microsoft.com/office/drawing/2014/chartex" xmlns:cx1="http://schemas.microsoft.com/office/drawing/2015/9/8/chartex" xmlns:cx2="http://schemas.microsoft.com/office/drawing/2015/10/21/chartex" xmlns:cx3="http://schemas.microsoft.com/office/drawing/2016/5/9/chartex" xmlns:cx4="http://schemas.microsoft.com/office/drawing/2016/5/10/chartex" xmlns:cx5="http://schemas.microsoft.com/office/drawing/2016/5/11/chartex" xmlns:cx6="http://schemas.microsoft.com/office/drawing/2016/5/12/chartex" xmlns:cx7="http://schemas.microsoft.com/office/drawing/2016/5/13/chartex" xmlns:cx8="http://schemas.microsoft.com/office/drawing/2016/5/14/chartex" xmlns:mc="http://schemas.openxmlformats.org/markup-compatibility/2006" xmlns:aink="http://schemas.microsoft.com/office/drawing/2016/ink" xmlns:am3d="http://schemas.microsoft.com/office/drawing/2017/model3d" xmlns:o="urn:schemas-microsoft-com:office:office" xmlns:r="http://schemas.openxmlformats.org/officeDocument/2006/relationships" xmlns:m="http://schemas.openxmlformats.org/officeDocument/2006/math" xmlns:v="urn:schemas-microsoft-com:vml" xmlns:wp14="http://schemas.microsoft.com/office/word/2010/wordprocessingDrawing" xmlns:wp="http://schemas.openxmlformats.org/drawingml/2006/wordprocessingDrawing" xmlns:w10="urn:schemas-microsoft-com:office:word" xmlns:w="http://schemas.openxmlformats.org/wordprocessingml/2006/main" xmlns:w14="http://schemas.microsoft.com/office/word/2010/wordml" xmlns:w15="http://schemas.microsoft.com/office/word/2012/wordml" xmlns:w16cid="http://schemas.microsoft.com/office/word/2016/wordml/cid" xmlns:w16se="http://schemas.microsoft.com/office/word/2015/wordml/symex" xmlns:wpg="http://schemas.microsoft.com/office/word/2010/wordprocessingGroup" xmlns:wpi="http://schemas.microsoft.com/office/word/2010/wordprocessingInk" xmlns:wne="http://schemas.microsoft.com/office/word/2006/wordml" xmlns:wps="http://schemas.microsoft.com/office/word/2010/wordprocessingShape" mc:Ignorable="w14 w15 w16se w16cid wp14">
   <w:body>
     <w:p>
       <w:pPr>
@@ -12,6 +12,9 @@
         </w:rPr>
       </w:pPr>
       <w:r>
+        <w:rPr>
+          <w:noProof/>
+        </w:rPr>
         <w:drawing>
           <wp:inline distT="0" distB="0" distL="0" distR="0">
             <wp:extent cx="2827020" cy="1484630"/>
@@ -380,6 +383,7 @@
           <w:sz w:val="28"/>
           <w:szCs w:val="28"/>
         </w:rPr>
+        <w:lastRenderedPageBreak/>
         <w:t>ESCOLA SENAI “José Polizotto”</w:t>
       </w:r>
     </w:p>
@@ -588,13 +592,6 @@
           <w:szCs w:val="24"/>
         </w:rPr>
         <w:tab/>
-      </w:r>
-      <w:r>
-        <w:rPr>
-          <w:rFonts w:ascii="Arial" w:hAnsi="Arial" w:cs="Arial"/>
-          <w:sz w:val="24"/>
-          <w:szCs w:val="24"/>
-        </w:rPr>
         <w:t xml:space="preserve">         Prof. Robson Ramos da Silva</w:t>
       </w:r>
     </w:p>
@@ -822,6 +819,7 @@
           <w:sz w:val="24"/>
           <w:szCs w:val="24"/>
         </w:rPr>
+        <w:lastRenderedPageBreak/>
         <w:t>RESUMO</w:t>
       </w:r>
     </w:p>
@@ -1155,6 +1153,7 @@
           <w:sz w:val="24"/>
           <w:szCs w:val="24"/>
         </w:rPr>
+        <w:lastRenderedPageBreak/>
         <w:t>ABSTRACT</w:t>
       </w:r>
     </w:p>
@@ -1341,140 +1340,187 @@
         </w:rPr>
         <w:t xml:space="preserve">Keywords: </w:t>
       </w:r>
-      <w:r>
-        <w:rPr>
-          <w:rFonts w:ascii="Times New Roman" w:hAnsi="Times New Roman" w:cs="Times New Roman"/>
-          <w:sz w:val="24"/>
-          <w:szCs w:val="24"/>
-        </w:rPr>
-        <w:t>Preparation of sumaries. Methodology.</w:t>
-      </w:r>
-    </w:p>
-    <w:p>
-      <w:pPr>
-        <w:spacing w:after="0" w:line="360" w:lineRule="auto"/>
-        <w:rPr>
-          <w:rFonts w:ascii="Times New Roman" w:hAnsi="Times New Roman" w:cs="Times New Roman"/>
-          <w:sz w:val="24"/>
-          <w:szCs w:val="24"/>
-        </w:rPr>
-      </w:pPr>
-    </w:p>
-    <w:p>
-      <w:pPr>
-        <w:spacing w:after="0" w:line="360" w:lineRule="auto"/>
-        <w:rPr>
-          <w:rFonts w:ascii="Times New Roman" w:hAnsi="Times New Roman" w:cs="Times New Roman"/>
-          <w:sz w:val="24"/>
-          <w:szCs w:val="24"/>
-        </w:rPr>
-      </w:pPr>
-    </w:p>
-    <w:p>
-      <w:pPr>
-        <w:spacing w:after="0" w:line="360" w:lineRule="auto"/>
-        <w:rPr>
-          <w:rFonts w:ascii="Times New Roman" w:hAnsi="Times New Roman" w:cs="Times New Roman"/>
-          <w:sz w:val="24"/>
-          <w:szCs w:val="24"/>
-        </w:rPr>
-      </w:pPr>
-    </w:p>
-    <w:p>
-      <w:pPr>
-        <w:spacing w:after="0" w:line="360" w:lineRule="auto"/>
-        <w:rPr>
-          <w:rFonts w:ascii="Times New Roman" w:hAnsi="Times New Roman" w:cs="Times New Roman"/>
-          <w:sz w:val="24"/>
-          <w:szCs w:val="24"/>
-        </w:rPr>
-      </w:pPr>
-    </w:p>
-    <w:p>
-      <w:pPr>
-        <w:spacing w:after="0" w:line="360" w:lineRule="auto"/>
-        <w:rPr>
-          <w:rFonts w:ascii="Times New Roman" w:hAnsi="Times New Roman" w:cs="Times New Roman"/>
-          <w:sz w:val="24"/>
-          <w:szCs w:val="24"/>
-        </w:rPr>
-      </w:pPr>
-    </w:p>
-    <w:p>
-      <w:pPr>
-        <w:spacing w:after="0" w:line="360" w:lineRule="auto"/>
-        <w:rPr>
-          <w:rFonts w:ascii="Times New Roman" w:hAnsi="Times New Roman" w:cs="Times New Roman"/>
-          <w:sz w:val="24"/>
-          <w:szCs w:val="24"/>
-        </w:rPr>
-      </w:pPr>
-    </w:p>
-    <w:p>
-      <w:pPr>
-        <w:spacing w:after="0" w:line="360" w:lineRule="auto"/>
-        <w:rPr>
-          <w:rFonts w:ascii="Times New Roman" w:hAnsi="Times New Roman" w:cs="Times New Roman"/>
-          <w:sz w:val="24"/>
-          <w:szCs w:val="24"/>
-        </w:rPr>
-      </w:pPr>
-    </w:p>
-    <w:p>
-      <w:pPr>
-        <w:spacing w:after="0" w:line="360" w:lineRule="auto"/>
-        <w:rPr>
-          <w:rFonts w:ascii="Times New Roman" w:hAnsi="Times New Roman" w:cs="Times New Roman"/>
-          <w:sz w:val="24"/>
-          <w:szCs w:val="24"/>
-        </w:rPr>
-      </w:pPr>
-    </w:p>
-    <w:p>
-      <w:pPr>
-        <w:spacing w:after="0" w:line="360" w:lineRule="auto"/>
-        <w:rPr>
-          <w:rFonts w:ascii="Times New Roman" w:hAnsi="Times New Roman" w:cs="Times New Roman"/>
-          <w:sz w:val="24"/>
-          <w:szCs w:val="24"/>
-        </w:rPr>
-      </w:pPr>
-    </w:p>
-    <w:p>
-      <w:pPr>
-        <w:spacing w:after="0" w:line="360" w:lineRule="auto"/>
-        <w:rPr>
-          <w:rFonts w:ascii="Times New Roman" w:hAnsi="Times New Roman" w:cs="Times New Roman"/>
-          <w:sz w:val="24"/>
-          <w:szCs w:val="24"/>
-        </w:rPr>
-      </w:pPr>
-    </w:p>
-    <w:p>
-      <w:pPr>
-        <w:spacing w:after="0" w:line="360" w:lineRule="auto"/>
-        <w:jc w:val="center"/>
-        <w:rPr>
-          <w:rFonts w:ascii="Times New Roman" w:hAnsi="Times New Roman" w:cs="Times New Roman"/>
-          <w:b/>
-          <w:sz w:val="24"/>
-          <w:szCs w:val="24"/>
-        </w:rPr>
-      </w:pPr>
-      <w:r>
-        <w:rPr>
-          <w:rFonts w:ascii="Times New Roman" w:hAnsi="Times New Roman" w:cs="Times New Roman"/>
-          <w:b/>
-          <w:sz w:val="24"/>
-          <w:szCs w:val="24"/>
-        </w:rPr>
+      <w:proofErr w:type="spellStart"/>
+      <w:r>
+        <w:rPr>
+          <w:rFonts w:ascii="Times New Roman" w:hAnsi="Times New Roman" w:cs="Times New Roman"/>
+          <w:sz w:val="24"/>
+          <w:szCs w:val="24"/>
+        </w:rPr>
+        <w:t>Preparation</w:t>
+      </w:r>
+      <w:proofErr w:type="spellEnd"/>
+      <w:r>
+        <w:rPr>
+          <w:rFonts w:ascii="Times New Roman" w:hAnsi="Times New Roman" w:cs="Times New Roman"/>
+          <w:sz w:val="24"/>
+          <w:szCs w:val="24"/>
+        </w:rPr>
+        <w:t xml:space="preserve"> </w:t>
+      </w:r>
+      <w:proofErr w:type="spellStart"/>
+      <w:r>
+        <w:rPr>
+          <w:rFonts w:ascii="Times New Roman" w:hAnsi="Times New Roman" w:cs="Times New Roman"/>
+          <w:sz w:val="24"/>
+          <w:szCs w:val="24"/>
+        </w:rPr>
+        <w:t>of</w:t>
+      </w:r>
+      <w:proofErr w:type="spellEnd"/>
+      <w:r>
+        <w:rPr>
+          <w:rFonts w:ascii="Times New Roman" w:hAnsi="Times New Roman" w:cs="Times New Roman"/>
+          <w:sz w:val="24"/>
+          <w:szCs w:val="24"/>
+        </w:rPr>
+        <w:t xml:space="preserve"> sumaries. </w:t>
+      </w:r>
+      <w:proofErr w:type="spellStart"/>
+      <w:r>
+        <w:rPr>
+          <w:rFonts w:ascii="Times New Roman" w:hAnsi="Times New Roman" w:cs="Times New Roman"/>
+          <w:sz w:val="24"/>
+          <w:szCs w:val="24"/>
+        </w:rPr>
+        <w:t>Methodology</w:t>
+      </w:r>
+      <w:proofErr w:type="spellEnd"/>
+      <w:r>
+        <w:rPr>
+          <w:rFonts w:ascii="Times New Roman" w:hAnsi="Times New Roman" w:cs="Times New Roman"/>
+          <w:sz w:val="24"/>
+          <w:szCs w:val="24"/>
+        </w:rPr>
+        <w:t>.</w:t>
+      </w:r>
+    </w:p>
+    <w:p>
+      <w:pPr>
+        <w:spacing w:after="0" w:line="360" w:lineRule="auto"/>
+        <w:rPr>
+          <w:rFonts w:ascii="Times New Roman" w:hAnsi="Times New Roman" w:cs="Times New Roman"/>
+          <w:sz w:val="24"/>
+          <w:szCs w:val="24"/>
+        </w:rPr>
+      </w:pPr>
+    </w:p>
+    <w:p>
+      <w:pPr>
+        <w:spacing w:after="0" w:line="360" w:lineRule="auto"/>
+        <w:rPr>
+          <w:rFonts w:ascii="Times New Roman" w:hAnsi="Times New Roman" w:cs="Times New Roman"/>
+          <w:sz w:val="24"/>
+          <w:szCs w:val="24"/>
+        </w:rPr>
+      </w:pPr>
+    </w:p>
+    <w:p>
+      <w:pPr>
+        <w:spacing w:after="0" w:line="360" w:lineRule="auto"/>
+        <w:rPr>
+          <w:rFonts w:ascii="Times New Roman" w:hAnsi="Times New Roman" w:cs="Times New Roman"/>
+          <w:sz w:val="24"/>
+          <w:szCs w:val="24"/>
+        </w:rPr>
+      </w:pPr>
+    </w:p>
+    <w:p>
+      <w:pPr>
+        <w:spacing w:after="0" w:line="360" w:lineRule="auto"/>
+        <w:rPr>
+          <w:rFonts w:ascii="Times New Roman" w:hAnsi="Times New Roman" w:cs="Times New Roman"/>
+          <w:sz w:val="24"/>
+          <w:szCs w:val="24"/>
+        </w:rPr>
+      </w:pPr>
+    </w:p>
+    <w:p>
+      <w:pPr>
+        <w:spacing w:after="0" w:line="360" w:lineRule="auto"/>
+        <w:rPr>
+          <w:rFonts w:ascii="Times New Roman" w:hAnsi="Times New Roman" w:cs="Times New Roman"/>
+          <w:sz w:val="24"/>
+          <w:szCs w:val="24"/>
+        </w:rPr>
+      </w:pPr>
+    </w:p>
+    <w:p>
+      <w:pPr>
+        <w:spacing w:after="0" w:line="360" w:lineRule="auto"/>
+        <w:rPr>
+          <w:rFonts w:ascii="Times New Roman" w:hAnsi="Times New Roman" w:cs="Times New Roman"/>
+          <w:sz w:val="24"/>
+          <w:szCs w:val="24"/>
+        </w:rPr>
+      </w:pPr>
+    </w:p>
+    <w:p>
+      <w:pPr>
+        <w:spacing w:after="0" w:line="360" w:lineRule="auto"/>
+        <w:rPr>
+          <w:rFonts w:ascii="Times New Roman" w:hAnsi="Times New Roman" w:cs="Times New Roman"/>
+          <w:sz w:val="24"/>
+          <w:szCs w:val="24"/>
+        </w:rPr>
+      </w:pPr>
+    </w:p>
+    <w:p>
+      <w:pPr>
+        <w:spacing w:after="0" w:line="360" w:lineRule="auto"/>
+        <w:rPr>
+          <w:rFonts w:ascii="Times New Roman" w:hAnsi="Times New Roman" w:cs="Times New Roman"/>
+          <w:sz w:val="24"/>
+          <w:szCs w:val="24"/>
+        </w:rPr>
+      </w:pPr>
+    </w:p>
+    <w:p>
+      <w:pPr>
+        <w:spacing w:after="0" w:line="360" w:lineRule="auto"/>
+        <w:rPr>
+          <w:rFonts w:ascii="Times New Roman" w:hAnsi="Times New Roman" w:cs="Times New Roman"/>
+          <w:sz w:val="24"/>
+          <w:szCs w:val="24"/>
+        </w:rPr>
+      </w:pPr>
+    </w:p>
+    <w:p>
+      <w:pPr>
+        <w:spacing w:after="0" w:line="360" w:lineRule="auto"/>
+        <w:rPr>
+          <w:rFonts w:ascii="Times New Roman" w:hAnsi="Times New Roman" w:cs="Times New Roman"/>
+          <w:sz w:val="24"/>
+          <w:szCs w:val="24"/>
+        </w:rPr>
+      </w:pPr>
+    </w:p>
+    <w:p>
+      <w:pPr>
+        <w:spacing w:after="0" w:line="360" w:lineRule="auto"/>
+        <w:jc w:val="center"/>
+        <w:rPr>
+          <w:rFonts w:ascii="Times New Roman" w:hAnsi="Times New Roman" w:cs="Times New Roman"/>
+          <w:b/>
+          <w:sz w:val="24"/>
+          <w:szCs w:val="24"/>
+        </w:rPr>
+      </w:pPr>
+      <w:r>
+        <w:rPr>
+          <w:rFonts w:ascii="Times New Roman" w:hAnsi="Times New Roman" w:cs="Times New Roman"/>
+          <w:b/>
+          <w:sz w:val="24"/>
+          <w:szCs w:val="24"/>
+        </w:rPr>
+        <w:lastRenderedPageBreak/>
         <w:t>SUMÁRIO</w:t>
       </w:r>
     </w:p>
     <w:sdt>
       <w:sdtPr>
         <w:rPr>
-          <w:rFonts w:asciiTheme="minorHAnsi" w:hAnsiTheme="minorHAnsi" w:eastAsiaTheme="minorHAnsi" w:cstheme="minorBidi"/>
+          <w:rFonts w:asciiTheme="minorHAnsi" w:eastAsiaTheme="minorHAnsi" w:hAnsiTheme="minorHAnsi" w:cstheme="minorBidi"/>
           <w:color w:val="auto"/>
           <w:sz w:val="22"/>
           <w:szCs w:val="22"/>
@@ -1488,24 +1534,19 @@
       </w:sdtPr>
       <w:sdtEndPr>
         <w:rPr>
-          <w:rFonts w:asciiTheme="minorHAnsi" w:hAnsiTheme="minorHAnsi" w:eastAsiaTheme="minorHAnsi" w:cstheme="minorBidi"/>
           <w:b/>
           <w:bCs/>
-          <w:color w:val="auto"/>
-          <w:sz w:val="22"/>
-          <w:szCs w:val="22"/>
-          <w:lang w:eastAsia="en-US"/>
         </w:rPr>
       </w:sdtEndPr>
       <w:sdtContent>
         <w:p>
           <w:pPr>
-            <w:pStyle w:val="18"/>
+            <w:pStyle w:val="CabealhodoSumrio1"/>
           </w:pPr>
         </w:p>
         <w:p>
           <w:pPr>
-            <w:pStyle w:val="14"/>
+            <w:pStyle w:val="Sumrio1"/>
             <w:tabs>
               <w:tab w:val="right" w:leader="dot" w:pos="8494"/>
             </w:tabs>
@@ -1523,48 +1564,38 @@
           <w:r>
             <w:fldChar w:fldCharType="separate"/>
           </w:r>
-          <w:r>
-            <w:fldChar w:fldCharType="begin"/>
-          </w:r>
-          <w:r>
-            <w:instrText xml:space="preserve"> HYPERLINK \l "_Toc205989568" </w:instrText>
-          </w:r>
-          <w:r>
-            <w:fldChar w:fldCharType="separate"/>
-          </w:r>
-          <w:r>
-            <w:rPr>
-              <w:rStyle w:val="7"/>
-              <w:rFonts w:ascii="Times New Roman" w:hAnsi="Times New Roman" w:cs="Times New Roman"/>
-              <w:b/>
-            </w:rPr>
-            <w:t>1 INTRODUÇÃO</w:t>
-          </w:r>
-          <w:r>
-            <w:tab/>
-          </w:r>
-          <w:r>
-            <w:fldChar w:fldCharType="begin"/>
-          </w:r>
-          <w:r>
-            <w:instrText xml:space="preserve"> PAGEREF _Toc205989568 \h </w:instrText>
-          </w:r>
-          <w:r>
-            <w:fldChar w:fldCharType="separate"/>
-          </w:r>
-          <w:r>
-            <w:t>5</w:t>
-          </w:r>
-          <w:r>
-            <w:fldChar w:fldCharType="end"/>
-          </w:r>
-          <w:r>
-            <w:fldChar w:fldCharType="end"/>
-          </w:r>
+          <w:hyperlink w:anchor="_Toc205989568" w:history="1">
+            <w:r>
+              <w:rPr>
+                <w:rStyle w:val="Hyperlink"/>
+                <w:rFonts w:ascii="Times New Roman" w:hAnsi="Times New Roman" w:cs="Times New Roman"/>
+                <w:b/>
+              </w:rPr>
+              <w:t>1 INTRODUÇÃO</w:t>
+            </w:r>
+            <w:r>
+              <w:tab/>
+            </w:r>
+            <w:r>
+              <w:fldChar w:fldCharType="begin"/>
+            </w:r>
+            <w:r>
+              <w:instrText xml:space="preserve"> PAGEREF _Toc205989568 \h </w:instrText>
+            </w:r>
+            <w:r>
+              <w:fldChar w:fldCharType="separate"/>
+            </w:r>
+            <w:r>
+              <w:t>5</w:t>
+            </w:r>
+            <w:r>
+              <w:fldChar w:fldCharType="end"/>
+            </w:r>
+          </w:hyperlink>
         </w:p>
         <w:p>
           <w:pPr>
-            <w:pStyle w:val="14"/>
+            <w:pStyle w:val="Sumrio1"/>
             <w:tabs>
               <w:tab w:val="right" w:leader="dot" w:pos="8494"/>
             </w:tabs>
@@ -1573,48 +1604,38 @@
               <w:lang w:eastAsia="pt-BR"/>
             </w:rPr>
           </w:pPr>
-          <w:r>
-            <w:fldChar w:fldCharType="begin"/>
-          </w:r>
-          <w:r>
-            <w:instrText xml:space="preserve"> HYPERLINK \l "_Toc205989569" </w:instrText>
-          </w:r>
-          <w:r>
-            <w:fldChar w:fldCharType="separate"/>
-          </w:r>
-          <w:r>
-            <w:rPr>
-              <w:rStyle w:val="7"/>
-              <w:rFonts w:ascii="Times New Roman" w:hAnsi="Times New Roman" w:cs="Times New Roman"/>
-              <w:b/>
-            </w:rPr>
-            <w:t>2 DESENVOLVIMENTO</w:t>
-          </w:r>
-          <w:r>
-            <w:tab/>
-          </w:r>
-          <w:r>
-            <w:fldChar w:fldCharType="begin"/>
-          </w:r>
-          <w:r>
-            <w:instrText xml:space="preserve"> PAGEREF _Toc205989569 \h </w:instrText>
-          </w:r>
-          <w:r>
-            <w:fldChar w:fldCharType="separate"/>
-          </w:r>
-          <w:r>
-            <w:t>6</w:t>
-          </w:r>
-          <w:r>
-            <w:fldChar w:fldCharType="end"/>
-          </w:r>
-          <w:r>
-            <w:fldChar w:fldCharType="end"/>
-          </w:r>
+          <w:hyperlink w:anchor="_Toc205989569" w:history="1">
+            <w:r>
+              <w:rPr>
+                <w:rStyle w:val="Hyperlink"/>
+                <w:rFonts w:ascii="Times New Roman" w:hAnsi="Times New Roman" w:cs="Times New Roman"/>
+                <w:b/>
+              </w:rPr>
+              <w:t>2 DESENVOLVIMENTO</w:t>
+            </w:r>
+            <w:r>
+              <w:tab/>
+            </w:r>
+            <w:r>
+              <w:fldChar w:fldCharType="begin"/>
+            </w:r>
+            <w:r>
+              <w:instrText xml:space="preserve"> PAGEREF _Toc205989569 \h </w:instrText>
+            </w:r>
+            <w:r>
+              <w:fldChar w:fldCharType="separate"/>
+            </w:r>
+            <w:r>
+              <w:t>6</w:t>
+            </w:r>
+            <w:r>
+              <w:fldChar w:fldCharType="end"/>
+            </w:r>
+          </w:hyperlink>
         </w:p>
         <w:p>
           <w:pPr>
-            <w:pStyle w:val="8"/>
+            <w:pStyle w:val="Sumrio2"/>
             <w:tabs>
               <w:tab w:val="right" w:leader="dot" w:pos="8494"/>
             </w:tabs>
@@ -1623,48 +1644,38 @@
               <w:lang w:eastAsia="pt-BR"/>
             </w:rPr>
           </w:pPr>
-          <w:r>
-            <w:fldChar w:fldCharType="begin"/>
-          </w:r>
-          <w:r>
-            <w:instrText xml:space="preserve"> HYPERLINK \l "_Toc205989570" </w:instrText>
-          </w:r>
-          <w:r>
-            <w:fldChar w:fldCharType="separate"/>
-          </w:r>
-          <w:r>
-            <w:rPr>
-              <w:rStyle w:val="7"/>
-              <w:rFonts w:ascii="Times New Roman" w:hAnsi="Times New Roman" w:cs="Times New Roman"/>
-              <w:b/>
-            </w:rPr>
-            <w:t>2.1 Objetivo geral</w:t>
-          </w:r>
-          <w:r>
-            <w:tab/>
-          </w:r>
-          <w:r>
-            <w:fldChar w:fldCharType="begin"/>
-          </w:r>
-          <w:r>
-            <w:instrText xml:space="preserve"> PAGEREF _Toc205989570 \h </w:instrText>
-          </w:r>
-          <w:r>
-            <w:fldChar w:fldCharType="separate"/>
-          </w:r>
-          <w:r>
-            <w:t>7</w:t>
-          </w:r>
-          <w:r>
-            <w:fldChar w:fldCharType="end"/>
-          </w:r>
-          <w:r>
-            <w:fldChar w:fldCharType="end"/>
-          </w:r>
+          <w:hyperlink w:anchor="_Toc205989570" w:history="1">
+            <w:r>
+              <w:rPr>
+                <w:rStyle w:val="Hyperlink"/>
+                <w:rFonts w:ascii="Times New Roman" w:hAnsi="Times New Roman" w:cs="Times New Roman"/>
+                <w:b/>
+              </w:rPr>
+              <w:t>2.1 Objetivo geral</w:t>
+            </w:r>
+            <w:r>
+              <w:tab/>
+            </w:r>
+            <w:r>
+              <w:fldChar w:fldCharType="begin"/>
+            </w:r>
+            <w:r>
+              <w:instrText xml:space="preserve"> PAGEREF _Toc205989570 \h </w:instrText>
+            </w:r>
+            <w:r>
+              <w:fldChar w:fldCharType="separate"/>
+            </w:r>
+            <w:r>
+              <w:t>7</w:t>
+            </w:r>
+            <w:r>
+              <w:fldChar w:fldCharType="end"/>
+            </w:r>
+          </w:hyperlink>
         </w:p>
         <w:p>
           <w:pPr>
-            <w:pStyle w:val="8"/>
+            <w:pStyle w:val="Sumrio2"/>
             <w:tabs>
               <w:tab w:val="right" w:leader="dot" w:pos="8494"/>
             </w:tabs>
@@ -1673,48 +1684,38 @@
               <w:lang w:eastAsia="pt-BR"/>
             </w:rPr>
           </w:pPr>
-          <w:r>
-            <w:fldChar w:fldCharType="begin"/>
-          </w:r>
-          <w:r>
-            <w:instrText xml:space="preserve"> HYPERLINK \l "_Toc205989571" </w:instrText>
-          </w:r>
-          <w:r>
-            <w:fldChar w:fldCharType="separate"/>
-          </w:r>
-          <w:r>
-            <w:rPr>
-              <w:rStyle w:val="7"/>
-              <w:rFonts w:ascii="Times New Roman" w:hAnsi="Times New Roman" w:cs="Times New Roman"/>
-              <w:b/>
-            </w:rPr>
-            <w:t>2.2 Objetivos específicos</w:t>
-          </w:r>
-          <w:r>
-            <w:tab/>
-          </w:r>
-          <w:r>
-            <w:fldChar w:fldCharType="begin"/>
-          </w:r>
-          <w:r>
-            <w:instrText xml:space="preserve"> PAGEREF _Toc205989571 \h </w:instrText>
-          </w:r>
-          <w:r>
-            <w:fldChar w:fldCharType="separate"/>
-          </w:r>
-          <w:r>
-            <w:t>7</w:t>
-          </w:r>
-          <w:r>
-            <w:fldChar w:fldCharType="end"/>
-          </w:r>
-          <w:r>
-            <w:fldChar w:fldCharType="end"/>
-          </w:r>
+          <w:hyperlink w:anchor="_Toc205989571" w:history="1">
+            <w:r>
+              <w:rPr>
+                <w:rStyle w:val="Hyperlink"/>
+                <w:rFonts w:ascii="Times New Roman" w:hAnsi="Times New Roman" w:cs="Times New Roman"/>
+                <w:b/>
+              </w:rPr>
+              <w:t>2.2 Objetivos específicos</w:t>
+            </w:r>
+            <w:r>
+              <w:tab/>
+            </w:r>
+            <w:r>
+              <w:fldChar w:fldCharType="begin"/>
+            </w:r>
+            <w:r>
+              <w:instrText xml:space="preserve"> PAGEREF _Toc205989571 \h </w:instrText>
+            </w:r>
+            <w:r>
+              <w:fldChar w:fldCharType="separate"/>
+            </w:r>
+            <w:r>
+              <w:t>7</w:t>
+            </w:r>
+            <w:r>
+              <w:fldChar w:fldCharType="end"/>
+            </w:r>
+          </w:hyperlink>
         </w:p>
         <w:p>
           <w:pPr>
-            <w:pStyle w:val="14"/>
+            <w:pStyle w:val="Sumrio1"/>
             <w:tabs>
               <w:tab w:val="right" w:leader="dot" w:pos="8494"/>
             </w:tabs>
@@ -1723,48 +1724,38 @@
               <w:lang w:eastAsia="pt-BR"/>
             </w:rPr>
           </w:pPr>
-          <w:r>
-            <w:fldChar w:fldCharType="begin"/>
-          </w:r>
-          <w:r>
-            <w:instrText xml:space="preserve"> HYPERLINK \l "_Toc205989572" </w:instrText>
-          </w:r>
-          <w:r>
-            <w:fldChar w:fldCharType="separate"/>
-          </w:r>
-          <w:r>
-            <w:rPr>
-              <w:rStyle w:val="7"/>
-              <w:rFonts w:ascii="Times New Roman" w:hAnsi="Times New Roman" w:cs="Times New Roman"/>
-              <w:b/>
-            </w:rPr>
-            <w:t>3 METODOLOGIA OU PROCEDIMENTOS METODOLÓGICOS</w:t>
-          </w:r>
-          <w:r>
-            <w:tab/>
-          </w:r>
-          <w:r>
-            <w:fldChar w:fldCharType="begin"/>
-          </w:r>
-          <w:r>
-            <w:instrText xml:space="preserve"> PAGEREF _Toc205989572 \h </w:instrText>
-          </w:r>
-          <w:r>
-            <w:fldChar w:fldCharType="separate"/>
-          </w:r>
-          <w:r>
-            <w:t>7</w:t>
-          </w:r>
-          <w:r>
-            <w:fldChar w:fldCharType="end"/>
-          </w:r>
-          <w:r>
-            <w:fldChar w:fldCharType="end"/>
-          </w:r>
+          <w:hyperlink w:anchor="_Toc205989572" w:history="1">
+            <w:r>
+              <w:rPr>
+                <w:rStyle w:val="Hyperlink"/>
+                <w:rFonts w:ascii="Times New Roman" w:hAnsi="Times New Roman" w:cs="Times New Roman"/>
+                <w:b/>
+              </w:rPr>
+              <w:t>3 METODOLOGIA OU PROCEDIMENTOS METODOLÓGICOS</w:t>
+            </w:r>
+            <w:r>
+              <w:tab/>
+            </w:r>
+            <w:r>
+              <w:fldChar w:fldCharType="begin"/>
+            </w:r>
+            <w:r>
+              <w:instrText xml:space="preserve"> PAGEREF _Toc205989572 \h </w:instrText>
+            </w:r>
+            <w:r>
+              <w:fldChar w:fldCharType="separate"/>
+            </w:r>
+            <w:r>
+              <w:t>7</w:t>
+            </w:r>
+            <w:r>
+              <w:fldChar w:fldCharType="end"/>
+            </w:r>
+          </w:hyperlink>
         </w:p>
         <w:p>
           <w:pPr>
-            <w:pStyle w:val="14"/>
+            <w:pStyle w:val="Sumrio1"/>
             <w:tabs>
               <w:tab w:val="right" w:leader="dot" w:pos="8494"/>
             </w:tabs>
@@ -1773,48 +1764,38 @@
               <w:lang w:eastAsia="pt-BR"/>
             </w:rPr>
           </w:pPr>
-          <w:r>
-            <w:fldChar w:fldCharType="begin"/>
-          </w:r>
-          <w:r>
-            <w:instrText xml:space="preserve"> HYPERLINK \l "_Toc205989573" </w:instrText>
-          </w:r>
-          <w:r>
-            <w:fldChar w:fldCharType="separate"/>
-          </w:r>
-          <w:r>
-            <w:rPr>
-              <w:rStyle w:val="7"/>
-              <w:rFonts w:ascii="Times New Roman" w:hAnsi="Times New Roman" w:cs="Times New Roman"/>
-              <w:b/>
-            </w:rPr>
-            <w:t>4 MÉTODOS</w:t>
-          </w:r>
-          <w:r>
-            <w:tab/>
-          </w:r>
-          <w:r>
-            <w:fldChar w:fldCharType="begin"/>
-          </w:r>
-          <w:r>
-            <w:instrText xml:space="preserve"> PAGEREF _Toc205989573 \h </w:instrText>
-          </w:r>
-          <w:r>
-            <w:fldChar w:fldCharType="separate"/>
-          </w:r>
-          <w:r>
-            <w:t>8</w:t>
-          </w:r>
-          <w:r>
-            <w:fldChar w:fldCharType="end"/>
-          </w:r>
-          <w:r>
-            <w:fldChar w:fldCharType="end"/>
-          </w:r>
+          <w:hyperlink w:anchor="_Toc205989573" w:history="1">
+            <w:r>
+              <w:rPr>
+                <w:rStyle w:val="Hyperlink"/>
+                <w:rFonts w:ascii="Times New Roman" w:hAnsi="Times New Roman" w:cs="Times New Roman"/>
+                <w:b/>
+              </w:rPr>
+              <w:t>4 MÉTODOS</w:t>
+            </w:r>
+            <w:r>
+              <w:tab/>
+            </w:r>
+            <w:r>
+              <w:fldChar w:fldCharType="begin"/>
+            </w:r>
+            <w:r>
+              <w:instrText xml:space="preserve"> PAGEREF _Toc205989573 \h </w:instrText>
+            </w:r>
+            <w:r>
+              <w:fldChar w:fldCharType="separate"/>
+            </w:r>
+            <w:r>
+              <w:t>8</w:t>
+            </w:r>
+            <w:r>
+              <w:fldChar w:fldCharType="end"/>
+            </w:r>
+          </w:hyperlink>
         </w:p>
         <w:p>
           <w:pPr>
-            <w:pStyle w:val="14"/>
+            <w:pStyle w:val="Sumrio1"/>
             <w:tabs>
               <w:tab w:val="right" w:leader="dot" w:pos="8494"/>
             </w:tabs>
@@ -1823,48 +1804,38 @@
               <w:lang w:eastAsia="pt-BR"/>
             </w:rPr>
           </w:pPr>
-          <w:r>
-            <w:fldChar w:fldCharType="begin"/>
-          </w:r>
-          <w:r>
-            <w:instrText xml:space="preserve"> HYPERLINK \l "_Toc205989574" </w:instrText>
-          </w:r>
-          <w:r>
-            <w:fldChar w:fldCharType="separate"/>
-          </w:r>
-          <w:r>
-            <w:rPr>
-              <w:rStyle w:val="7"/>
-              <w:rFonts w:ascii="Times New Roman" w:hAnsi="Times New Roman" w:cs="Times New Roman"/>
-              <w:b/>
-            </w:rPr>
-            <w:t>5 APRESENTAÇÃO E ANALISE DOS RESULTADOS</w:t>
-          </w:r>
-          <w:r>
-            <w:tab/>
-          </w:r>
-          <w:r>
-            <w:fldChar w:fldCharType="begin"/>
-          </w:r>
-          <w:r>
-            <w:instrText xml:space="preserve"> PAGEREF _Toc205989574 \h </w:instrText>
-          </w:r>
-          <w:r>
-            <w:fldChar w:fldCharType="separate"/>
-          </w:r>
-          <w:r>
-            <w:t>9</w:t>
-          </w:r>
-          <w:r>
-            <w:fldChar w:fldCharType="end"/>
-          </w:r>
-          <w:r>
-            <w:fldChar w:fldCharType="end"/>
-          </w:r>
+          <w:hyperlink w:anchor="_Toc205989574" w:history="1">
+            <w:r>
+              <w:rPr>
+                <w:rStyle w:val="Hyperlink"/>
+                <w:rFonts w:ascii="Times New Roman" w:hAnsi="Times New Roman" w:cs="Times New Roman"/>
+                <w:b/>
+              </w:rPr>
+              <w:t>5 APRESENTAÇÃO E ANALISE DOS RESULTADOS</w:t>
+            </w:r>
+            <w:r>
+              <w:tab/>
+            </w:r>
+            <w:r>
+              <w:fldChar w:fldCharType="begin"/>
+            </w:r>
+            <w:r>
+              <w:instrText xml:space="preserve"> PAGEREF _Toc205989574 \h </w:instrText>
+            </w:r>
+            <w:r>
+              <w:fldChar w:fldCharType="separate"/>
+            </w:r>
+            <w:r>
+              <w:t>9</w:t>
+            </w:r>
+            <w:r>
+              <w:fldChar w:fldCharType="end"/>
+            </w:r>
+          </w:hyperlink>
         </w:p>
         <w:p>
           <w:pPr>
-            <w:pStyle w:val="14"/>
+            <w:pStyle w:val="Sumrio1"/>
             <w:tabs>
               <w:tab w:val="right" w:leader="dot" w:pos="8494"/>
             </w:tabs>
@@ -1873,48 +1844,38 @@
               <w:lang w:eastAsia="pt-BR"/>
             </w:rPr>
           </w:pPr>
-          <w:r>
-            <w:fldChar w:fldCharType="begin"/>
-          </w:r>
-          <w:r>
-            <w:instrText xml:space="preserve"> HYPERLINK \l "_Toc205989575" </w:instrText>
-          </w:r>
-          <w:r>
-            <w:fldChar w:fldCharType="separate"/>
-          </w:r>
-          <w:r>
-            <w:rPr>
-              <w:rStyle w:val="7"/>
-              <w:rFonts w:ascii="Times New Roman" w:hAnsi="Times New Roman" w:cs="Times New Roman"/>
-              <w:b/>
-            </w:rPr>
-            <w:t>6 CONCLUSÃO</w:t>
-          </w:r>
-          <w:r>
-            <w:tab/>
-          </w:r>
-          <w:r>
-            <w:fldChar w:fldCharType="begin"/>
-          </w:r>
-          <w:r>
-            <w:instrText xml:space="preserve"> PAGEREF _Toc205989575 \h </w:instrText>
-          </w:r>
-          <w:r>
-            <w:fldChar w:fldCharType="separate"/>
-          </w:r>
-          <w:r>
-            <w:t>10</w:t>
-          </w:r>
-          <w:r>
-            <w:fldChar w:fldCharType="end"/>
-          </w:r>
-          <w:r>
-            <w:fldChar w:fldCharType="end"/>
-          </w:r>
+          <w:hyperlink w:anchor="_Toc205989575" w:history="1">
+            <w:r>
+              <w:rPr>
+                <w:rStyle w:val="Hyperlink"/>
+                <w:rFonts w:ascii="Times New Roman" w:hAnsi="Times New Roman" w:cs="Times New Roman"/>
+                <w:b/>
+              </w:rPr>
+              <w:t>6 CONCLUSÃO</w:t>
+            </w:r>
+            <w:r>
+              <w:tab/>
+            </w:r>
+            <w:r>
+              <w:fldChar w:fldCharType="begin"/>
+            </w:r>
+            <w:r>
+              <w:instrText xml:space="preserve"> PAGEREF _Toc205989575 \h </w:instrText>
+            </w:r>
+            <w:r>
+              <w:fldChar w:fldCharType="separate"/>
+            </w:r>
+            <w:r>
+              <w:t>10</w:t>
+            </w:r>
+            <w:r>
+              <w:fldChar w:fldCharType="end"/>
+            </w:r>
+          </w:hyperlink>
         </w:p>
         <w:p>
           <w:pPr>
-            <w:pStyle w:val="14"/>
+            <w:pStyle w:val="Sumrio1"/>
             <w:tabs>
               <w:tab w:val="right" w:leader="dot" w:pos="8494"/>
             </w:tabs>
@@ -1923,44 +1884,34 @@
               <w:lang w:eastAsia="pt-BR"/>
             </w:rPr>
           </w:pPr>
-          <w:r>
-            <w:fldChar w:fldCharType="begin"/>
-          </w:r>
-          <w:r>
-            <w:instrText xml:space="preserve"> HYPERLINK \l "_Toc205989576" </w:instrText>
-          </w:r>
-          <w:r>
-            <w:fldChar w:fldCharType="separate"/>
-          </w:r>
-          <w:r>
-            <w:rPr>
-              <w:rStyle w:val="7"/>
-              <w:rFonts w:ascii="Times New Roman" w:hAnsi="Times New Roman" w:cs="Times New Roman"/>
-              <w:b/>
-            </w:rPr>
-            <w:t>7 REFERÊNCIAS</w:t>
-          </w:r>
-          <w:r>
-            <w:tab/>
-          </w:r>
-          <w:r>
-            <w:fldChar w:fldCharType="begin"/>
-          </w:r>
-          <w:r>
-            <w:instrText xml:space="preserve"> PAGEREF _Toc205989576 \h </w:instrText>
-          </w:r>
-          <w:r>
-            <w:fldChar w:fldCharType="separate"/>
-          </w:r>
-          <w:r>
-            <w:t>11</w:t>
-          </w:r>
-          <w:r>
-            <w:fldChar w:fldCharType="end"/>
-          </w:r>
-          <w:r>
-            <w:fldChar w:fldCharType="end"/>
-          </w:r>
+          <w:hyperlink w:anchor="_Toc205989576" w:history="1">
+            <w:r>
+              <w:rPr>
+                <w:rStyle w:val="Hyperlink"/>
+                <w:rFonts w:ascii="Times New Roman" w:hAnsi="Times New Roman" w:cs="Times New Roman"/>
+                <w:b/>
+              </w:rPr>
+              <w:t>7 REFERÊNCIAS</w:t>
+            </w:r>
+            <w:r>
+              <w:tab/>
+            </w:r>
+            <w:r>
+              <w:fldChar w:fldCharType="begin"/>
+            </w:r>
+            <w:r>
+              <w:instrText xml:space="preserve"> PAGEREF _Toc205989576 \h </w:instrText>
+            </w:r>
+            <w:r>
+              <w:fldChar w:fldCharType="separate"/>
+            </w:r>
+            <w:r>
+              <w:t>11</w:t>
+            </w:r>
+            <w:r>
+              <w:fldChar w:fldCharType="end"/>
+            </w:r>
+          </w:hyperlink>
         </w:p>
         <w:p>
           <w:r>
@@ -2244,6 +2195,7 @@
           <w:sz w:val="24"/>
           <w:szCs w:val="24"/>
         </w:rPr>
+        <w:lastRenderedPageBreak/>
         <w:t>1 INTRODUÇÃO</w:t>
       </w:r>
       <w:bookmarkEnd w:id="0"/>
@@ -2511,6 +2463,7 @@
           <w:sz w:val="24"/>
           <w:szCs w:val="24"/>
         </w:rPr>
+        <w:lastRenderedPageBreak/>
         <w:t>2 DESENVOLVIMENTO</w:t>
       </w:r>
       <w:bookmarkEnd w:id="1"/>
@@ -2826,6 +2779,7 @@
           <w:sz w:val="24"/>
           <w:szCs w:val="24"/>
         </w:rPr>
+        <w:lastRenderedPageBreak/>
         <w:t>3 METODOLOGIA OU PROCEDIMENTOS METODOLÓGICOS</w:t>
       </w:r>
       <w:bookmarkEnd w:id="4"/>
@@ -2974,18 +2928,17 @@
         <w:ind w:firstLine="709"/>
         <w:jc w:val="both"/>
         <w:rPr>
-          <w:rFonts w:hint="default" w:ascii="Times New Roman" w:hAnsi="Times New Roman" w:cs="Times New Roman"/>
-          <w:sz w:val="24"/>
-          <w:szCs w:val="24"/>
-          <w:lang w:val="pt-BR"/>
-        </w:rPr>
-      </w:pPr>
-      <w:r>
-        <w:rPr>
-          <w:rFonts w:hint="default" w:ascii="Times New Roman" w:hAnsi="Times New Roman" w:cs="Times New Roman"/>
-          <w:sz w:val="24"/>
-          <w:szCs w:val="24"/>
-          <w:lang w:val="pt-BR"/>
+          <w:rFonts w:ascii="Times New Roman" w:hAnsi="Times New Roman" w:cs="Times New Roman"/>
+          <w:sz w:val="24"/>
+          <w:szCs w:val="24"/>
+        </w:rPr>
+      </w:pPr>
+      <w:r>
+        <w:rPr>
+          <w:rFonts w:ascii="Times New Roman" w:hAnsi="Times New Roman" w:cs="Times New Roman"/>
+          <w:noProof/>
+          <w:sz w:val="24"/>
+          <w:szCs w:val="24"/>
         </w:rPr>
         <w:drawing>
           <wp:inline distT="0" distB="0" distL="114300" distR="114300">
@@ -3031,6 +2984,36 @@
         <w:tabs>
           <w:tab w:val="left" w:pos="2400"/>
         </w:tabs>
+        <w:spacing w:after="0" w:line="240" w:lineRule="auto"/>
+        <w:rPr>
+          <w:rFonts w:ascii="Times New Roman" w:hAnsi="Times New Roman" w:cs="Times New Roman"/>
+          <w:sz w:val="20"/>
+          <w:szCs w:val="20"/>
+        </w:rPr>
+      </w:pPr>
+      <w:r>
+        <w:rPr>
+          <w:rFonts w:ascii="Times New Roman" w:hAnsi="Times New Roman" w:cs="Times New Roman"/>
+          <w:b/>
+          <w:sz w:val="20"/>
+          <w:szCs w:val="20"/>
+        </w:rPr>
+        <w:t xml:space="preserve">Fonte: </w:t>
+      </w:r>
+      <w:r>
+        <w:rPr>
+          <w:rFonts w:ascii="Times New Roman" w:hAnsi="Times New Roman" w:cs="Times New Roman"/>
+          <w:sz w:val="20"/>
+          <w:szCs w:val="20"/>
+        </w:rPr>
+        <w:t>Os Autores</w:t>
+      </w:r>
+    </w:p>
+    <w:p>
+      <w:pPr>
+        <w:tabs>
+          <w:tab w:val="left" w:pos="2400"/>
+        </w:tabs>
         <w:spacing w:after="0" w:line="360" w:lineRule="auto"/>
         <w:outlineLvl w:val="1"/>
         <w:rPr>
@@ -3040,13 +3023,44 @@
           <w:szCs w:val="24"/>
         </w:rPr>
       </w:pPr>
-      <w:r>
-        <w:rPr>
-          <w:rFonts w:ascii="Times New Roman" w:hAnsi="Times New Roman" w:cs="Times New Roman"/>
-          <w:b/>
-          <w:sz w:val="24"/>
-          <w:szCs w:val="24"/>
-        </w:rPr>
+    </w:p>
+    <w:p>
+      <w:pPr>
+        <w:tabs>
+          <w:tab w:val="left" w:pos="2400"/>
+        </w:tabs>
+        <w:spacing w:after="0" w:line="360" w:lineRule="auto"/>
+        <w:outlineLvl w:val="1"/>
+        <w:rPr>
+          <w:rFonts w:ascii="Times New Roman" w:hAnsi="Times New Roman" w:cs="Times New Roman"/>
+          <w:b/>
+          <w:sz w:val="24"/>
+          <w:szCs w:val="24"/>
+        </w:rPr>
+      </w:pPr>
+    </w:p>
+    <w:p>
+      <w:pPr>
+        <w:tabs>
+          <w:tab w:val="left" w:pos="2400"/>
+        </w:tabs>
+        <w:spacing w:after="0" w:line="360" w:lineRule="auto"/>
+        <w:outlineLvl w:val="1"/>
+        <w:rPr>
+          <w:rFonts w:ascii="Times New Roman" w:hAnsi="Times New Roman" w:cs="Times New Roman"/>
+          <w:b/>
+          <w:sz w:val="24"/>
+          <w:szCs w:val="24"/>
+        </w:rPr>
+      </w:pPr>
+      <w:r>
+        <w:rPr>
+          <w:rFonts w:ascii="Times New Roman" w:hAnsi="Times New Roman" w:cs="Times New Roman"/>
+          <w:b/>
+          <w:sz w:val="24"/>
+          <w:szCs w:val="24"/>
+        </w:rPr>
+        <w:lastRenderedPageBreak/>
         <w:t>4.2 CSS</w:t>
       </w:r>
     </w:p>
@@ -3082,14 +3096,14 @@
         <w:ind w:firstLine="680"/>
         <w:jc w:val="both"/>
         <w:rPr>
-          <w:rFonts w:ascii="Times New Roman" w:hAnsi="Times New Roman" w:eastAsia="Malgun Gothic" w:cs="Malgun Gothic"/>
-          <w:sz w:val="24"/>
-          <w:szCs w:val="24"/>
-        </w:rPr>
-      </w:pPr>
-      <w:r>
-        <w:rPr>
-          <w:rFonts w:ascii="Times New Roman" w:hAnsi="Times New Roman" w:eastAsia="Malgun Gothic" w:cs="Malgun Gothic"/>
+          <w:rFonts w:ascii="Times New Roman" w:eastAsia="Malgun Gothic" w:hAnsi="Times New Roman" w:cs="Malgun Gothic"/>
+          <w:sz w:val="24"/>
+          <w:szCs w:val="24"/>
+        </w:rPr>
+      </w:pPr>
+      <w:r>
+        <w:rPr>
+          <w:rFonts w:ascii="Times New Roman" w:eastAsia="Malgun Gothic" w:hAnsi="Times New Roman" w:cs="Malgun Gothic"/>
           <w:sz w:val="24"/>
           <w:szCs w:val="24"/>
         </w:rPr>
@@ -3105,18 +3119,17 @@
         <w:ind w:firstLine="680"/>
         <w:jc w:val="both"/>
         <w:rPr>
-          <w:rFonts w:hint="default" w:ascii="Times New Roman" w:hAnsi="Times New Roman" w:eastAsia="Malgun Gothic" w:cs="Malgun Gothic"/>
-          <w:sz w:val="24"/>
-          <w:szCs w:val="24"/>
-          <w:lang w:val="pt-BR"/>
-        </w:rPr>
-      </w:pPr>
-      <w:r>
-        <w:rPr>
-          <w:rFonts w:hint="default" w:ascii="Times New Roman" w:hAnsi="Times New Roman" w:eastAsia="Malgun Gothic" w:cs="Malgun Gothic"/>
-          <w:sz w:val="24"/>
-          <w:szCs w:val="24"/>
-          <w:lang w:val="pt-BR"/>
+          <w:rFonts w:ascii="Times New Roman" w:eastAsia="Malgun Gothic" w:hAnsi="Times New Roman" w:cs="Malgun Gothic"/>
+          <w:sz w:val="24"/>
+          <w:szCs w:val="24"/>
+        </w:rPr>
+      </w:pPr>
+      <w:r>
+        <w:rPr>
+          <w:rFonts w:ascii="Times New Roman" w:eastAsia="Malgun Gothic" w:hAnsi="Times New Roman" w:cs="Malgun Gothic"/>
+          <w:noProof/>
+          <w:sz w:val="24"/>
+          <w:szCs w:val="24"/>
         </w:rPr>
         <w:drawing>
           <wp:inline distT="0" distB="0" distL="114300" distR="114300">
@@ -3162,6 +3175,36 @@
         <w:tabs>
           <w:tab w:val="left" w:pos="2400"/>
         </w:tabs>
+        <w:spacing w:after="0" w:line="240" w:lineRule="auto"/>
+        <w:rPr>
+          <w:rFonts w:ascii="Times New Roman" w:hAnsi="Times New Roman" w:cs="Times New Roman"/>
+          <w:sz w:val="20"/>
+          <w:szCs w:val="20"/>
+        </w:rPr>
+      </w:pPr>
+      <w:r>
+        <w:rPr>
+          <w:rFonts w:ascii="Times New Roman" w:hAnsi="Times New Roman" w:cs="Times New Roman"/>
+          <w:b/>
+          <w:sz w:val="20"/>
+          <w:szCs w:val="20"/>
+        </w:rPr>
+        <w:t xml:space="preserve">Fonte: </w:t>
+      </w:r>
+      <w:r>
+        <w:rPr>
+          <w:rFonts w:ascii="Times New Roman" w:hAnsi="Times New Roman" w:cs="Times New Roman"/>
+          <w:sz w:val="20"/>
+          <w:szCs w:val="20"/>
+        </w:rPr>
+        <w:t>Os Autores</w:t>
+      </w:r>
+    </w:p>
+    <w:p>
+      <w:pPr>
+        <w:tabs>
+          <w:tab w:val="left" w:pos="2400"/>
+        </w:tabs>
         <w:spacing w:after="0" w:line="360" w:lineRule="auto"/>
         <w:outlineLvl w:val="1"/>
         <w:rPr>
@@ -3171,6 +3214,21 @@
           <w:szCs w:val="24"/>
         </w:rPr>
       </w:pPr>
+    </w:p>
+    <w:p>
+      <w:pPr>
+        <w:tabs>
+          <w:tab w:val="left" w:pos="2400"/>
+        </w:tabs>
+        <w:spacing w:after="0" w:line="360" w:lineRule="auto"/>
+        <w:outlineLvl w:val="1"/>
+        <w:rPr>
+          <w:rFonts w:ascii="Times New Roman" w:hAnsi="Times New Roman" w:cs="Times New Roman"/>
+          <w:b/>
+          <w:sz w:val="24"/>
+          <w:szCs w:val="24"/>
+        </w:rPr>
+      </w:pPr>
       <w:r>
         <w:rPr>
           <w:rFonts w:ascii="Times New Roman" w:hAnsi="Times New Roman" w:cs="Times New Roman"/>
@@ -3213,19 +3271,19 @@
         <w:ind w:firstLine="709"/>
         <w:jc w:val="both"/>
         <w:rPr>
-          <w:rFonts w:hint="default" w:ascii="Times New Roman" w:hAnsi="Times New Roman" w:cs="Times New Roman"/>
-          <w:sz w:val="24"/>
-          <w:szCs w:val="24"/>
-          <w:lang w:val="pt-BR"/>
-        </w:rPr>
-      </w:pPr>
-      <w:r>
-        <w:rPr>
-          <w:rFonts w:hint="default" w:ascii="Times New Roman" w:hAnsi="Times New Roman" w:cs="Times New Roman"/>
-          <w:sz w:val="24"/>
-          <w:szCs w:val="24"/>
-          <w:lang w:val="pt-BR"/>
-        </w:rPr>
+          <w:rFonts w:ascii="Times New Roman" w:hAnsi="Times New Roman" w:cs="Times New Roman"/>
+          <w:sz w:val="24"/>
+          <w:szCs w:val="24"/>
+        </w:rPr>
+      </w:pPr>
+      <w:r>
+        <w:rPr>
+          <w:rFonts w:ascii="Times New Roman" w:hAnsi="Times New Roman" w:cs="Times New Roman"/>
+          <w:noProof/>
+          <w:sz w:val="24"/>
+          <w:szCs w:val="24"/>
+        </w:rPr>
+        <w:lastRenderedPageBreak/>
         <w:drawing>
           <wp:inline distT="0" distB="0" distL="114300" distR="114300">
             <wp:extent cx="5392420" cy="2868930"/>
@@ -3270,6 +3328,36 @@
         <w:tabs>
           <w:tab w:val="left" w:pos="2400"/>
         </w:tabs>
+        <w:spacing w:after="0" w:line="240" w:lineRule="auto"/>
+        <w:rPr>
+          <w:rFonts w:ascii="Times New Roman" w:hAnsi="Times New Roman" w:cs="Times New Roman"/>
+          <w:sz w:val="20"/>
+          <w:szCs w:val="20"/>
+        </w:rPr>
+      </w:pPr>
+      <w:r>
+        <w:rPr>
+          <w:rFonts w:ascii="Times New Roman" w:hAnsi="Times New Roman" w:cs="Times New Roman"/>
+          <w:b/>
+          <w:sz w:val="20"/>
+          <w:szCs w:val="20"/>
+        </w:rPr>
+        <w:t xml:space="preserve">Fonte: </w:t>
+      </w:r>
+      <w:r>
+        <w:rPr>
+          <w:rFonts w:ascii="Times New Roman" w:hAnsi="Times New Roman" w:cs="Times New Roman"/>
+          <w:sz w:val="20"/>
+          <w:szCs w:val="20"/>
+        </w:rPr>
+        <w:t>Os Autores</w:t>
+      </w:r>
+    </w:p>
+    <w:p>
+      <w:pPr>
+        <w:tabs>
+          <w:tab w:val="left" w:pos="2400"/>
+        </w:tabs>
         <w:spacing w:after="0" w:line="360" w:lineRule="auto"/>
         <w:outlineLvl w:val="1"/>
         <w:rPr>
@@ -3279,6 +3367,21 @@
           <w:szCs w:val="24"/>
         </w:rPr>
       </w:pPr>
+    </w:p>
+    <w:p>
+      <w:pPr>
+        <w:tabs>
+          <w:tab w:val="left" w:pos="2400"/>
+        </w:tabs>
+        <w:spacing w:after="0" w:line="360" w:lineRule="auto"/>
+        <w:outlineLvl w:val="1"/>
+        <w:rPr>
+          <w:rFonts w:ascii="Times New Roman" w:hAnsi="Times New Roman" w:cs="Times New Roman"/>
+          <w:b/>
+          <w:sz w:val="24"/>
+          <w:szCs w:val="24"/>
+        </w:rPr>
+      </w:pPr>
       <w:r>
         <w:rPr>
           <w:rFonts w:ascii="Times New Roman" w:hAnsi="Times New Roman" w:cs="Times New Roman"/>
@@ -3310,7 +3413,25 @@
           <w:sz w:val="24"/>
           <w:szCs w:val="24"/>
         </w:rPr>
-        <w:t>Um banco de dados é um conjunto de estruturação de dados, armazenados em sistemas organizados e que operam eletronicamente, o objetivo de um database é armazenar dados sobre um mesmo assunto em um local central, seguro e de fácil manipulação. É um agrupamento de informações organizadas de maneira estruturada, organizada e otimizada, é de extrema relevância a sua utilização para a organização de um site.</w:t>
+        <w:t xml:space="preserve">Um banco de dados é um conjunto de estruturação de dados, armazenados em sistemas organizados e que operam eletronicamente, o objetivo de um </w:t>
+      </w:r>
+      <w:proofErr w:type="spellStart"/>
+      <w:r>
+        <w:rPr>
+          <w:rFonts w:ascii="Times New Roman" w:hAnsi="Times New Roman" w:cs="Times New Roman"/>
+          <w:sz w:val="24"/>
+          <w:szCs w:val="24"/>
+        </w:rPr>
+        <w:t>database</w:t>
+      </w:r>
+      <w:proofErr w:type="spellEnd"/>
+      <w:r>
+        <w:rPr>
+          <w:rFonts w:ascii="Times New Roman" w:hAnsi="Times New Roman" w:cs="Times New Roman"/>
+          <w:sz w:val="24"/>
+          <w:szCs w:val="24"/>
+        </w:rPr>
+        <w:t xml:space="preserve"> é armazenar dados sobre um mesmo assunto em um local central, seguro e de fácil manipulação. É um agrupamento de informações organizadas de maneira estruturada, organizada e otimizada, é de extrema relevância a sua utilização para a organização de um site.</w:t>
       </w:r>
     </w:p>
     <w:p>
@@ -3347,19 +3468,19 @@
         <w:jc w:val="both"/>
         <w:outlineLvl w:val="1"/>
         <w:rPr>
-          <w:rFonts w:hint="default" w:ascii="Times New Roman" w:hAnsi="Times New Roman" w:cs="Times New Roman"/>
-          <w:sz w:val="24"/>
-          <w:szCs w:val="24"/>
-          <w:lang w:val="pt-BR"/>
-        </w:rPr>
-      </w:pPr>
-      <w:r>
-        <w:rPr>
-          <w:rFonts w:hint="default" w:ascii="Times New Roman" w:hAnsi="Times New Roman" w:cs="Times New Roman"/>
-          <w:sz w:val="24"/>
-          <w:szCs w:val="24"/>
-          <w:lang w:val="pt-BR"/>
-        </w:rPr>
+          <w:rFonts w:ascii="Times New Roman" w:hAnsi="Times New Roman" w:cs="Times New Roman"/>
+          <w:sz w:val="24"/>
+          <w:szCs w:val="24"/>
+        </w:rPr>
+      </w:pPr>
+      <w:r>
+        <w:rPr>
+          <w:rFonts w:ascii="Times New Roman" w:hAnsi="Times New Roman" w:cs="Times New Roman"/>
+          <w:noProof/>
+          <w:sz w:val="24"/>
+          <w:szCs w:val="24"/>
+        </w:rPr>
+        <w:lastRenderedPageBreak/>
         <w:drawing>
           <wp:inline distT="0" distB="0" distL="114300" distR="114300">
             <wp:extent cx="5399405" cy="2878455"/>
@@ -3409,18 +3530,17 @@
         <w:jc w:val="both"/>
         <w:outlineLvl w:val="1"/>
         <w:rPr>
-          <w:rFonts w:hint="default" w:ascii="Times New Roman" w:hAnsi="Times New Roman" w:cs="Times New Roman"/>
-          <w:sz w:val="24"/>
-          <w:szCs w:val="24"/>
-          <w:lang w:val="pt-BR"/>
-        </w:rPr>
-      </w:pPr>
-      <w:r>
-        <w:rPr>
-          <w:rFonts w:hint="default" w:ascii="Times New Roman" w:hAnsi="Times New Roman" w:cs="Times New Roman"/>
-          <w:sz w:val="24"/>
-          <w:szCs w:val="24"/>
-          <w:lang w:val="pt-BR"/>
+          <w:rFonts w:ascii="Times New Roman" w:hAnsi="Times New Roman" w:cs="Times New Roman"/>
+          <w:sz w:val="24"/>
+          <w:szCs w:val="24"/>
+        </w:rPr>
+      </w:pPr>
+      <w:r>
+        <w:rPr>
+          <w:rFonts w:ascii="Times New Roman" w:hAnsi="Times New Roman" w:cs="Times New Roman"/>
+          <w:noProof/>
+          <w:sz w:val="24"/>
+          <w:szCs w:val="24"/>
         </w:rPr>
         <w:drawing>
           <wp:inline distT="0" distB="0" distL="114300" distR="114300">
@@ -3466,6 +3586,36 @@
         <w:tabs>
           <w:tab w:val="left" w:pos="2400"/>
         </w:tabs>
+        <w:spacing w:after="0" w:line="240" w:lineRule="auto"/>
+        <w:rPr>
+          <w:rFonts w:ascii="Times New Roman" w:hAnsi="Times New Roman" w:cs="Times New Roman"/>
+          <w:sz w:val="20"/>
+          <w:szCs w:val="20"/>
+        </w:rPr>
+      </w:pPr>
+      <w:r>
+        <w:rPr>
+          <w:rFonts w:ascii="Times New Roman" w:hAnsi="Times New Roman" w:cs="Times New Roman"/>
+          <w:b/>
+          <w:sz w:val="20"/>
+          <w:szCs w:val="20"/>
+        </w:rPr>
+        <w:t xml:space="preserve">Fonte: </w:t>
+      </w:r>
+      <w:r>
+        <w:rPr>
+          <w:rFonts w:ascii="Times New Roman" w:hAnsi="Times New Roman" w:cs="Times New Roman"/>
+          <w:sz w:val="20"/>
+          <w:szCs w:val="20"/>
+        </w:rPr>
+        <w:t>Os Autores</w:t>
+      </w:r>
+    </w:p>
+    <w:p>
+      <w:pPr>
+        <w:tabs>
+          <w:tab w:val="left" w:pos="2400"/>
+        </w:tabs>
         <w:spacing w:after="0" w:line="360" w:lineRule="auto"/>
         <w:outlineLvl w:val="1"/>
         <w:rPr>
@@ -3475,6 +3625,21 @@
           <w:szCs w:val="24"/>
         </w:rPr>
       </w:pPr>
+    </w:p>
+    <w:p>
+      <w:pPr>
+        <w:tabs>
+          <w:tab w:val="left" w:pos="2400"/>
+        </w:tabs>
+        <w:spacing w:after="0" w:line="360" w:lineRule="auto"/>
+        <w:outlineLvl w:val="1"/>
+        <w:rPr>
+          <w:rFonts w:ascii="Times New Roman" w:hAnsi="Times New Roman" w:cs="Times New Roman"/>
+          <w:b/>
+          <w:sz w:val="24"/>
+          <w:szCs w:val="24"/>
+        </w:rPr>
+      </w:pPr>
       <w:r>
         <w:rPr>
           <w:rFonts w:ascii="Times New Roman" w:hAnsi="Times New Roman" w:cs="Times New Roman"/>
@@ -3541,13 +3706,61 @@
         <w:jc w:val="both"/>
         <w:rPr>
           <w:rFonts w:ascii="Times New Roman" w:hAnsi="Times New Roman" w:cs="Times New Roman"/>
-          <w:sz w:val="24"/>
-          <w:szCs w:val="24"/>
-        </w:rPr>
-      </w:pPr>
-      <w:r>
-        <w:rPr>
-          <w:rFonts w:ascii="Times New Roman" w:hAnsi="Times New Roman" w:cs="Times New Roman"/>
+          <w:b/>
+          <w:sz w:val="20"/>
+          <w:szCs w:val="20"/>
+        </w:rPr>
+      </w:pPr>
+    </w:p>
+    <w:p>
+      <w:pPr>
+        <w:tabs>
+          <w:tab w:val="left" w:pos="2400"/>
+        </w:tabs>
+        <w:spacing w:after="0" w:line="240" w:lineRule="auto"/>
+        <w:rPr>
+          <w:rFonts w:ascii="Times New Roman" w:hAnsi="Times New Roman" w:cs="Times New Roman"/>
+          <w:sz w:val="20"/>
+          <w:szCs w:val="20"/>
+        </w:rPr>
+      </w:pPr>
+      <w:r>
+        <w:rPr>
+          <w:rFonts w:ascii="Times New Roman" w:hAnsi="Times New Roman" w:cs="Times New Roman"/>
+          <w:b/>
+          <w:sz w:val="20"/>
+          <w:szCs w:val="20"/>
+        </w:rPr>
+        <w:lastRenderedPageBreak/>
+        <w:t xml:space="preserve">Fonte: </w:t>
+      </w:r>
+      <w:r>
+        <w:rPr>
+          <w:rFonts w:ascii="Times New Roman" w:hAnsi="Times New Roman" w:cs="Times New Roman"/>
+          <w:sz w:val="20"/>
+          <w:szCs w:val="20"/>
+        </w:rPr>
+        <w:t>Os Autores</w:t>
+      </w:r>
+    </w:p>
+    <w:p>
+      <w:pPr>
+        <w:tabs>
+          <w:tab w:val="left" w:pos="2400"/>
+        </w:tabs>
+        <w:spacing w:after="0" w:line="360" w:lineRule="auto"/>
+        <w:ind w:firstLine="709"/>
+        <w:jc w:val="both"/>
+        <w:rPr>
+          <w:rFonts w:ascii="Times New Roman" w:hAnsi="Times New Roman" w:cs="Times New Roman"/>
+          <w:sz w:val="24"/>
+          <w:szCs w:val="24"/>
+        </w:rPr>
+      </w:pPr>
+      <w:r>
+        <w:rPr>
+          <w:rFonts w:ascii="Times New Roman" w:hAnsi="Times New Roman" w:cs="Times New Roman"/>
+          <w:noProof/>
           <w:sz w:val="24"/>
           <w:szCs w:val="24"/>
         </w:rPr>
@@ -3563,7 +3776,7 @@
             <wp:extent cx="5400040" cy="3184525"/>
             <wp:effectExtent l="0" t="0" r="0" b="0"/>
             <wp:wrapTight wrapText="bothSides">
-              <wp:wrapPolygon>
+              <wp:wrapPolygon edited="0">
                 <wp:start x="0" y="0"/>
                 <wp:lineTo x="0" y="21449"/>
                 <wp:lineTo x="21488" y="21449"/>
@@ -3691,18 +3904,17 @@
         <w:ind w:firstLine="709"/>
         <w:jc w:val="both"/>
         <w:rPr>
-          <w:rFonts w:hint="default" w:ascii="Times New Roman" w:hAnsi="Times New Roman" w:cs="Times New Roman"/>
-          <w:sz w:val="24"/>
-          <w:szCs w:val="24"/>
-          <w:lang w:val="pt-BR"/>
-        </w:rPr>
-      </w:pPr>
-      <w:r>
-        <w:rPr>
-          <w:rFonts w:hint="default" w:ascii="Times New Roman" w:hAnsi="Times New Roman" w:cs="Times New Roman"/>
-          <w:sz w:val="24"/>
-          <w:szCs w:val="24"/>
-          <w:lang w:val="pt-BR"/>
+          <w:rFonts w:ascii="Times New Roman" w:hAnsi="Times New Roman" w:cs="Times New Roman"/>
+          <w:sz w:val="24"/>
+          <w:szCs w:val="24"/>
+        </w:rPr>
+      </w:pPr>
+      <w:r>
+        <w:rPr>
+          <w:rFonts w:ascii="Times New Roman" w:hAnsi="Times New Roman" w:cs="Times New Roman"/>
+          <w:noProof/>
+          <w:sz w:val="24"/>
+          <w:szCs w:val="24"/>
         </w:rPr>
         <w:drawing>
           <wp:inline distT="0" distB="0" distL="114300" distR="114300">
@@ -3759,11 +3971,12 @@
       </w:pPr>
       <w:r>
         <w:rPr>
-          <w:rFonts w:hint="default" w:ascii="Times New Roman" w:hAnsi="Times New Roman" w:cs="Times New Roman"/>
-          <w:sz w:val="24"/>
-          <w:szCs w:val="24"/>
-          <w:lang w:val="pt-BR"/>
-        </w:rPr>
+          <w:rFonts w:ascii="Times New Roman" w:hAnsi="Times New Roman" w:cs="Times New Roman"/>
+          <w:noProof/>
+          <w:sz w:val="24"/>
+          <w:szCs w:val="24"/>
+        </w:rPr>
+        <w:lastRenderedPageBreak/>
         <w:drawing>
           <wp:inline distT="0" distB="0" distL="114300" distR="114300">
             <wp:extent cx="5394960" cy="2677795"/>
@@ -3808,6 +4021,36 @@
         <w:tabs>
           <w:tab w:val="left" w:pos="2400"/>
         </w:tabs>
+        <w:spacing w:after="0" w:line="240" w:lineRule="auto"/>
+        <w:rPr>
+          <w:rFonts w:ascii="Times New Roman" w:hAnsi="Times New Roman" w:cs="Times New Roman"/>
+          <w:sz w:val="20"/>
+          <w:szCs w:val="20"/>
+        </w:rPr>
+      </w:pPr>
+      <w:r>
+        <w:rPr>
+          <w:rFonts w:ascii="Times New Roman" w:hAnsi="Times New Roman" w:cs="Times New Roman"/>
+          <w:b/>
+          <w:sz w:val="20"/>
+          <w:szCs w:val="20"/>
+        </w:rPr>
+        <w:t xml:space="preserve">Fonte: </w:t>
+      </w:r>
+      <w:r>
+        <w:rPr>
+          <w:rFonts w:ascii="Times New Roman" w:hAnsi="Times New Roman" w:cs="Times New Roman"/>
+          <w:sz w:val="20"/>
+          <w:szCs w:val="20"/>
+        </w:rPr>
+        <w:t>Os Autores</w:t>
+      </w:r>
+    </w:p>
+    <w:p>
+      <w:pPr>
+        <w:tabs>
+          <w:tab w:val="left" w:pos="2400"/>
+        </w:tabs>
         <w:spacing w:after="0" w:line="360" w:lineRule="auto"/>
         <w:outlineLvl w:val="1"/>
         <w:rPr>
@@ -3817,6 +4060,21 @@
           <w:szCs w:val="24"/>
         </w:rPr>
       </w:pPr>
+    </w:p>
+    <w:p>
+      <w:pPr>
+        <w:tabs>
+          <w:tab w:val="left" w:pos="2400"/>
+        </w:tabs>
+        <w:spacing w:after="0" w:line="360" w:lineRule="auto"/>
+        <w:outlineLvl w:val="1"/>
+        <w:rPr>
+          <w:rFonts w:ascii="Times New Roman" w:hAnsi="Times New Roman" w:cs="Times New Roman"/>
+          <w:b/>
+          <w:sz w:val="24"/>
+          <w:szCs w:val="24"/>
+        </w:rPr>
+      </w:pPr>
       <w:r>
         <w:rPr>
           <w:rFonts w:ascii="Times New Roman" w:hAnsi="Times New Roman" w:cs="Times New Roman"/>
@@ -3880,18 +4138,17 @@
         <w:spacing w:after="0" w:line="360" w:lineRule="auto"/>
         <w:jc w:val="both"/>
         <w:rPr>
-          <w:rFonts w:hint="default" w:ascii="Times New Roman" w:hAnsi="Times New Roman" w:cs="Times New Roman"/>
-          <w:sz w:val="24"/>
-          <w:szCs w:val="24"/>
-          <w:lang w:val="pt-BR"/>
-        </w:rPr>
-      </w:pPr>
-      <w:r>
-        <w:rPr>
-          <w:rFonts w:hint="default" w:ascii="Times New Roman" w:hAnsi="Times New Roman" w:cs="Times New Roman"/>
-          <w:sz w:val="24"/>
-          <w:szCs w:val="24"/>
-          <w:lang w:val="pt-BR"/>
+          <w:rFonts w:ascii="Times New Roman" w:hAnsi="Times New Roman" w:cs="Times New Roman"/>
+          <w:sz w:val="24"/>
+          <w:szCs w:val="24"/>
+        </w:rPr>
+      </w:pPr>
+      <w:r>
+        <w:rPr>
+          <w:rFonts w:ascii="Times New Roman" w:hAnsi="Times New Roman" w:cs="Times New Roman"/>
+          <w:noProof/>
+          <w:sz w:val="24"/>
+          <w:szCs w:val="24"/>
         </w:rPr>
         <w:drawing>
           <wp:inline distT="0" distB="0" distL="114300" distR="114300">
@@ -3937,6 +4194,38 @@
         <w:tabs>
           <w:tab w:val="left" w:pos="2400"/>
         </w:tabs>
+        <w:spacing w:after="0" w:line="240" w:lineRule="auto"/>
+        <w:rPr>
+          <w:rFonts w:ascii="Times New Roman" w:hAnsi="Times New Roman" w:cs="Times New Roman"/>
+          <w:sz w:val="20"/>
+          <w:szCs w:val="20"/>
+        </w:rPr>
+      </w:pPr>
+      <w:bookmarkStart w:id="6" w:name="_GoBack"/>
+      <w:r>
+        <w:rPr>
+          <w:rFonts w:ascii="Times New Roman" w:hAnsi="Times New Roman" w:cs="Times New Roman"/>
+          <w:b/>
+          <w:sz w:val="20"/>
+          <w:szCs w:val="20"/>
+        </w:rPr>
+        <w:t xml:space="preserve">Fonte: </w:t>
+      </w:r>
+      <w:r>
+        <w:rPr>
+          <w:rFonts w:ascii="Times New Roman" w:hAnsi="Times New Roman" w:cs="Times New Roman"/>
+          <w:sz w:val="20"/>
+          <w:szCs w:val="20"/>
+        </w:rPr>
+        <w:t>Os Autores</w:t>
+      </w:r>
+    </w:p>
+    <w:bookmarkEnd w:id="6"/>
+    <w:p>
+      <w:pPr>
+        <w:tabs>
+          <w:tab w:val="left" w:pos="2400"/>
+        </w:tabs>
         <w:spacing w:after="0" w:line="360" w:lineRule="auto"/>
         <w:outlineLvl w:val="1"/>
         <w:rPr>
@@ -3946,6 +4235,21 @@
           <w:szCs w:val="24"/>
         </w:rPr>
       </w:pPr>
+    </w:p>
+    <w:p>
+      <w:pPr>
+        <w:tabs>
+          <w:tab w:val="left" w:pos="2400"/>
+        </w:tabs>
+        <w:spacing w:after="0" w:line="360" w:lineRule="auto"/>
+        <w:outlineLvl w:val="1"/>
+        <w:rPr>
+          <w:rFonts w:ascii="Times New Roman" w:hAnsi="Times New Roman" w:cs="Times New Roman"/>
+          <w:b/>
+          <w:sz w:val="24"/>
+          <w:szCs w:val="24"/>
+        </w:rPr>
+      </w:pPr>
       <w:r>
         <w:rPr>
           <w:rFonts w:ascii="Times New Roman" w:hAnsi="Times New Roman" w:cs="Times New Roman"/>
@@ -3976,6 +4280,7 @@
           <w:sz w:val="24"/>
           <w:szCs w:val="24"/>
         </w:rPr>
+        <w:lastRenderedPageBreak/>
         <w:t>O Google Classroom é uma plataforma online gratuita desenvolvida para simplificar e organizar o aprendizado, tanto em ambientes virtuais quanto presenciais, foi criado pelo Google em 2014 e faz parte do conjunto de ferramentas do Google for Education.</w:t>
       </w:r>
     </w:p>
@@ -3996,6 +4301,7 @@
       <w:r>
         <w:rPr>
           <w:rFonts w:ascii="Times New Roman" w:hAnsi="Times New Roman" w:cs="Times New Roman"/>
+          <w:noProof/>
           <w:sz w:val="24"/>
           <w:szCs w:val="24"/>
         </w:rPr>
@@ -4011,7 +4317,7 @@
             <wp:extent cx="5400040" cy="2883535"/>
             <wp:effectExtent l="0" t="0" r="0" b="0"/>
             <wp:wrapTight wrapText="bothSides">
-              <wp:wrapPolygon>
+              <wp:wrapPolygon edited="0">
                 <wp:start x="0" y="0"/>
                 <wp:lineTo x="0" y="21405"/>
                 <wp:lineTo x="21488" y="21405"/>
@@ -4126,7 +4432,23 @@
           <w:sz w:val="24"/>
           <w:szCs w:val="24"/>
         </w:rPr>
-        <w:t xml:space="preserve">O Canva foi criado por Melanie Perkins, Cliff Obrecht e Cameron Adams, essa plataforma foi criada para criar diversos tipo de materiais visuais, como posts para redes sociais, apresentações, cartões de visita, convites, flyers e até vídeos, oferece milhares de modelos pré-prontos para agilizar o processo de criação. </w:t>
+        <w:t xml:space="preserve">O Canva foi criado por Melanie Perkins, Cliff Obrecht e Cameron Adams, essa plataforma foi criada para criar diversos </w:t>
+      </w:r>
+      <w:r>
+        <w:rPr>
+          <w:rFonts w:ascii="Times New Roman" w:hAnsi="Times New Roman" w:cs="Times New Roman"/>
+          <w:sz w:val="24"/>
+          <w:szCs w:val="24"/>
+        </w:rPr>
+        <w:t>tipos</w:t>
+      </w:r>
+      <w:r>
+        <w:rPr>
+          <w:rFonts w:ascii="Times New Roman" w:hAnsi="Times New Roman" w:cs="Times New Roman"/>
+          <w:sz w:val="24"/>
+          <w:szCs w:val="24"/>
+        </w:rPr>
+        <w:t xml:space="preserve"> de materiais visuais, como posts para redes sociais, apresentações, cartões de visita, convites, flyers e até vídeos, oferece milhares de modelos pré-prontos para agilizar o processo de criação. </w:t>
       </w:r>
     </w:p>
     <w:p>
@@ -4159,19 +4481,19 @@
         <w:spacing w:after="0" w:line="360" w:lineRule="auto"/>
         <w:outlineLvl w:val="1"/>
         <w:rPr>
-          <w:rFonts w:hint="default" w:ascii="Times New Roman" w:hAnsi="Times New Roman" w:cs="Times New Roman"/>
-          <w:sz w:val="24"/>
-          <w:szCs w:val="24"/>
-          <w:lang w:val="pt-BR"/>
-        </w:rPr>
-      </w:pPr>
-      <w:r>
-        <w:rPr>
-          <w:rFonts w:hint="default" w:ascii="Times New Roman" w:hAnsi="Times New Roman" w:cs="Times New Roman"/>
-          <w:sz w:val="24"/>
-          <w:szCs w:val="24"/>
-          <w:lang w:val="pt-BR"/>
-        </w:rPr>
+          <w:rFonts w:ascii="Times New Roman" w:hAnsi="Times New Roman" w:cs="Times New Roman"/>
+          <w:sz w:val="24"/>
+          <w:szCs w:val="24"/>
+        </w:rPr>
+      </w:pPr>
+      <w:r>
+        <w:rPr>
+          <w:rFonts w:ascii="Times New Roman" w:hAnsi="Times New Roman" w:cs="Times New Roman"/>
+          <w:noProof/>
+          <w:sz w:val="24"/>
+          <w:szCs w:val="24"/>
+        </w:rPr>
+        <w:lastRenderedPageBreak/>
         <w:drawing>
           <wp:inline distT="0" distB="0" distL="114300" distR="114300">
             <wp:extent cx="4871720" cy="2413000"/>
@@ -4480,7 +4802,7 @@
           <w:szCs w:val="24"/>
         </w:rPr>
       </w:pPr>
-      <w:bookmarkStart w:id="6" w:name="_Toc205989574"/>
+      <w:bookmarkStart w:id="7" w:name="_Toc205989574"/>
     </w:p>
     <w:p>
       <w:pPr>
@@ -4526,8 +4848,6 @@
           <w:szCs w:val="24"/>
         </w:rPr>
       </w:pPr>
-      <w:bookmarkStart w:id="9" w:name="_GoBack"/>
-      <w:bookmarkEnd w:id="9"/>
     </w:p>
     <w:p>
       <w:pPr>
@@ -4567,7 +4887,7 @@
         </w:rPr>
         <w:t>5 APRESENTAÇÃO E ANALISE DOS RESULTADOS</w:t>
       </w:r>
-      <w:bookmarkEnd w:id="6"/>
+      <w:bookmarkEnd w:id="7"/>
     </w:p>
     <w:p>
       <w:pPr>
@@ -4982,7 +5302,7 @@
           <w:szCs w:val="24"/>
         </w:rPr>
       </w:pPr>
-      <w:bookmarkStart w:id="7" w:name="_Toc205989575"/>
+      <w:bookmarkStart w:id="8" w:name="_Toc205989575"/>
     </w:p>
     <w:p>
       <w:pPr>
@@ -5007,7 +5327,7 @@
         </w:rPr>
         <w:t>6 CONCLUSÃO</w:t>
       </w:r>
-      <w:bookmarkEnd w:id="7"/>
+      <w:bookmarkEnd w:id="8"/>
     </w:p>
     <w:p>
       <w:pPr>
@@ -5700,7 +6020,7 @@
           <w:b/>
         </w:rPr>
       </w:pPr>
-      <w:bookmarkStart w:id="8" w:name="_Toc205989576"/>
+      <w:bookmarkStart w:id="9" w:name="_Toc205989576"/>
       <w:r>
         <w:rPr>
           <w:rFonts w:ascii="Times New Roman" w:hAnsi="Times New Roman" w:cs="Times New Roman"/>
@@ -5708,7 +6028,7 @@
         </w:rPr>
         <w:t>7 REFERÊNCIAS</w:t>
       </w:r>
-      <w:bookmarkEnd w:id="8"/>
+      <w:bookmarkEnd w:id="9"/>
     </w:p>
     <w:p>
       <w:pPr>
@@ -5898,58 +6218,109 @@
           <w:sz w:val="24"/>
           <w:szCs w:val="24"/>
         </w:rPr>
-        <w:t>Quando não for possível determinar o local, utiliza-se a expressão sine loco,</w:t>
-      </w:r>
-    </w:p>
-    <w:p>
-      <w:pPr>
-        <w:tabs>
-          <w:tab w:val="left" w:pos="2400"/>
-        </w:tabs>
-        <w:spacing w:after="0" w:line="360" w:lineRule="auto"/>
-        <w:ind w:firstLine="709"/>
-        <w:jc w:val="both"/>
-        <w:rPr>
-          <w:rFonts w:ascii="Times New Roman" w:hAnsi="Times New Roman" w:cs="Times New Roman"/>
-          <w:b/>
-          <w:sz w:val="24"/>
-          <w:szCs w:val="24"/>
-        </w:rPr>
-      </w:pPr>
-      <w:r>
-        <w:rPr>
-          <w:rFonts w:ascii="Times New Roman" w:hAnsi="Times New Roman" w:cs="Times New Roman"/>
-          <w:b/>
-          <w:sz w:val="24"/>
-          <w:szCs w:val="24"/>
-        </w:rPr>
-        <w:t>abreviada, entre colchetes [S.l.]</w:t>
-      </w:r>
-    </w:p>
-    <w:p>
-      <w:pPr>
-        <w:tabs>
-          <w:tab w:val="left" w:pos="2400"/>
-        </w:tabs>
-        <w:spacing w:after="0" w:line="360" w:lineRule="auto"/>
-        <w:ind w:firstLine="709"/>
-        <w:jc w:val="both"/>
-        <w:rPr>
-          <w:rFonts w:ascii="Times New Roman" w:hAnsi="Times New Roman" w:cs="Times New Roman"/>
-          <w:b/>
-          <w:sz w:val="24"/>
-          <w:szCs w:val="24"/>
-        </w:rPr>
-      </w:pPr>
-      <w:r>
-        <w:rPr>
-          <w:rFonts w:ascii="Times New Roman" w:hAnsi="Times New Roman" w:cs="Times New Roman"/>
-          <w:b/>
-          <w:sz w:val="24"/>
-          <w:szCs w:val="24"/>
-        </w:rPr>
-        <w:t>Quando a editora não puder ser identificada, deve-se indicar a expressão sine</w:t>
-      </w:r>
+        <w:t xml:space="preserve">Quando não for possível determinar o local, utiliza-se a expressão </w:t>
+      </w:r>
+      <w:proofErr w:type="spellStart"/>
+      <w:r>
+        <w:rPr>
+          <w:rFonts w:ascii="Times New Roman" w:hAnsi="Times New Roman" w:cs="Times New Roman"/>
+          <w:b/>
+          <w:sz w:val="24"/>
+          <w:szCs w:val="24"/>
+        </w:rPr>
+        <w:t>sine</w:t>
+      </w:r>
+      <w:proofErr w:type="spellEnd"/>
+      <w:r>
+        <w:rPr>
+          <w:rFonts w:ascii="Times New Roman" w:hAnsi="Times New Roman" w:cs="Times New Roman"/>
+          <w:b/>
+          <w:sz w:val="24"/>
+          <w:szCs w:val="24"/>
+        </w:rPr>
+        <w:t xml:space="preserve"> loco,</w:t>
+      </w:r>
+    </w:p>
+    <w:p>
+      <w:pPr>
+        <w:tabs>
+          <w:tab w:val="left" w:pos="2400"/>
+        </w:tabs>
+        <w:spacing w:after="0" w:line="360" w:lineRule="auto"/>
+        <w:ind w:firstLine="709"/>
+        <w:jc w:val="both"/>
+        <w:rPr>
+          <w:rFonts w:ascii="Times New Roman" w:hAnsi="Times New Roman" w:cs="Times New Roman"/>
+          <w:b/>
+          <w:sz w:val="24"/>
+          <w:szCs w:val="24"/>
+        </w:rPr>
+      </w:pPr>
+      <w:r>
+        <w:rPr>
+          <w:rFonts w:ascii="Times New Roman" w:hAnsi="Times New Roman" w:cs="Times New Roman"/>
+          <w:b/>
+          <w:sz w:val="24"/>
+          <w:szCs w:val="24"/>
+        </w:rPr>
+        <w:t>abreviada, entre colchetes [</w:t>
+      </w:r>
+      <w:proofErr w:type="spellStart"/>
+      <w:r>
+        <w:rPr>
+          <w:rFonts w:ascii="Times New Roman" w:hAnsi="Times New Roman" w:cs="Times New Roman"/>
+          <w:b/>
+          <w:sz w:val="24"/>
+          <w:szCs w:val="24"/>
+        </w:rPr>
+        <w:t>S.l</w:t>
+      </w:r>
+      <w:proofErr w:type="spellEnd"/>
+      <w:r>
+        <w:rPr>
+          <w:rFonts w:ascii="Times New Roman" w:hAnsi="Times New Roman" w:cs="Times New Roman"/>
+          <w:b/>
+          <w:sz w:val="24"/>
+          <w:szCs w:val="24"/>
+        </w:rPr>
+        <w:t>.]</w:t>
+      </w:r>
+    </w:p>
+    <w:p>
+      <w:pPr>
+        <w:tabs>
+          <w:tab w:val="left" w:pos="2400"/>
+        </w:tabs>
+        <w:spacing w:after="0" w:line="360" w:lineRule="auto"/>
+        <w:ind w:firstLine="709"/>
+        <w:jc w:val="both"/>
+        <w:rPr>
+          <w:rFonts w:ascii="Times New Roman" w:hAnsi="Times New Roman" w:cs="Times New Roman"/>
+          <w:b/>
+          <w:sz w:val="24"/>
+          <w:szCs w:val="24"/>
+        </w:rPr>
+      </w:pPr>
+      <w:r>
+        <w:rPr>
+          <w:rFonts w:ascii="Times New Roman" w:hAnsi="Times New Roman" w:cs="Times New Roman"/>
+          <w:b/>
+          <w:sz w:val="24"/>
+          <w:szCs w:val="24"/>
+        </w:rPr>
+        <w:t xml:space="preserve">Quando a editora não puder ser identificada, deve-se indicar a expressão </w:t>
+      </w:r>
+      <w:proofErr w:type="spellStart"/>
+      <w:r>
+        <w:rPr>
+          <w:rFonts w:ascii="Times New Roman" w:hAnsi="Times New Roman" w:cs="Times New Roman"/>
+          <w:b/>
+          <w:sz w:val="24"/>
+          <w:szCs w:val="24"/>
+        </w:rPr>
+        <w:t>sine</w:t>
+      </w:r>
+      <w:proofErr w:type="spellEnd"/>
     </w:p>
     <w:p>
       <w:pPr>
@@ -5977,19 +6348,19 @@
       </w:r>
     </w:p>
     <w:sectPr>
-      <w:headerReference r:id="rId5" w:type="default"/>
+      <w:headerReference w:type="default" r:id="rId19"/>
       <w:pgSz w:w="11906" w:h="16838"/>
       <w:pgMar w:top="1417" w:right="1701" w:bottom="1417" w:left="1701" w:header="850" w:footer="850" w:gutter="0"/>
-      <w:cols w:space="708" w:num="1"/>
-      <w:docGrid w:linePitch="360" w:charSpace="0"/>
+      <w:cols w:space="708"/>
+      <w:docGrid w:linePitch="360"/>
     </w:sectPr>
   </w:body>
 </w:document>
 </file>
 
 <file path=word/endnotes.xml><?xml version="1.0" encoding="utf-8"?>
-<w:endnotes xmlns:wpc="http://schemas.microsoft.com/office/word/2010/wordprocessingCanvas" xmlns:mc="http://schemas.openxmlformats.org/markup-compatibility/2006" xmlns:o="urn:schemas-microsoft-com:office:office" xmlns:r="http://schemas.openxmlformats.org/officeDocument/2006/relationships" xmlns:m="http://schemas.openxmlformats.org/officeDocument/2006/math" xmlns:v="urn:schemas-microsoft-com:vml" xmlns:wp14="http://schemas.microsoft.com/office/word/2010/wordprocessingDrawing" xmlns:wp="http://schemas.openxmlformats.org/drawingml/2006/wordprocessingDrawing" xmlns:w="http://schemas.openxmlformats.org/wordprocessingml/2006/main" xmlns:w14="http://schemas.microsoft.com/office/word/2010/wordml" xmlns:w15="http://schemas.microsoft.com/office/word/2012/wordml" xmlns:w10="urn:schemas-microsoft-com:office:word" xmlns:wpg="http://schemas.microsoft.com/office/word/2010/wordprocessingGroup" xmlns:wpi="http://schemas.microsoft.com/office/word/2010/wordprocessingInk" xmlns:wne="http://schemas.microsoft.com/office/word/2006/wordml" xmlns:wps="http://schemas.microsoft.com/office/word/2010/wordprocessingShape" xmlns:wpsCustomData="http://www.wps.cn/officeDocument/2013/wpsCustomData" mc:Ignorable="w14 w15 wp14">
-  <w:endnote w:type="separator" w:id="0">
+<w:endnotes xmlns:wpc="http://schemas.microsoft.com/office/word/2010/wordprocessingCanvas" xmlns:cx="http://schemas.microsoft.com/office/drawing/2014/chartex" xmlns:cx1="http://schemas.microsoft.com/office/drawing/2015/9/8/chartex" xmlns:cx2="http://schemas.microsoft.com/office/drawing/2015/10/21/chartex" xmlns:cx3="http://schemas.microsoft.com/office/drawing/2016/5/9/chartex" xmlns:cx4="http://schemas.microsoft.com/office/drawing/2016/5/10/chartex" xmlns:cx5="http://schemas.microsoft.com/office/drawing/2016/5/11/chartex" xmlns:cx6="http://schemas.microsoft.com/office/drawing/2016/5/12/chartex" xmlns:cx7="http://schemas.microsoft.com/office/drawing/2016/5/13/chartex" xmlns:cx8="http://schemas.microsoft.com/office/drawing/2016/5/14/chartex" xmlns:mc="http://schemas.openxmlformats.org/markup-compatibility/2006" xmlns:aink="http://schemas.microsoft.com/office/drawing/2016/ink" xmlns:am3d="http://schemas.microsoft.com/office/drawing/2017/model3d" xmlns:o="urn:schemas-microsoft-com:office:office" xmlns:r="http://schemas.openxmlformats.org/officeDocument/2006/relationships" xmlns:m="http://schemas.openxmlformats.org/officeDocument/2006/math" xmlns:v="urn:schemas-microsoft-com:vml" xmlns:wp14="http://schemas.microsoft.com/office/word/2010/wordprocessingDrawing" xmlns:wp="http://schemas.openxmlformats.org/drawingml/2006/wordprocessingDrawing" xmlns:w10="urn:schemas-microsoft-com:office:word" xmlns:w="http://schemas.openxmlformats.org/wordprocessingml/2006/main" xmlns:w14="http://schemas.microsoft.com/office/word/2010/wordml" xmlns:w15="http://schemas.microsoft.com/office/word/2012/wordml" xmlns:w16cid="http://schemas.microsoft.com/office/word/2016/wordml/cid" xmlns:w16se="http://schemas.microsoft.com/office/word/2015/wordml/symex" xmlns:wpg="http://schemas.microsoft.com/office/word/2010/wordprocessingGroup" xmlns:wpi="http://schemas.microsoft.com/office/word/2010/wordprocessingInk" xmlns:wne="http://schemas.microsoft.com/office/word/2006/wordml" xmlns:wps="http://schemas.microsoft.com/office/word/2010/wordprocessingShape" mc:Ignorable="w14 w15 w16se w16cid wp14">
+  <w:endnote w:type="separator" w:id="-1">
     <w:p>
       <w:pPr>
         <w:spacing w:line="240" w:lineRule="auto"/>
@@ -5999,7 +6370,7 @@
       </w:r>
     </w:p>
   </w:endnote>
-  <w:endnote w:type="continuationSeparator" w:id="1">
+  <w:endnote w:type="continuationSeparator" w:id="0">
     <w:p>
       <w:pPr>
         <w:spacing w:line="240" w:lineRule="auto"/>
@@ -6013,21 +6384,21 @@
 </file>
 
 <file path=word/footnotes.xml><?xml version="1.0" encoding="utf-8"?>
-<w:footnotes xmlns:wpc="http://schemas.microsoft.com/office/word/2010/wordprocessingCanvas" xmlns:mc="http://schemas.openxmlformats.org/markup-compatibility/2006" xmlns:o="urn:schemas-microsoft-com:office:office" xmlns:r="http://schemas.openxmlformats.org/officeDocument/2006/relationships" xmlns:m="http://schemas.openxmlformats.org/officeDocument/2006/math" xmlns:v="urn:schemas-microsoft-com:vml" xmlns:wp14="http://schemas.microsoft.com/office/word/2010/wordprocessingDrawing" xmlns:wp="http://schemas.openxmlformats.org/drawingml/2006/wordprocessingDrawing" xmlns:w="http://schemas.openxmlformats.org/wordprocessingml/2006/main" xmlns:w14="http://schemas.microsoft.com/office/word/2010/wordml" xmlns:w15="http://schemas.microsoft.com/office/word/2012/wordml" xmlns:w10="urn:schemas-microsoft-com:office:word" xmlns:wpg="http://schemas.microsoft.com/office/word/2010/wordprocessingGroup" xmlns:wpi="http://schemas.microsoft.com/office/word/2010/wordprocessingInk" xmlns:wne="http://schemas.microsoft.com/office/word/2006/wordml" xmlns:wps="http://schemas.microsoft.com/office/word/2010/wordprocessingShape" xmlns:wpsCustomData="http://www.wps.cn/officeDocument/2013/wpsCustomData" mc:Ignorable="w14 w15 wp14">
-  <w:footnote w:type="separator" w:id="0">
-    <w:p>
-      <w:pPr>
-        <w:spacing w:before="0" w:after="0" w:line="259" w:lineRule="auto"/>
+<w:footnotes xmlns:wpc="http://schemas.microsoft.com/office/word/2010/wordprocessingCanvas" xmlns:cx="http://schemas.microsoft.com/office/drawing/2014/chartex" xmlns:cx1="http://schemas.microsoft.com/office/drawing/2015/9/8/chartex" xmlns:cx2="http://schemas.microsoft.com/office/drawing/2015/10/21/chartex" xmlns:cx3="http://schemas.microsoft.com/office/drawing/2016/5/9/chartex" xmlns:cx4="http://schemas.microsoft.com/office/drawing/2016/5/10/chartex" xmlns:cx5="http://schemas.microsoft.com/office/drawing/2016/5/11/chartex" xmlns:cx6="http://schemas.microsoft.com/office/drawing/2016/5/12/chartex" xmlns:cx7="http://schemas.microsoft.com/office/drawing/2016/5/13/chartex" xmlns:cx8="http://schemas.microsoft.com/office/drawing/2016/5/14/chartex" xmlns:mc="http://schemas.openxmlformats.org/markup-compatibility/2006" xmlns:aink="http://schemas.microsoft.com/office/drawing/2016/ink" xmlns:am3d="http://schemas.microsoft.com/office/drawing/2017/model3d" xmlns:o="urn:schemas-microsoft-com:office:office" xmlns:r="http://schemas.openxmlformats.org/officeDocument/2006/relationships" xmlns:m="http://schemas.openxmlformats.org/officeDocument/2006/math" xmlns:v="urn:schemas-microsoft-com:vml" xmlns:wp14="http://schemas.microsoft.com/office/word/2010/wordprocessingDrawing" xmlns:wp="http://schemas.openxmlformats.org/drawingml/2006/wordprocessingDrawing" xmlns:w10="urn:schemas-microsoft-com:office:word" xmlns:w="http://schemas.openxmlformats.org/wordprocessingml/2006/main" xmlns:w14="http://schemas.microsoft.com/office/word/2010/wordml" xmlns:w15="http://schemas.microsoft.com/office/word/2012/wordml" xmlns:w16cid="http://schemas.microsoft.com/office/word/2016/wordml/cid" xmlns:w16se="http://schemas.microsoft.com/office/word/2015/wordml/symex" xmlns:wpg="http://schemas.microsoft.com/office/word/2010/wordprocessingGroup" xmlns:wpi="http://schemas.microsoft.com/office/word/2010/wordprocessingInk" xmlns:wne="http://schemas.microsoft.com/office/word/2006/wordml" xmlns:wps="http://schemas.microsoft.com/office/word/2010/wordprocessingShape" mc:Ignorable="w14 w15 w16se w16cid wp14">
+  <w:footnote w:type="separator" w:id="-1">
+    <w:p>
+      <w:pPr>
+        <w:spacing w:after="0"/>
       </w:pPr>
       <w:r>
         <w:separator/>
       </w:r>
     </w:p>
   </w:footnote>
-  <w:footnote w:type="continuationSeparator" w:id="1">
-    <w:p>
-      <w:pPr>
-        <w:spacing w:before="0" w:after="0" w:line="259" w:lineRule="auto"/>
+  <w:footnote w:type="continuationSeparator" w:id="0">
+    <w:p>
+      <w:pPr>
+        <w:spacing w:after="0"/>
       </w:pPr>
       <w:r>
         <w:continuationSeparator/>
@@ -6038,14 +6409,14 @@
 </file>
 
 <file path=word/header1.xml><?xml version="1.0" encoding="utf-8"?>
-<w:hdr xmlns:wpc="http://schemas.microsoft.com/office/word/2010/wordprocessingCanvas" xmlns:mc="http://schemas.openxmlformats.org/markup-compatibility/2006" xmlns:o="urn:schemas-microsoft-com:office:office" xmlns:r="http://schemas.openxmlformats.org/officeDocument/2006/relationships" xmlns:m="http://schemas.openxmlformats.org/officeDocument/2006/math" xmlns:v="urn:schemas-microsoft-com:vml" xmlns:wp14="http://schemas.microsoft.com/office/word/2010/wordprocessingDrawing" xmlns:wp="http://schemas.openxmlformats.org/drawingml/2006/wordprocessingDrawing" xmlns:w10="urn:schemas-microsoft-com:office:word" xmlns:w="http://schemas.openxmlformats.org/wordprocessingml/2006/main" xmlns:w14="http://schemas.microsoft.com/office/word/2010/wordml" xmlns:w15="http://schemas.microsoft.com/office/word/2012/wordml" xmlns:wpg="http://schemas.microsoft.com/office/word/2010/wordprocessingGroup" xmlns:wpi="http://schemas.microsoft.com/office/word/2010/wordprocessingInk" xmlns:wne="http://schemas.microsoft.com/office/word/2006/wordml" xmlns:wps="http://schemas.microsoft.com/office/word/2010/wordprocessingShape" xmlns:wpsCustomData="http://www.wps.cn/officeDocument/2013/wpsCustomData" mc:Ignorable="w14 w15 wp14">
+<w:hdr xmlns:wpc="http://schemas.microsoft.com/office/word/2010/wordprocessingCanvas" xmlns:cx="http://schemas.microsoft.com/office/drawing/2014/chartex" xmlns:cx1="http://schemas.microsoft.com/office/drawing/2015/9/8/chartex" xmlns:cx2="http://schemas.microsoft.com/office/drawing/2015/10/21/chartex" xmlns:cx3="http://schemas.microsoft.com/office/drawing/2016/5/9/chartex" xmlns:cx4="http://schemas.microsoft.com/office/drawing/2016/5/10/chartex" xmlns:cx5="http://schemas.microsoft.com/office/drawing/2016/5/11/chartex" xmlns:cx6="http://schemas.microsoft.com/office/drawing/2016/5/12/chartex" xmlns:cx7="http://schemas.microsoft.com/office/drawing/2016/5/13/chartex" xmlns:cx8="http://schemas.microsoft.com/office/drawing/2016/5/14/chartex" xmlns:mc="http://schemas.openxmlformats.org/markup-compatibility/2006" xmlns:aink="http://schemas.microsoft.com/office/drawing/2016/ink" xmlns:am3d="http://schemas.microsoft.com/office/drawing/2017/model3d" xmlns:o="urn:schemas-microsoft-com:office:office" xmlns:r="http://schemas.openxmlformats.org/officeDocument/2006/relationships" xmlns:m="http://schemas.openxmlformats.org/officeDocument/2006/math" xmlns:v="urn:schemas-microsoft-com:vml" xmlns:wp14="http://schemas.microsoft.com/office/word/2010/wordprocessingDrawing" xmlns:wp="http://schemas.openxmlformats.org/drawingml/2006/wordprocessingDrawing" xmlns:w10="urn:schemas-microsoft-com:office:word" xmlns:w="http://schemas.openxmlformats.org/wordprocessingml/2006/main" xmlns:w14="http://schemas.microsoft.com/office/word/2010/wordml" xmlns:w15="http://schemas.microsoft.com/office/word/2012/wordml" xmlns:w16cid="http://schemas.microsoft.com/office/word/2016/wordml/cid" xmlns:w16se="http://schemas.microsoft.com/office/word/2015/wordml/symex" xmlns:wpg="http://schemas.microsoft.com/office/word/2010/wordprocessingGroup" xmlns:wpi="http://schemas.microsoft.com/office/word/2010/wordprocessingInk" xmlns:wne="http://schemas.microsoft.com/office/word/2006/wordml" xmlns:wps="http://schemas.microsoft.com/office/word/2010/wordprocessingShape" mc:Ignorable="w14 w15 w16se w16cid wp14">
   <w:p>
     <w:pPr>
-      <w:pStyle w:val="10"/>
+      <w:pStyle w:val="Cabealho"/>
       <w:tabs>
-        <w:tab w:val="left" w:pos="2532"/>
         <w:tab w:val="clear" w:pos="4252"/>
         <w:tab w:val="clear" w:pos="8504"/>
+        <w:tab w:val="left" w:pos="2532"/>
       </w:tabs>
       <w:spacing w:line="360" w:lineRule="auto"/>
       <w:jc w:val="center"/>
@@ -6053,11 +6424,11 @@
   </w:p>
   <w:p>
     <w:pPr>
-      <w:pStyle w:val="10"/>
+      <w:pStyle w:val="Cabealho"/>
       <w:tabs>
-        <w:tab w:val="left" w:pos="2772"/>
         <w:tab w:val="clear" w:pos="4252"/>
         <w:tab w:val="clear" w:pos="8504"/>
+        <w:tab w:val="left" w:pos="2772"/>
       </w:tabs>
     </w:pPr>
   </w:p>
@@ -6065,188 +6436,408 @@
 </file>
 
 <file path=word/styles.xml><?xml version="1.0" encoding="utf-8"?>
-<w:styles xmlns:mc="http://schemas.openxmlformats.org/markup-compatibility/2006" xmlns:o="urn:schemas-microsoft-com:office:office" xmlns:r="http://schemas.openxmlformats.org/officeDocument/2006/relationships" xmlns:m="http://schemas.openxmlformats.org/officeDocument/2006/math" xmlns:v="urn:schemas-microsoft-com:vml" xmlns:w="http://schemas.openxmlformats.org/wordprocessingml/2006/main" xmlns:w14="http://schemas.microsoft.com/office/word/2010/wordml" xmlns:w10="urn:schemas-microsoft-com:office:word" xmlns:sl="http://schemas.openxmlformats.org/schemaLibrary/2006/main" xmlns:wpsCustomData="http://www.wps.cn/officeDocument/2013/wpsCustomData" mc:Ignorable="w14">
+<w:styles xmlns:mc="http://schemas.openxmlformats.org/markup-compatibility/2006" xmlns:r="http://schemas.openxmlformats.org/officeDocument/2006/relationships" xmlns:w="http://schemas.openxmlformats.org/wordprocessingml/2006/main" xmlns:w14="http://schemas.microsoft.com/office/word/2010/wordml" xmlns:w15="http://schemas.microsoft.com/office/word/2012/wordml" xmlns:w16cid="http://schemas.microsoft.com/office/word/2016/wordml/cid" xmlns:w16se="http://schemas.microsoft.com/office/word/2015/wordml/symex" mc:Ignorable="w14 w15 w16se w16cid">
   <w:docDefaults>
     <w:rPrDefault>
       <w:rPr>
-        <w:rFonts w:asciiTheme="minorHAnsi" w:hAnsiTheme="minorHAnsi" w:eastAsiaTheme="minorHAnsi" w:cstheme="minorBidi"/>
+        <w:rFonts w:asciiTheme="minorHAnsi" w:eastAsiaTheme="minorHAnsi" w:hAnsiTheme="minorHAnsi" w:cstheme="minorBidi"/>
+        <w:lang w:val="pt-BR" w:eastAsia="pt-BR" w:bidi="ar-SA"/>
       </w:rPr>
     </w:rPrDefault>
     <w:pPrDefault/>
   </w:docDefaults>
-  <w:latentStyles w:count="260" w:defQFormat="0" w:defUnhideWhenUsed="1" w:defSemiHidden="1" w:defUIPriority="99" w:defLockedState="0">
-    <w:lsdException w:qFormat="1" w:unhideWhenUsed="0" w:uiPriority="0" w:semiHidden="0" w:name="Normal"/>
-    <w:lsdException w:qFormat="1" w:unhideWhenUsed="0" w:uiPriority="9" w:semiHidden="0" w:name="heading 1"/>
-    <w:lsdException w:qFormat="1" w:uiPriority="9" w:name="heading 2"/>
-    <w:lsdException w:qFormat="1" w:uiPriority="9" w:name="heading 3"/>
-    <w:lsdException w:qFormat="1" w:uiPriority="9" w:name="heading 4"/>
-    <w:lsdException w:qFormat="1" w:uiPriority="9" w:name="heading 5"/>
-    <w:lsdException w:qFormat="1" w:uiPriority="9" w:name="heading 6"/>
-    <w:lsdException w:qFormat="1" w:uiPriority="9" w:name="heading 7"/>
-    <w:lsdException w:qFormat="1" w:uiPriority="9" w:name="heading 8"/>
-    <w:lsdException w:qFormat="1" w:uiPriority="9" w:name="heading 9"/>
-    <w:lsdException w:uiPriority="99" w:name="index 1"/>
-    <w:lsdException w:uiPriority="99" w:name="index 2"/>
-    <w:lsdException w:uiPriority="99" w:name="index 3"/>
-    <w:lsdException w:uiPriority="99" w:name="index 4"/>
-    <w:lsdException w:uiPriority="99" w:name="index 5"/>
-    <w:lsdException w:uiPriority="99" w:name="index 6"/>
-    <w:lsdException w:uiPriority="99" w:name="index 7"/>
-    <w:lsdException w:uiPriority="99" w:name="index 8"/>
-    <w:lsdException w:uiPriority="99" w:name="index 9"/>
-    <w:lsdException w:qFormat="1" w:uiPriority="39" w:semiHidden="0" w:name="toc 1"/>
-    <w:lsdException w:qFormat="1" w:uiPriority="39" w:semiHidden="0" w:name="toc 2"/>
-    <w:lsdException w:uiPriority="39" w:name="toc 3"/>
-    <w:lsdException w:uiPriority="39" w:name="toc 4"/>
-    <w:lsdException w:uiPriority="39" w:name="toc 5"/>
-    <w:lsdException w:uiPriority="39" w:name="toc 6"/>
-    <w:lsdException w:uiPriority="39" w:name="toc 7"/>
-    <w:lsdException w:uiPriority="39" w:name="toc 8"/>
-    <w:lsdException w:uiPriority="39" w:name="toc 9"/>
-    <w:lsdException w:uiPriority="99" w:name="Normal Indent"/>
-    <w:lsdException w:uiPriority="99" w:name="footnote text"/>
-    <w:lsdException w:qFormat="1" w:uiPriority="99" w:name="annotation text"/>
-    <w:lsdException w:uiPriority="99" w:semiHidden="0" w:name="header"/>
-    <w:lsdException w:qFormat="1" w:uiPriority="99" w:semiHidden="0" w:name="footer"/>
-    <w:lsdException w:uiPriority="99" w:name="index heading"/>
-    <w:lsdException w:qFormat="1" w:uiPriority="35" w:name="caption"/>
-    <w:lsdException w:uiPriority="99" w:name="table of figures"/>
-    <w:lsdException w:uiPriority="99" w:name="envelope address"/>
-    <w:lsdException w:uiPriority="99" w:name="envelope return"/>
-    <w:lsdException w:uiPriority="99" w:name="footnote reference"/>
-    <w:lsdException w:uiPriority="99" w:name="annotation reference"/>
-    <w:lsdException w:uiPriority="99" w:name="line number"/>
-    <w:lsdException w:uiPriority="99" w:name="page number"/>
-    <w:lsdException w:uiPriority="99" w:name="endnote reference"/>
-    <w:lsdException w:uiPriority="99" w:name="endnote text"/>
-    <w:lsdException w:uiPriority="99" w:name="table of authorities"/>
-    <w:lsdException w:uiPriority="99" w:name="macro"/>
-    <w:lsdException w:uiPriority="99" w:name="toa heading"/>
-    <w:lsdException w:uiPriority="99" w:name="List"/>
-    <w:lsdException w:uiPriority="99" w:name="List Bullet"/>
-    <w:lsdException w:uiPriority="99" w:name="List Number"/>
-    <w:lsdException w:uiPriority="99" w:name="List 2"/>
-    <w:lsdException w:uiPriority="99" w:name="List 3"/>
-    <w:lsdException w:uiPriority="99" w:name="List 4"/>
-    <w:lsdException w:uiPriority="99" w:name="List 5"/>
-    <w:lsdException w:uiPriority="99" w:name="List Bullet 2"/>
-    <w:lsdException w:uiPriority="99" w:name="List Bullet 3"/>
-    <w:lsdException w:uiPriority="99" w:name="List Bullet 4"/>
-    <w:lsdException w:uiPriority="99" w:name="List Bullet 5"/>
-    <w:lsdException w:uiPriority="99" w:name="List Number 2"/>
-    <w:lsdException w:uiPriority="99" w:name="List Number 3"/>
-    <w:lsdException w:uiPriority="99" w:name="List Number 4"/>
-    <w:lsdException w:uiPriority="99" w:name="List Number 5"/>
-    <w:lsdException w:qFormat="1" w:unhideWhenUsed="0" w:uiPriority="10" w:semiHidden="0" w:name="Title"/>
-    <w:lsdException w:uiPriority="99" w:name="Closing"/>
-    <w:lsdException w:uiPriority="99" w:name="Signature"/>
-    <w:lsdException w:qFormat="1" w:uiPriority="1" w:name="Default Paragraph Font"/>
-    <w:lsdException w:uiPriority="99" w:name="Body Text"/>
-    <w:lsdException w:uiPriority="99" w:name="Body Text Indent"/>
-    <w:lsdException w:uiPriority="99" w:name="List Continue"/>
-    <w:lsdException w:uiPriority="99" w:name="List Continue 2"/>
-    <w:lsdException w:uiPriority="99" w:name="List Continue 3"/>
-    <w:lsdException w:uiPriority="99" w:name="List Continue 4"/>
-    <w:lsdException w:uiPriority="99" w:name="List Continue 5"/>
-    <w:lsdException w:uiPriority="99" w:name="Message Header"/>
-    <w:lsdException w:qFormat="1" w:unhideWhenUsed="0" w:uiPriority="11" w:semiHidden="0" w:name="Subtitle"/>
-    <w:lsdException w:uiPriority="99" w:name="Salutation"/>
-    <w:lsdException w:uiPriority="99" w:name="Date"/>
-    <w:lsdException w:uiPriority="99" w:name="Body Text First Indent"/>
-    <w:lsdException w:uiPriority="99" w:name="Body Text First Indent 2"/>
-    <w:lsdException w:uiPriority="99" w:name="Note Heading"/>
-    <w:lsdException w:uiPriority="99" w:name="Body Text 2"/>
-    <w:lsdException w:uiPriority="99" w:name="Body Text 3"/>
-    <w:lsdException w:uiPriority="99" w:name="Body Text Indent 2"/>
-    <w:lsdException w:uiPriority="99" w:name="Body Text Indent 3"/>
-    <w:lsdException w:uiPriority="99" w:name="Block Text"/>
-    <w:lsdException w:qFormat="1" w:uiPriority="99" w:semiHidden="0" w:name="Hyperlink"/>
-    <w:lsdException w:uiPriority="99" w:name="FollowedHyperlink"/>
-    <w:lsdException w:qFormat="1" w:unhideWhenUsed="0" w:uiPriority="22" w:semiHidden="0" w:name="Strong"/>
-    <w:lsdException w:qFormat="1" w:unhideWhenUsed="0" w:uiPriority="20" w:semiHidden="0" w:name="Emphasis"/>
-    <w:lsdException w:uiPriority="99" w:name="Document Map"/>
-    <w:lsdException w:uiPriority="99" w:name="Plain Text"/>
-    <w:lsdException w:uiPriority="99" w:name="E-mail Signature"/>
-    <w:lsdException w:uiPriority="99" w:name="Normal (Web)"/>
-    <w:lsdException w:uiPriority="99" w:name="HTML Acronym"/>
-    <w:lsdException w:uiPriority="99" w:name="HTML Address"/>
-    <w:lsdException w:uiPriority="99" w:name="HTML Cite"/>
-    <w:lsdException w:uiPriority="99" w:name="HTML Code"/>
-    <w:lsdException w:uiPriority="99" w:name="HTML Definition"/>
-    <w:lsdException w:uiPriority="99" w:name="HTML Keyboard"/>
-    <w:lsdException w:uiPriority="99" w:name="HTML Preformatted"/>
-    <w:lsdException w:uiPriority="99" w:name="HTML Sample"/>
-    <w:lsdException w:uiPriority="99" w:name="HTML Typewriter"/>
-    <w:lsdException w:uiPriority="99" w:name="HTML Variable"/>
-    <w:lsdException w:uiPriority="99" w:name="Normal Table"/>
-    <w:lsdException w:uiPriority="99" w:name="annotation subject"/>
-    <w:lsdException w:uiPriority="99" w:name="Table Simple 1"/>
-    <w:lsdException w:uiPriority="99" w:name="Table Simple 2"/>
-    <w:lsdException w:uiPriority="99" w:name="Table Simple 3"/>
-    <w:lsdException w:uiPriority="99" w:name="Table Classic 1"/>
-    <w:lsdException w:uiPriority="99" w:name="Table Classic 2"/>
-    <w:lsdException w:uiPriority="99" w:name="Table Classic 3"/>
-    <w:lsdException w:uiPriority="99" w:name="Table Classic 4"/>
-    <w:lsdException w:uiPriority="99" w:name="Table Colorful 1"/>
-    <w:lsdException w:uiPriority="99" w:name="Table Colorful 2"/>
-    <w:lsdException w:uiPriority="99" w:name="Table Colorful 3"/>
-    <w:lsdException w:uiPriority="99" w:name="Table Columns 1"/>
-    <w:lsdException w:uiPriority="99" w:name="Table Columns 2"/>
-    <w:lsdException w:uiPriority="99" w:name="Table Columns 3"/>
-    <w:lsdException w:uiPriority="99" w:name="Table Columns 4"/>
-    <w:lsdException w:uiPriority="99" w:name="Table Columns 5"/>
-    <w:lsdException w:uiPriority="99" w:name="Table Grid 1"/>
-    <w:lsdException w:uiPriority="99" w:name="Table Grid 2"/>
-    <w:lsdException w:uiPriority="99" w:name="Table Grid 3"/>
-    <w:lsdException w:uiPriority="99" w:name="Table Grid 4"/>
-    <w:lsdException w:uiPriority="99" w:name="Table Grid 5"/>
-    <w:lsdException w:uiPriority="99" w:name="Table Grid 6"/>
-    <w:lsdException w:uiPriority="99" w:name="Table Grid 7"/>
-    <w:lsdException w:uiPriority="99" w:name="Table Grid 8"/>
-    <w:lsdException w:uiPriority="99" w:name="Table List 1"/>
-    <w:lsdException w:uiPriority="99" w:name="Table List 2"/>
-    <w:lsdException w:uiPriority="99" w:name="Table List 3"/>
-    <w:lsdException w:uiPriority="99" w:name="Table List 4"/>
-    <w:lsdException w:uiPriority="99" w:name="Table List 5"/>
-    <w:lsdException w:uiPriority="99" w:name="Table List 6"/>
-    <w:lsdException w:uiPriority="99" w:name="Table List 7"/>
-    <w:lsdException w:uiPriority="99" w:name="Table List 8"/>
-    <w:lsdException w:uiPriority="99" w:name="Table 3D effects 1"/>
-    <w:lsdException w:uiPriority="99" w:name="Table 3D effects 2"/>
-    <w:lsdException w:uiPriority="99" w:name="Table 3D effects 3"/>
-    <w:lsdException w:uiPriority="99" w:name="Table Contemporary"/>
-    <w:lsdException w:uiPriority="99" w:name="Table Elegant"/>
-    <w:lsdException w:uiPriority="99" w:name="Table Professional"/>
-    <w:lsdException w:uiPriority="99" w:name="Table Subtle 1"/>
-    <w:lsdException w:uiPriority="99" w:name="Table Subtle 2"/>
-    <w:lsdException w:uiPriority="99" w:name="Table Web 1"/>
-    <w:lsdException w:uiPriority="99" w:name="Table Web 2"/>
-    <w:lsdException w:uiPriority="99" w:name="Table Web 3"/>
-    <w:lsdException w:uiPriority="99" w:name="Balloon Text"/>
-    <w:lsdException w:unhideWhenUsed="0" w:uiPriority="39" w:semiHidden="0" w:name="Table Grid"/>
-    <w:lsdException w:uiPriority="99" w:name="Table Theme"/>
+  <w:latentStyles w:defLockedState="0" w:defUIPriority="99" w:defSemiHidden="0" w:defUnhideWhenUsed="0" w:defQFormat="0" w:count="375">
+    <w:lsdException w:name="Normal" w:uiPriority="0" w:qFormat="1"/>
+    <w:lsdException w:name="heading 1" w:uiPriority="9" w:qFormat="1"/>
+    <w:lsdException w:name="heading 2" w:semiHidden="1" w:uiPriority="9" w:unhideWhenUsed="1" w:qFormat="1"/>
+    <w:lsdException w:name="heading 3" w:semiHidden="1" w:uiPriority="9" w:unhideWhenUsed="1" w:qFormat="1"/>
+    <w:lsdException w:name="heading 4" w:semiHidden="1" w:uiPriority="9" w:unhideWhenUsed="1" w:qFormat="1"/>
+    <w:lsdException w:name="heading 5" w:semiHidden="1" w:uiPriority="9" w:unhideWhenUsed="1" w:qFormat="1"/>
+    <w:lsdException w:name="heading 6" w:semiHidden="1" w:uiPriority="9" w:unhideWhenUsed="1" w:qFormat="1"/>
+    <w:lsdException w:name="heading 7" w:semiHidden="1" w:uiPriority="9" w:unhideWhenUsed="1" w:qFormat="1"/>
+    <w:lsdException w:name="heading 8" w:semiHidden="1" w:uiPriority="9" w:unhideWhenUsed="1" w:qFormat="1"/>
+    <w:lsdException w:name="heading 9" w:semiHidden="1" w:uiPriority="9" w:unhideWhenUsed="1" w:qFormat="1"/>
+    <w:lsdException w:name="index 1" w:semiHidden="1" w:unhideWhenUsed="1"/>
+    <w:lsdException w:name="index 2" w:semiHidden="1" w:unhideWhenUsed="1"/>
+    <w:lsdException w:name="index 3" w:semiHidden="1" w:unhideWhenUsed="1"/>
+    <w:lsdException w:name="index 4" w:semiHidden="1" w:unhideWhenUsed="1"/>
+    <w:lsdException w:name="index 5" w:semiHidden="1" w:unhideWhenUsed="1"/>
+    <w:lsdException w:name="index 6" w:semiHidden="1" w:unhideWhenUsed="1"/>
+    <w:lsdException w:name="index 7" w:semiHidden="1" w:unhideWhenUsed="1"/>
+    <w:lsdException w:name="index 8" w:semiHidden="1" w:unhideWhenUsed="1"/>
+    <w:lsdException w:name="index 9" w:semiHidden="1" w:unhideWhenUsed="1"/>
+    <w:lsdException w:name="toc 1" w:uiPriority="39" w:unhideWhenUsed="1" w:qFormat="1"/>
+    <w:lsdException w:name="toc 2" w:uiPriority="39" w:unhideWhenUsed="1" w:qFormat="1"/>
+    <w:lsdException w:name="toc 3" w:semiHidden="1" w:uiPriority="39" w:unhideWhenUsed="1"/>
+    <w:lsdException w:name="toc 4" w:semiHidden="1" w:uiPriority="39" w:unhideWhenUsed="1"/>
+    <w:lsdException w:name="toc 5" w:semiHidden="1" w:uiPriority="39" w:unhideWhenUsed="1"/>
+    <w:lsdException w:name="toc 6" w:semiHidden="1" w:uiPriority="39" w:unhideWhenUsed="1"/>
+    <w:lsdException w:name="toc 7" w:semiHidden="1" w:uiPriority="39" w:unhideWhenUsed="1"/>
+    <w:lsdException w:name="toc 8" w:semiHidden="1" w:uiPriority="39" w:unhideWhenUsed="1"/>
+    <w:lsdException w:name="toc 9" w:semiHidden="1" w:uiPriority="39" w:unhideWhenUsed="1"/>
+    <w:lsdException w:name="Normal Indent" w:semiHidden="1" w:unhideWhenUsed="1"/>
+    <w:lsdException w:name="footnote text" w:semiHidden="1" w:unhideWhenUsed="1"/>
+    <w:lsdException w:name="annotation text" w:semiHidden="1" w:unhideWhenUsed="1" w:qFormat="1"/>
+    <w:lsdException w:name="header" w:unhideWhenUsed="1"/>
+    <w:lsdException w:name="footer" w:unhideWhenUsed="1" w:qFormat="1"/>
+    <w:lsdException w:name="index heading" w:semiHidden="1" w:unhideWhenUsed="1"/>
+    <w:lsdException w:name="caption" w:semiHidden="1" w:uiPriority="35" w:unhideWhenUsed="1" w:qFormat="1"/>
+    <w:lsdException w:name="table of figures" w:semiHidden="1" w:unhideWhenUsed="1"/>
+    <w:lsdException w:name="envelope address" w:semiHidden="1" w:unhideWhenUsed="1"/>
+    <w:lsdException w:name="envelope return" w:semiHidden="1" w:unhideWhenUsed="1"/>
+    <w:lsdException w:name="footnote reference" w:semiHidden="1" w:unhideWhenUsed="1"/>
+    <w:lsdException w:name="annotation reference" w:semiHidden="1" w:unhideWhenUsed="1"/>
+    <w:lsdException w:name="line number" w:semiHidden="1" w:unhideWhenUsed="1"/>
+    <w:lsdException w:name="page number" w:semiHidden="1" w:unhideWhenUsed="1"/>
+    <w:lsdException w:name="endnote reference" w:semiHidden="1" w:unhideWhenUsed="1"/>
+    <w:lsdException w:name="endnote text" w:semiHidden="1" w:unhideWhenUsed="1"/>
+    <w:lsdException w:name="table of authorities" w:semiHidden="1" w:unhideWhenUsed="1"/>
+    <w:lsdException w:name="macro" w:semiHidden="1" w:unhideWhenUsed="1"/>
+    <w:lsdException w:name="toa heading" w:semiHidden="1" w:unhideWhenUsed="1"/>
+    <w:lsdException w:name="List" w:semiHidden="1" w:unhideWhenUsed="1"/>
+    <w:lsdException w:name="List Bullet" w:semiHidden="1" w:unhideWhenUsed="1"/>
+    <w:lsdException w:name="List Number" w:semiHidden="1" w:unhideWhenUsed="1"/>
+    <w:lsdException w:name="List 2" w:semiHidden="1" w:unhideWhenUsed="1"/>
+    <w:lsdException w:name="List 3" w:semiHidden="1" w:unhideWhenUsed="1"/>
+    <w:lsdException w:name="List 4" w:semiHidden="1" w:unhideWhenUsed="1"/>
+    <w:lsdException w:name="List 5" w:semiHidden="1" w:unhideWhenUsed="1"/>
+    <w:lsdException w:name="List Bullet 2" w:semiHidden="1" w:unhideWhenUsed="1"/>
+    <w:lsdException w:name="List Bullet 3" w:semiHidden="1" w:unhideWhenUsed="1"/>
+    <w:lsdException w:name="List Bullet 4" w:semiHidden="1" w:unhideWhenUsed="1"/>
+    <w:lsdException w:name="List Bullet 5" w:semiHidden="1" w:unhideWhenUsed="1"/>
+    <w:lsdException w:name="List Number 2" w:semiHidden="1" w:unhideWhenUsed="1"/>
+    <w:lsdException w:name="List Number 3" w:semiHidden="1" w:unhideWhenUsed="1"/>
+    <w:lsdException w:name="List Number 4" w:semiHidden="1" w:unhideWhenUsed="1"/>
+    <w:lsdException w:name="List Number 5" w:semiHidden="1" w:unhideWhenUsed="1"/>
+    <w:lsdException w:name="Title" w:uiPriority="10" w:qFormat="1"/>
+    <w:lsdException w:name="Closing" w:semiHidden="1" w:unhideWhenUsed="1"/>
+    <w:lsdException w:name="Signature" w:semiHidden="1" w:unhideWhenUsed="1"/>
+    <w:lsdException w:name="Default Paragraph Font" w:semiHidden="1" w:uiPriority="1" w:unhideWhenUsed="1" w:qFormat="1"/>
+    <w:lsdException w:name="Body Text" w:semiHidden="1" w:unhideWhenUsed="1"/>
+    <w:lsdException w:name="Body Text Indent" w:semiHidden="1" w:unhideWhenUsed="1"/>
+    <w:lsdException w:name="List Continue" w:semiHidden="1" w:unhideWhenUsed="1"/>
+    <w:lsdException w:name="List Continue 2" w:semiHidden="1" w:unhideWhenUsed="1"/>
+    <w:lsdException w:name="List Continue 3" w:semiHidden="1" w:unhideWhenUsed="1"/>
+    <w:lsdException w:name="List Continue 4" w:semiHidden="1" w:unhideWhenUsed="1"/>
+    <w:lsdException w:name="List Continue 5" w:semiHidden="1" w:unhideWhenUsed="1"/>
+    <w:lsdException w:name="Message Header" w:semiHidden="1" w:unhideWhenUsed="1"/>
+    <w:lsdException w:name="Subtitle" w:uiPriority="11" w:qFormat="1"/>
+    <w:lsdException w:name="Salutation" w:semiHidden="1" w:unhideWhenUsed="1"/>
+    <w:lsdException w:name="Date" w:semiHidden="1" w:unhideWhenUsed="1"/>
+    <w:lsdException w:name="Body Text First Indent" w:semiHidden="1" w:unhideWhenUsed="1"/>
+    <w:lsdException w:name="Body Text First Indent 2" w:semiHidden="1" w:unhideWhenUsed="1"/>
+    <w:lsdException w:name="Note Heading" w:semiHidden="1" w:unhideWhenUsed="1"/>
+    <w:lsdException w:name="Body Text 2" w:semiHidden="1" w:unhideWhenUsed="1"/>
+    <w:lsdException w:name="Body Text 3" w:semiHidden="1" w:unhideWhenUsed="1"/>
+    <w:lsdException w:name="Body Text Indent 2" w:semiHidden="1" w:unhideWhenUsed="1"/>
+    <w:lsdException w:name="Body Text Indent 3" w:semiHidden="1" w:unhideWhenUsed="1"/>
+    <w:lsdException w:name="Block Text" w:semiHidden="1" w:unhideWhenUsed="1"/>
+    <w:lsdException w:name="Hyperlink" w:unhideWhenUsed="1" w:qFormat="1"/>
+    <w:lsdException w:name="FollowedHyperlink" w:semiHidden="1" w:unhideWhenUsed="1"/>
+    <w:lsdException w:name="Strong" w:uiPriority="22" w:qFormat="1"/>
+    <w:lsdException w:name="Emphasis" w:uiPriority="20" w:qFormat="1"/>
+    <w:lsdException w:name="Document Map" w:semiHidden="1" w:unhideWhenUsed="1"/>
+    <w:lsdException w:name="Plain Text" w:semiHidden="1" w:unhideWhenUsed="1"/>
+    <w:lsdException w:name="E-mail Signature" w:semiHidden="1" w:unhideWhenUsed="1"/>
+    <w:lsdException w:name="HTML Top of Form" w:semiHidden="1" w:unhideWhenUsed="1"/>
+    <w:lsdException w:name="HTML Bottom of Form" w:semiHidden="1" w:unhideWhenUsed="1"/>
+    <w:lsdException w:name="Normal (Web)" w:semiHidden="1" w:unhideWhenUsed="1"/>
+    <w:lsdException w:name="HTML Acronym" w:semiHidden="1" w:unhideWhenUsed="1"/>
+    <w:lsdException w:name="HTML Address" w:semiHidden="1" w:unhideWhenUsed="1"/>
+    <w:lsdException w:name="HTML Cite" w:semiHidden="1" w:unhideWhenUsed="1"/>
+    <w:lsdException w:name="HTML Code" w:semiHidden="1" w:unhideWhenUsed="1"/>
+    <w:lsdException w:name="HTML Definition" w:semiHidden="1" w:unhideWhenUsed="1"/>
+    <w:lsdException w:name="HTML Keyboard" w:semiHidden="1" w:unhideWhenUsed="1"/>
+    <w:lsdException w:name="HTML Preformatted" w:semiHidden="1" w:unhideWhenUsed="1"/>
+    <w:lsdException w:name="HTML Sample" w:semiHidden="1" w:unhideWhenUsed="1"/>
+    <w:lsdException w:name="HTML Typewriter" w:semiHidden="1" w:unhideWhenUsed="1"/>
+    <w:lsdException w:name="HTML Variable" w:semiHidden="1" w:unhideWhenUsed="1"/>
+    <w:lsdException w:name="Normal Table" w:semiHidden="1" w:unhideWhenUsed="1"/>
+    <w:lsdException w:name="annotation subject" w:semiHidden="1" w:unhideWhenUsed="1"/>
+    <w:lsdException w:name="No List" w:semiHidden="1" w:unhideWhenUsed="1"/>
+    <w:lsdException w:name="Outline List 1" w:semiHidden="1" w:unhideWhenUsed="1"/>
+    <w:lsdException w:name="Outline List 2" w:semiHidden="1" w:unhideWhenUsed="1"/>
+    <w:lsdException w:name="Outline List 3" w:semiHidden="1" w:unhideWhenUsed="1"/>
+    <w:lsdException w:name="Table Simple 1" w:semiHidden="1" w:unhideWhenUsed="1"/>
+    <w:lsdException w:name="Table Simple 2" w:semiHidden="1" w:unhideWhenUsed="1"/>
+    <w:lsdException w:name="Table Simple 3" w:semiHidden="1" w:unhideWhenUsed="1"/>
+    <w:lsdException w:name="Table Classic 1" w:semiHidden="1" w:unhideWhenUsed="1"/>
+    <w:lsdException w:name="Table Classic 2" w:semiHidden="1" w:unhideWhenUsed="1"/>
+    <w:lsdException w:name="Table Classic 3" w:semiHidden="1" w:unhideWhenUsed="1"/>
+    <w:lsdException w:name="Table Classic 4" w:semiHidden="1" w:unhideWhenUsed="1"/>
+    <w:lsdException w:name="Table Colorful 1" w:semiHidden="1" w:unhideWhenUsed="1"/>
+    <w:lsdException w:name="Table Colorful 2" w:semiHidden="1" w:unhideWhenUsed="1"/>
+    <w:lsdException w:name="Table Colorful 3" w:semiHidden="1" w:unhideWhenUsed="1"/>
+    <w:lsdException w:name="Table Columns 1" w:semiHidden="1" w:unhideWhenUsed="1"/>
+    <w:lsdException w:name="Table Columns 2" w:semiHidden="1" w:unhideWhenUsed="1"/>
+    <w:lsdException w:name="Table Columns 3" w:semiHidden="1" w:unhideWhenUsed="1"/>
+    <w:lsdException w:name="Table Columns 4" w:semiHidden="1" w:unhideWhenUsed="1"/>
+    <w:lsdException w:name="Table Columns 5" w:semiHidden="1" w:unhideWhenUsed="1"/>
+    <w:lsdException w:name="Table Grid 1" w:semiHidden="1" w:unhideWhenUsed="1"/>
+    <w:lsdException w:name="Table Grid 2" w:semiHidden="1" w:unhideWhenUsed="1"/>
+    <w:lsdException w:name="Table Grid 3" w:semiHidden="1" w:unhideWhenUsed="1"/>
+    <w:lsdException w:name="Table Grid 4" w:semiHidden="1" w:unhideWhenUsed="1"/>
+    <w:lsdException w:name="Table Grid 5" w:semiHidden="1" w:unhideWhenUsed="1"/>
+    <w:lsdException w:name="Table Grid 6" w:semiHidden="1" w:unhideWhenUsed="1"/>
+    <w:lsdException w:name="Table Grid 7" w:semiHidden="1" w:unhideWhenUsed="1"/>
+    <w:lsdException w:name="Table Grid 8" w:semiHidden="1" w:unhideWhenUsed="1"/>
+    <w:lsdException w:name="Table List 1" w:semiHidden="1" w:unhideWhenUsed="1"/>
+    <w:lsdException w:name="Table List 2" w:semiHidden="1" w:unhideWhenUsed="1"/>
+    <w:lsdException w:name="Table List 3" w:semiHidden="1" w:unhideWhenUsed="1"/>
+    <w:lsdException w:name="Table List 4" w:semiHidden="1" w:unhideWhenUsed="1"/>
+    <w:lsdException w:name="Table List 5" w:semiHidden="1" w:unhideWhenUsed="1"/>
+    <w:lsdException w:name="Table List 6" w:semiHidden="1" w:unhideWhenUsed="1"/>
+    <w:lsdException w:name="Table List 7" w:semiHidden="1" w:unhideWhenUsed="1"/>
+    <w:lsdException w:name="Table List 8" w:semiHidden="1" w:unhideWhenUsed="1"/>
+    <w:lsdException w:name="Table 3D effects 1" w:semiHidden="1" w:unhideWhenUsed="1"/>
+    <w:lsdException w:name="Table 3D effects 2" w:semiHidden="1" w:unhideWhenUsed="1"/>
+    <w:lsdException w:name="Table 3D effects 3" w:semiHidden="1" w:unhideWhenUsed="1"/>
+    <w:lsdException w:name="Table Contemporary" w:semiHidden="1" w:unhideWhenUsed="1"/>
+    <w:lsdException w:name="Table Elegant" w:semiHidden="1" w:unhideWhenUsed="1"/>
+    <w:lsdException w:name="Table Professional" w:semiHidden="1" w:unhideWhenUsed="1"/>
+    <w:lsdException w:name="Table Subtle 1" w:semiHidden="1" w:unhideWhenUsed="1"/>
+    <w:lsdException w:name="Table Subtle 2" w:semiHidden="1" w:unhideWhenUsed="1"/>
+    <w:lsdException w:name="Table Web 1" w:semiHidden="1" w:unhideWhenUsed="1"/>
+    <w:lsdException w:name="Table Web 2" w:semiHidden="1" w:unhideWhenUsed="1"/>
+    <w:lsdException w:name="Table Web 3" w:semiHidden="1" w:unhideWhenUsed="1"/>
+    <w:lsdException w:name="Balloon Text" w:semiHidden="1" w:unhideWhenUsed="1"/>
+    <w:lsdException w:name="Table Grid" w:uiPriority="39"/>
+    <w:lsdException w:name="Table Theme" w:semiHidden="1" w:unhideWhenUsed="1"/>
+    <w:lsdException w:name="Placeholder Text" w:semiHidden="1"/>
+    <w:lsdException w:name="Light Shading"/>
+    <w:lsdException w:name="Light List"/>
+    <w:lsdException w:name="Light Grid"/>
+    <w:lsdException w:name="Medium Shading 1"/>
+    <w:lsdException w:name="Medium Shading 2"/>
+    <w:lsdException w:name="Medium List 1"/>
+    <w:lsdException w:name="Medium List 2"/>
+    <w:lsdException w:name="Medium Grid 1"/>
+    <w:lsdException w:name="Medium Grid 2"/>
+    <w:lsdException w:name="Medium Grid 3"/>
+    <w:lsdException w:name="Dark List"/>
+    <w:lsdException w:name="Colorful Shading"/>
+    <w:lsdException w:name="Colorful List"/>
+    <w:lsdException w:name="Colorful Grid"/>
+    <w:lsdException w:name="Light Shading Accent 1"/>
+    <w:lsdException w:name="Light List Accent 1"/>
+    <w:lsdException w:name="Light Grid Accent 1"/>
+    <w:lsdException w:name="Medium Shading 1 Accent 1"/>
+    <w:lsdException w:name="Medium Shading 2 Accent 1"/>
+    <w:lsdException w:name="Medium List 1 Accent 1"/>
+    <w:lsdException w:name="Revision" w:semiHidden="1"/>
+    <w:lsdException w:name="Medium List 2 Accent 1"/>
+    <w:lsdException w:name="Medium Grid 1 Accent 1"/>
+    <w:lsdException w:name="Medium Grid 2 Accent 1"/>
+    <w:lsdException w:name="Medium Grid 3 Accent 1"/>
+    <w:lsdException w:name="Dark List Accent 1"/>
+    <w:lsdException w:name="Colorful Shading Accent 1"/>
+    <w:lsdException w:name="Colorful List Accent 1"/>
+    <w:lsdException w:name="Colorful Grid Accent 1"/>
+    <w:lsdException w:name="Light Shading Accent 2"/>
+    <w:lsdException w:name="Light List Accent 2"/>
+    <w:lsdException w:name="Light Grid Accent 2"/>
+    <w:lsdException w:name="Medium Shading 1 Accent 2"/>
+    <w:lsdException w:name="Medium Shading 2 Accent 2"/>
+    <w:lsdException w:name="Medium List 1 Accent 2"/>
+    <w:lsdException w:name="Medium List 2 Accent 2"/>
+    <w:lsdException w:name="Medium Grid 1 Accent 2"/>
+    <w:lsdException w:name="Medium Grid 2 Accent 2"/>
+    <w:lsdException w:name="Medium Grid 3 Accent 2"/>
+    <w:lsdException w:name="Dark List Accent 2"/>
+    <w:lsdException w:name="Colorful Shading Accent 2"/>
+    <w:lsdException w:name="Colorful List Accent 2"/>
+    <w:lsdException w:name="Colorful Grid Accent 2"/>
+    <w:lsdException w:name="Light Shading Accent 3"/>
+    <w:lsdException w:name="Light List Accent 3"/>
+    <w:lsdException w:name="Light Grid Accent 3"/>
+    <w:lsdException w:name="Medium Shading 1 Accent 3"/>
+    <w:lsdException w:name="Medium Shading 2 Accent 3"/>
+    <w:lsdException w:name="Medium List 1 Accent 3"/>
+    <w:lsdException w:name="Medium List 2 Accent 3"/>
+    <w:lsdException w:name="Medium Grid 1 Accent 3"/>
+    <w:lsdException w:name="Medium Grid 2 Accent 3"/>
+    <w:lsdException w:name="Medium Grid 3 Accent 3"/>
+    <w:lsdException w:name="Dark List Accent 3"/>
+    <w:lsdException w:name="Colorful Shading Accent 3"/>
+    <w:lsdException w:name="Colorful List Accent 3"/>
+    <w:lsdException w:name="Colorful Grid Accent 3"/>
+    <w:lsdException w:name="Light Shading Accent 4"/>
+    <w:lsdException w:name="Light List Accent 4"/>
+    <w:lsdException w:name="Light Grid Accent 4"/>
+    <w:lsdException w:name="Medium Shading 1 Accent 4"/>
+    <w:lsdException w:name="Medium Shading 2 Accent 4"/>
+    <w:lsdException w:name="Medium List 1 Accent 4"/>
+    <w:lsdException w:name="Medium List 2 Accent 4"/>
+    <w:lsdException w:name="Medium Grid 1 Accent 4"/>
+    <w:lsdException w:name="Medium Grid 2 Accent 4"/>
+    <w:lsdException w:name="Medium Grid 3 Accent 4"/>
+    <w:lsdException w:name="Dark List Accent 4"/>
+    <w:lsdException w:name="Colorful Shading Accent 4"/>
+    <w:lsdException w:name="Colorful List Accent 4"/>
+    <w:lsdException w:name="Colorful Grid Accent 4"/>
+    <w:lsdException w:name="Light Shading Accent 5"/>
+    <w:lsdException w:name="Light List Accent 5"/>
+    <w:lsdException w:name="Light Grid Accent 5"/>
+    <w:lsdException w:name="Medium Shading 1 Accent 5"/>
+    <w:lsdException w:name="Medium Shading 2 Accent 5"/>
+    <w:lsdException w:name="Medium List 1 Accent 5"/>
+    <w:lsdException w:name="Medium List 2 Accent 5"/>
+    <w:lsdException w:name="Medium Grid 1 Accent 5"/>
+    <w:lsdException w:name="Medium Grid 2 Accent 5"/>
+    <w:lsdException w:name="Medium Grid 3 Accent 5"/>
+    <w:lsdException w:name="Dark List Accent 5"/>
+    <w:lsdException w:name="Colorful Shading Accent 5"/>
+    <w:lsdException w:name="Colorful List Accent 5"/>
+    <w:lsdException w:name="Colorful Grid Accent 5"/>
+    <w:lsdException w:name="Light Shading Accent 6"/>
+    <w:lsdException w:name="Light List Accent 6"/>
+    <w:lsdException w:name="Light Grid Accent 6"/>
+    <w:lsdException w:name="Medium Shading 1 Accent 6"/>
+    <w:lsdException w:name="Medium Shading 2 Accent 6"/>
+    <w:lsdException w:name="Medium List 1 Accent 6"/>
+    <w:lsdException w:name="Medium List 2 Accent 6"/>
+    <w:lsdException w:name="Medium Grid 1 Accent 6"/>
+    <w:lsdException w:name="Medium Grid 2 Accent 6"/>
+    <w:lsdException w:name="Medium Grid 3 Accent 6"/>
+    <w:lsdException w:name="Dark List Accent 6"/>
+    <w:lsdException w:name="Colorful Shading Accent 6"/>
+    <w:lsdException w:name="Colorful List Accent 6"/>
+    <w:lsdException w:name="Colorful Grid Accent 6"/>
+    <w:lsdException w:name="Subtle Emphasis" w:uiPriority="19" w:qFormat="1"/>
+    <w:lsdException w:name="Intense Emphasis" w:uiPriority="21" w:qFormat="1"/>
+    <w:lsdException w:name="Subtle Reference" w:uiPriority="31" w:qFormat="1"/>
+    <w:lsdException w:name="Intense Reference" w:uiPriority="32" w:qFormat="1"/>
+    <w:lsdException w:name="Book Title" w:uiPriority="33" w:qFormat="1"/>
+    <w:lsdException w:name="Bibliography" w:semiHidden="1" w:uiPriority="37" w:unhideWhenUsed="1"/>
+    <w:lsdException w:name="TOC Heading" w:semiHidden="1" w:uiPriority="39" w:unhideWhenUsed="1" w:qFormat="1"/>
+    <w:lsdException w:name="Plain Table 1" w:uiPriority="41"/>
+    <w:lsdException w:name="Plain Table 2" w:uiPriority="42"/>
+    <w:lsdException w:name="Plain Table 3" w:uiPriority="43"/>
+    <w:lsdException w:name="Plain Table 4" w:uiPriority="44"/>
+    <w:lsdException w:name="Plain Table 5" w:uiPriority="45"/>
+    <w:lsdException w:name="Grid Table Light" w:uiPriority="40"/>
+    <w:lsdException w:name="Grid Table 1 Light" w:uiPriority="46"/>
+    <w:lsdException w:name="Grid Table 2" w:uiPriority="47"/>
+    <w:lsdException w:name="Grid Table 3" w:uiPriority="48"/>
+    <w:lsdException w:name="Grid Table 4" w:uiPriority="49"/>
+    <w:lsdException w:name="Grid Table 5 Dark" w:uiPriority="50"/>
+    <w:lsdException w:name="Grid Table 6 Colorful" w:uiPriority="51"/>
+    <w:lsdException w:name="Grid Table 7 Colorful" w:uiPriority="52"/>
+    <w:lsdException w:name="Grid Table 1 Light Accent 1" w:uiPriority="46"/>
+    <w:lsdException w:name="Grid Table 2 Accent 1" w:uiPriority="47"/>
+    <w:lsdException w:name="Grid Table 3 Accent 1" w:uiPriority="48"/>
+    <w:lsdException w:name="Grid Table 4 Accent 1" w:uiPriority="49"/>
+    <w:lsdException w:name="Grid Table 5 Dark Accent 1" w:uiPriority="50"/>
+    <w:lsdException w:name="Grid Table 6 Colorful Accent 1" w:uiPriority="51"/>
+    <w:lsdException w:name="Grid Table 7 Colorful Accent 1" w:uiPriority="52"/>
+    <w:lsdException w:name="Grid Table 1 Light Accent 2" w:uiPriority="46"/>
+    <w:lsdException w:name="Grid Table 2 Accent 2" w:uiPriority="47"/>
+    <w:lsdException w:name="Grid Table 3 Accent 2" w:uiPriority="48"/>
+    <w:lsdException w:name="Grid Table 4 Accent 2" w:uiPriority="49"/>
+    <w:lsdException w:name="Grid Table 5 Dark Accent 2" w:uiPriority="50"/>
+    <w:lsdException w:name="Grid Table 6 Colorful Accent 2" w:uiPriority="51"/>
+    <w:lsdException w:name="Grid Table 7 Colorful Accent 2" w:uiPriority="52"/>
+    <w:lsdException w:name="Grid Table 1 Light Accent 3" w:uiPriority="46"/>
+    <w:lsdException w:name="Grid Table 2 Accent 3" w:uiPriority="47"/>
+    <w:lsdException w:name="Grid Table 3 Accent 3" w:uiPriority="48"/>
+    <w:lsdException w:name="Grid Table 4 Accent 3" w:uiPriority="49"/>
+    <w:lsdException w:name="Grid Table 5 Dark Accent 3" w:uiPriority="50"/>
+    <w:lsdException w:name="Grid Table 6 Colorful Accent 3" w:uiPriority="51"/>
+    <w:lsdException w:name="Grid Table 7 Colorful Accent 3" w:uiPriority="52"/>
+    <w:lsdException w:name="Grid Table 1 Light Accent 4" w:uiPriority="46"/>
+    <w:lsdException w:name="Grid Table 2 Accent 4" w:uiPriority="47"/>
+    <w:lsdException w:name="Grid Table 3 Accent 4" w:uiPriority="48"/>
+    <w:lsdException w:name="Grid Table 4 Accent 4" w:uiPriority="49"/>
+    <w:lsdException w:name="Grid Table 5 Dark Accent 4" w:uiPriority="50"/>
+    <w:lsdException w:name="Grid Table 6 Colorful Accent 4" w:uiPriority="51"/>
+    <w:lsdException w:name="Grid Table 7 Colorful Accent 4" w:uiPriority="52"/>
+    <w:lsdException w:name="Grid Table 1 Light Accent 5" w:uiPriority="46"/>
+    <w:lsdException w:name="Grid Table 2 Accent 5" w:uiPriority="47"/>
+    <w:lsdException w:name="Grid Table 3 Accent 5" w:uiPriority="48"/>
+    <w:lsdException w:name="Grid Table 4 Accent 5" w:uiPriority="49"/>
+    <w:lsdException w:name="Grid Table 5 Dark Accent 5" w:uiPriority="50"/>
+    <w:lsdException w:name="Grid Table 6 Colorful Accent 5" w:uiPriority="51"/>
+    <w:lsdException w:name="Grid Table 7 Colorful Accent 5" w:uiPriority="52"/>
+    <w:lsdException w:name="Grid Table 1 Light Accent 6" w:uiPriority="46"/>
+    <w:lsdException w:name="Grid Table 2 Accent 6" w:uiPriority="47"/>
+    <w:lsdException w:name="Grid Table 3 Accent 6" w:uiPriority="48"/>
+    <w:lsdException w:name="Grid Table 4 Accent 6" w:uiPriority="49"/>
+    <w:lsdException w:name="Grid Table 5 Dark Accent 6" w:uiPriority="50"/>
+    <w:lsdException w:name="Grid Table 6 Colorful Accent 6" w:uiPriority="51"/>
+    <w:lsdException w:name="Grid Table 7 Colorful Accent 6" w:uiPriority="52"/>
+    <w:lsdException w:name="List Table 1 Light" w:uiPriority="46"/>
+    <w:lsdException w:name="List Table 2" w:uiPriority="47"/>
+    <w:lsdException w:name="List Table 3" w:uiPriority="48"/>
+    <w:lsdException w:name="List Table 4" w:uiPriority="49"/>
+    <w:lsdException w:name="List Table 5 Dark" w:uiPriority="50"/>
+    <w:lsdException w:name="List Table 6 Colorful" w:uiPriority="51"/>
+    <w:lsdException w:name="List Table 7 Colorful" w:uiPriority="52"/>
+    <w:lsdException w:name="List Table 1 Light Accent 1" w:uiPriority="46"/>
+    <w:lsdException w:name="List Table 2 Accent 1" w:uiPriority="47"/>
+    <w:lsdException w:name="List Table 3 Accent 1" w:uiPriority="48"/>
+    <w:lsdException w:name="List Table 4 Accent 1" w:uiPriority="49"/>
+    <w:lsdException w:name="List Table 5 Dark Accent 1" w:uiPriority="50"/>
+    <w:lsdException w:name="List Table 6 Colorful Accent 1" w:uiPriority="51"/>
+    <w:lsdException w:name="List Table 7 Colorful Accent 1" w:uiPriority="52"/>
+    <w:lsdException w:name="List Table 1 Light Accent 2" w:uiPriority="46"/>
+    <w:lsdException w:name="List Table 2 Accent 2" w:uiPriority="47"/>
+    <w:lsdException w:name="List Table 3 Accent 2" w:uiPriority="48"/>
+    <w:lsdException w:name="List Table 4 Accent 2" w:uiPriority="49"/>
+    <w:lsdException w:name="List Table 5 Dark Accent 2" w:uiPriority="50"/>
+    <w:lsdException w:name="List Table 6 Colorful Accent 2" w:uiPriority="51"/>
+    <w:lsdException w:name="List Table 7 Colorful Accent 2" w:uiPriority="52"/>
+    <w:lsdException w:name="List Table 1 Light Accent 3" w:uiPriority="46"/>
+    <w:lsdException w:name="List Table 2 Accent 3" w:uiPriority="47"/>
+    <w:lsdException w:name="List Table 3 Accent 3" w:uiPriority="48"/>
+    <w:lsdException w:name="List Table 4 Accent 3" w:uiPriority="49"/>
+    <w:lsdException w:name="List Table 5 Dark Accent 3" w:uiPriority="50"/>
+    <w:lsdException w:name="List Table 6 Colorful Accent 3" w:uiPriority="51"/>
+    <w:lsdException w:name="List Table 7 Colorful Accent 3" w:uiPriority="52"/>
+    <w:lsdException w:name="List Table 1 Light Accent 4" w:uiPriority="46"/>
+    <w:lsdException w:name="List Table 2 Accent 4" w:uiPriority="47"/>
+    <w:lsdException w:name="List Table 3 Accent 4" w:uiPriority="48"/>
+    <w:lsdException w:name="List Table 4 Accent 4" w:uiPriority="49"/>
+    <w:lsdException w:name="List Table 5 Dark Accent 4" w:uiPriority="50"/>
+    <w:lsdException w:name="List Table 6 Colorful Accent 4" w:uiPriority="51"/>
+    <w:lsdException w:name="List Table 7 Colorful Accent 4" w:uiPriority="52"/>
+    <w:lsdException w:name="List Table 1 Light Accent 5" w:uiPriority="46"/>
+    <w:lsdException w:name="List Table 2 Accent 5" w:uiPriority="47"/>
+    <w:lsdException w:name="List Table 3 Accent 5" w:uiPriority="48"/>
+    <w:lsdException w:name="List Table 4 Accent 5" w:uiPriority="49"/>
+    <w:lsdException w:name="List Table 5 Dark Accent 5" w:uiPriority="50"/>
+    <w:lsdException w:name="List Table 6 Colorful Accent 5" w:uiPriority="51"/>
+    <w:lsdException w:name="List Table 7 Colorful Accent 5" w:uiPriority="52"/>
+    <w:lsdException w:name="List Table 1 Light Accent 6" w:uiPriority="46"/>
+    <w:lsdException w:name="List Table 2 Accent 6" w:uiPriority="47"/>
+    <w:lsdException w:name="List Table 3 Accent 6" w:uiPriority="48"/>
+    <w:lsdException w:name="List Table 4 Accent 6" w:uiPriority="49"/>
+    <w:lsdException w:name="List Table 5 Dark Accent 6" w:uiPriority="50"/>
+    <w:lsdException w:name="List Table 6 Colorful Accent 6" w:uiPriority="51"/>
+    <w:lsdException w:name="List Table 7 Colorful Accent 6" w:uiPriority="52"/>
+    <w:lsdException w:name="Mention" w:semiHidden="1" w:unhideWhenUsed="1"/>
+    <w:lsdException w:name="Smart Hyperlink" w:semiHidden="1" w:unhideWhenUsed="1"/>
+    <w:lsdException w:name="Hashtag" w:semiHidden="1" w:unhideWhenUsed="1"/>
+    <w:lsdException w:name="Unresolved Mention" w:semiHidden="1" w:unhideWhenUsed="1"/>
   </w:latentStyles>
-  <w:style w:type="paragraph" w:default="1" w:styleId="1">
+  <w:style w:type="paragraph" w:default="1" w:styleId="Normal">
     <w:name w:val="Normal"/>
     <w:qFormat/>
-    <w:uiPriority w:val="0"/>
     <w:pPr>
       <w:spacing w:after="160" w:line="259" w:lineRule="auto"/>
     </w:pPr>
     <w:rPr>
-      <w:rFonts w:asciiTheme="minorHAnsi" w:hAnsiTheme="minorHAnsi" w:eastAsiaTheme="minorHAnsi" w:cstheme="minorBidi"/>
       <w:sz w:val="22"/>
       <w:szCs w:val="22"/>
-      <w:lang w:val="pt-BR" w:eastAsia="en-US" w:bidi="ar-SA"/>
+      <w:lang w:eastAsia="en-US"/>
     </w:rPr>
   </w:style>
-  <w:style w:type="paragraph" w:styleId="2">
+  <w:style w:type="paragraph" w:styleId="Ttulo1">
     <w:name w:val="heading 1"/>
-    <w:basedOn w:val="1"/>
-    <w:next w:val="1"/>
-    <w:link w:val="17"/>
+    <w:basedOn w:val="Normal"/>
+    <w:next w:val="Normal"/>
+    <w:link w:val="Ttulo1Char"/>
+    <w:uiPriority w:val="9"/>
     <w:qFormat/>
-    <w:uiPriority w:val="9"/>
     <w:pPr>
       <w:keepNext/>
       <w:keepLines/>
@@ -6254,25 +6845,25 @@
       <w:outlineLvl w:val="0"/>
     </w:pPr>
     <w:rPr>
-      <w:rFonts w:asciiTheme="majorHAnsi" w:hAnsiTheme="majorHAnsi" w:eastAsiaTheme="majorEastAsia" w:cstheme="majorBidi"/>
-      <w:color w:val="2F5597" w:themeColor="accent1" w:themeShade="BF"/>
+      <w:rFonts w:asciiTheme="majorHAnsi" w:eastAsiaTheme="majorEastAsia" w:hAnsiTheme="majorHAnsi" w:cstheme="majorBidi"/>
+      <w:color w:val="2F5496" w:themeColor="accent1" w:themeShade="BF"/>
       <w:sz w:val="32"/>
       <w:szCs w:val="32"/>
     </w:rPr>
   </w:style>
-  <w:style w:type="character" w:default="1" w:styleId="3">
+  <w:style w:type="character" w:default="1" w:styleId="Fontepargpadro">
     <w:name w:val="Default Paragraph Font"/>
+    <w:uiPriority w:val="1"/>
     <w:semiHidden/>
     <w:unhideWhenUsed/>
-    <w:qFormat/>
-    <w:uiPriority w:val="1"/>
   </w:style>
-  <w:style w:type="table" w:default="1" w:styleId="4">
+  <w:style w:type="table" w:default="1" w:styleId="Tabelanormal">
     <w:name w:val="Normal Table"/>
+    <w:uiPriority w:val="99"/>
     <w:semiHidden/>
     <w:unhideWhenUsed/>
-    <w:uiPriority w:val="99"/>
     <w:tblPr>
+      <w:tblInd w:w="0" w:type="dxa"/>
       <w:tblCellMar>
         <w:top w:w="0" w:type="dxa"/>
         <w:left w:w="108" w:type="dxa"/>
@@ -6281,64 +6872,65 @@
       </w:tblCellMar>
     </w:tblPr>
   </w:style>
-  <w:style w:type="character" w:styleId="5">
+  <w:style w:type="numbering" w:default="1" w:styleId="Semlista">
+    <w:name w:val="No List"/>
+    <w:uiPriority w:val="99"/>
+    <w:semiHidden/>
+    <w:unhideWhenUsed/>
+  </w:style>
+  <w:style w:type="character" w:styleId="Forte">
     <w:name w:val="Strong"/>
-    <w:basedOn w:val="3"/>
+    <w:basedOn w:val="Fontepargpadro"/>
+    <w:uiPriority w:val="22"/>
     <w:qFormat/>
-    <w:uiPriority w:val="22"/>
     <w:rPr>
       <w:b/>
       <w:bCs/>
     </w:rPr>
   </w:style>
-  <w:style w:type="character" w:styleId="6">
+  <w:style w:type="character" w:styleId="Refdecomentrio">
     <w:name w:val="annotation reference"/>
-    <w:basedOn w:val="3"/>
+    <w:basedOn w:val="Fontepargpadro"/>
+    <w:uiPriority w:val="99"/>
     <w:semiHidden/>
     <w:unhideWhenUsed/>
-    <w:uiPriority w:val="99"/>
     <w:rPr>
       <w:sz w:val="16"/>
       <w:szCs w:val="16"/>
     </w:rPr>
   </w:style>
-  <w:style w:type="character" w:styleId="7">
+  <w:style w:type="character" w:styleId="Hyperlink">
     <w:name w:val="Hyperlink"/>
-    <w:basedOn w:val="3"/>
+    <w:basedOn w:val="Fontepargpadro"/>
+    <w:uiPriority w:val="99"/>
     <w:unhideWhenUsed/>
     <w:qFormat/>
-    <w:uiPriority w:val="99"/>
     <w:rPr>
       <w:color w:val="0563C1" w:themeColor="hyperlink"/>
       <w:u w:val="single"/>
-      <w14:textFill>
-        <w14:solidFill>
-          <w14:schemeClr w14:val="hlink"/>
-        </w14:solidFill>
-      </w14:textFill>
     </w:rPr>
   </w:style>
-  <w:style w:type="paragraph" w:styleId="8">
+  <w:style w:type="paragraph" w:styleId="Sumrio2">
     <w:name w:val="toc 2"/>
-    <w:basedOn w:val="1"/>
-    <w:next w:val="1"/>
+    <w:basedOn w:val="Normal"/>
+    <w:next w:val="Normal"/>
     <w:autoRedefine/>
+    <w:uiPriority w:val="39"/>
     <w:unhideWhenUsed/>
     <w:qFormat/>
-    <w:uiPriority w:val="39"/>
     <w:pPr>
       <w:spacing w:after="100"/>
       <w:ind w:left="220"/>
     </w:pPr>
   </w:style>
-  <w:style w:type="paragraph" w:styleId="9">
+  <w:style w:type="paragraph" w:styleId="Textodecomentrio">
     <w:name w:val="annotation text"/>
-    <w:basedOn w:val="1"/>
-    <w:link w:val="19"/>
+    <w:basedOn w:val="Normal"/>
+    <w:link w:val="TextodecomentrioChar"/>
+    <w:uiPriority w:val="99"/>
     <w:semiHidden/>
     <w:unhideWhenUsed/>
     <w:qFormat/>
-    <w:uiPriority w:val="99"/>
     <w:pPr>
       <w:spacing w:line="240" w:lineRule="auto"/>
     </w:pPr>
@@ -6347,12 +6939,12 @@
       <w:szCs w:val="20"/>
     </w:rPr>
   </w:style>
-  <w:style w:type="paragraph" w:styleId="10">
+  <w:style w:type="paragraph" w:styleId="Cabealho">
     <w:name w:val="header"/>
-    <w:basedOn w:val="1"/>
-    <w:link w:val="15"/>
+    <w:basedOn w:val="Normal"/>
+    <w:link w:val="CabealhoChar"/>
+    <w:uiPriority w:val="99"/>
     <w:unhideWhenUsed/>
-    <w:uiPriority w:val="99"/>
     <w:pPr>
       <w:tabs>
         <w:tab w:val="center" w:pos="4252"/>
@@ -6361,26 +6953,26 @@
       <w:spacing w:after="0" w:line="240" w:lineRule="auto"/>
     </w:pPr>
   </w:style>
-  <w:style w:type="paragraph" w:styleId="11">
+  <w:style w:type="paragraph" w:styleId="Assuntodocomentrio">
     <w:name w:val="annotation subject"/>
-    <w:basedOn w:val="9"/>
-    <w:next w:val="9"/>
-    <w:link w:val="20"/>
+    <w:basedOn w:val="Textodecomentrio"/>
+    <w:next w:val="Textodecomentrio"/>
+    <w:link w:val="AssuntodocomentrioChar"/>
+    <w:uiPriority w:val="99"/>
     <w:semiHidden/>
     <w:unhideWhenUsed/>
-    <w:uiPriority w:val="99"/>
     <w:rPr>
       <w:b/>
       <w:bCs/>
     </w:rPr>
   </w:style>
-  <w:style w:type="paragraph" w:styleId="12">
+  <w:style w:type="paragraph" w:styleId="Rodap">
     <w:name w:val="footer"/>
-    <w:basedOn w:val="1"/>
-    <w:link w:val="16"/>
+    <w:basedOn w:val="Normal"/>
+    <w:link w:val="RodapChar"/>
+    <w:uiPriority w:val="99"/>
     <w:unhideWhenUsed/>
     <w:qFormat/>
-    <w:uiPriority w:val="99"/>
     <w:pPr>
       <w:tabs>
         <w:tab w:val="center" w:pos="4252"/>
@@ -6389,13 +6981,13 @@
       <w:spacing w:after="0" w:line="240" w:lineRule="auto"/>
     </w:pPr>
   </w:style>
-  <w:style w:type="paragraph" w:styleId="13">
+  <w:style w:type="paragraph" w:styleId="Textodebalo">
     <w:name w:val="Balloon Text"/>
-    <w:basedOn w:val="1"/>
-    <w:link w:val="21"/>
+    <w:basedOn w:val="Normal"/>
+    <w:link w:val="TextodebaloChar"/>
+    <w:uiPriority w:val="99"/>
     <w:semiHidden/>
     <w:unhideWhenUsed/>
-    <w:uiPriority w:val="99"/>
     <w:pPr>
       <w:spacing w:after="0" w:line="240" w:lineRule="auto"/>
     </w:pPr>
@@ -6405,51 +6997,51 @@
       <w:szCs w:val="18"/>
     </w:rPr>
   </w:style>
-  <w:style w:type="paragraph" w:styleId="14">
+  <w:style w:type="paragraph" w:styleId="Sumrio1">
     <w:name w:val="toc 1"/>
-    <w:basedOn w:val="1"/>
-    <w:next w:val="1"/>
+    <w:basedOn w:val="Normal"/>
+    <w:next w:val="Normal"/>
     <w:autoRedefine/>
+    <w:uiPriority w:val="39"/>
     <w:unhideWhenUsed/>
     <w:qFormat/>
-    <w:uiPriority w:val="39"/>
     <w:pPr>
       <w:spacing w:after="100"/>
     </w:pPr>
   </w:style>
-  <w:style w:type="character" w:customStyle="1" w:styleId="15">
+  <w:style w:type="character" w:customStyle="1" w:styleId="CabealhoChar">
     <w:name w:val="Cabeçalho Char"/>
-    <w:basedOn w:val="3"/>
-    <w:link w:val="10"/>
+    <w:basedOn w:val="Fontepargpadro"/>
+    <w:link w:val="Cabealho"/>
     <w:uiPriority w:val="99"/>
   </w:style>
-  <w:style w:type="character" w:customStyle="1" w:styleId="16">
+  <w:style w:type="character" w:customStyle="1" w:styleId="RodapChar">
     <w:name w:val="Rodapé Char"/>
-    <w:basedOn w:val="3"/>
-    <w:link w:val="12"/>
+    <w:basedOn w:val="Fontepargpadro"/>
+    <w:link w:val="Rodap"/>
+    <w:uiPriority w:val="99"/>
     <w:qFormat/>
-    <w:uiPriority w:val="99"/>
   </w:style>
-  <w:style w:type="character" w:customStyle="1" w:styleId="17">
+  <w:style w:type="character" w:customStyle="1" w:styleId="Ttulo1Char">
     <w:name w:val="Título 1 Char"/>
-    <w:basedOn w:val="3"/>
-    <w:link w:val="2"/>
+    <w:basedOn w:val="Fontepargpadro"/>
+    <w:link w:val="Ttulo1"/>
+    <w:uiPriority w:val="9"/>
     <w:qFormat/>
-    <w:uiPriority w:val="9"/>
     <w:rPr>
-      <w:rFonts w:asciiTheme="majorHAnsi" w:hAnsiTheme="majorHAnsi" w:eastAsiaTheme="majorEastAsia" w:cstheme="majorBidi"/>
-      <w:color w:val="2F5597" w:themeColor="accent1" w:themeShade="BF"/>
+      <w:rFonts w:asciiTheme="majorHAnsi" w:eastAsiaTheme="majorEastAsia" w:hAnsiTheme="majorHAnsi" w:cstheme="majorBidi"/>
+      <w:color w:val="2F5496" w:themeColor="accent1" w:themeShade="BF"/>
       <w:sz w:val="32"/>
       <w:szCs w:val="32"/>
     </w:rPr>
   </w:style>
-  <w:style w:type="paragraph" w:customStyle="1" w:styleId="18">
-    <w:name w:val="TOC Heading"/>
-    <w:basedOn w:val="2"/>
-    <w:next w:val="1"/>
+  <w:style w:type="paragraph" w:customStyle="1" w:styleId="CabealhodoSumrio1">
+    <w:name w:val="Cabeçalho do Sumário1"/>
+    <w:basedOn w:val="Ttulo1"/>
+    <w:next w:val="Normal"/>
+    <w:uiPriority w:val="39"/>
     <w:unhideWhenUsed/>
     <w:qFormat/>
-    <w:uiPriority w:val="39"/>
     <w:pPr>
       <w:outlineLvl w:val="9"/>
     </w:pPr>
@@ -6457,23 +7049,23 @@
       <w:lang w:eastAsia="pt-BR"/>
     </w:rPr>
   </w:style>
-  <w:style w:type="character" w:customStyle="1" w:styleId="19">
+  <w:style w:type="character" w:customStyle="1" w:styleId="TextodecomentrioChar">
     <w:name w:val="Texto de comentário Char"/>
-    <w:basedOn w:val="3"/>
-    <w:link w:val="9"/>
+    <w:basedOn w:val="Fontepargpadro"/>
+    <w:link w:val="Textodecomentrio"/>
+    <w:uiPriority w:val="99"/>
     <w:semiHidden/>
-    <w:uiPriority w:val="99"/>
     <w:rPr>
       <w:sz w:val="20"/>
       <w:szCs w:val="20"/>
     </w:rPr>
   </w:style>
-  <w:style w:type="character" w:customStyle="1" w:styleId="20">
+  <w:style w:type="character" w:customStyle="1" w:styleId="AssuntodocomentrioChar">
     <w:name w:val="Assunto do comentário Char"/>
-    <w:basedOn w:val="19"/>
-    <w:link w:val="11"/>
+    <w:basedOn w:val="TextodecomentrioChar"/>
+    <w:link w:val="Assuntodocomentrio"/>
+    <w:uiPriority w:val="99"/>
     <w:semiHidden/>
-    <w:uiPriority w:val="99"/>
     <w:rPr>
       <w:b/>
       <w:bCs/>
@@ -6481,12 +7073,12 @@
       <w:szCs w:val="20"/>
     </w:rPr>
   </w:style>
-  <w:style w:type="character" w:customStyle="1" w:styleId="21">
+  <w:style w:type="character" w:customStyle="1" w:styleId="TextodebaloChar">
     <w:name w:val="Texto de balão Char"/>
-    <w:basedOn w:val="3"/>
-    <w:link w:val="13"/>
+    <w:basedOn w:val="Fontepargpadro"/>
+    <w:link w:val="Textodebalo"/>
+    <w:uiPriority w:val="99"/>
     <w:semiHidden/>
-    <w:uiPriority w:val="99"/>
     <w:rPr>
       <w:rFonts w:ascii="Segoe UI" w:hAnsi="Segoe UI" w:cs="Segoe UI"/>
       <w:sz w:val="18"/>
@@ -6748,6 +7340,7 @@
     </a:fmtScheme>
   </a:themeElements>
   <a:objectDefaults/>
+  <a:extraClrSchemeLst/>
 </a:theme>
 </file>
 
@@ -6756,7 +7349,9 @@
 </file>
 
 <file path=customXml/itemProps1.xml><?xml version="1.0" encoding="utf-8"?>
-<ds:datastoreItem xmlns:ds="http://schemas.openxmlformats.org/officeDocument/2006/customXml" ds:itemID="{DBF3A1B2-3366-44CD-BD5E-69296B3CCF3E}">
-  <ds:schemaRefs/>
+<ds:datastoreItem xmlns:ds="http://schemas.openxmlformats.org/officeDocument/2006/customXml" ds:itemID="{281A7FC1-AC05-4F75-93AD-B0E48290DD75}">
+  <ds:schemaRefs>
+    <ds:schemaRef ds:uri="http://schemas.openxmlformats.org/officeDocument/2006/bibliography"/>
+  </ds:schemaRefs>
 </ds:datastoreItem>
 </file>
</xml_diff>